<commit_message>
Add in-text citations throughout the document
Co-authored-by: Mujeeb-U-Rehman <197483016+Mujeeb-U-Rehman@users.noreply.github.com>
</commit_message>
<xml_diff>
--- a/FULL N FINAL Review BlockChain.docx
+++ b/FULL N FINAL Review BlockChain.docx
@@ -540,23 +540,7 @@
         </w:rPr>
       </w:pPr>
       <w:r>
-        <w:rPr>
-          <w:rFonts w:ascii="Times New Roman" w:cs="Times New Roman" w:eastAsia="Times New Roman" w:hAnsi="Times New Roman"/>
-          <w:b w:val="0"/>
-          <w:bCs w:val="0"/>
-          <w:i w:val="0"/>
-          <w:iCs w:val="0"/>
-          <w:smallCaps w:val="0"/>
-          <w:strike w:val="0"/>
-          <w:color w:val="000000"/>
-          <w:sz w:val="22"/>
-          <w:szCs w:val="22"/>
-          <w:u w:val="none"/>
-          <w:shd w:fill="auto" w:val="clear"/>
-          <w:vertAlign w:val="baseline"/>
-          <w:rtl w:val="0"/>
-        </w:rPr>
-        <w:t xml:space="preserve">An entirely different concept is provided by blockchain technology, a cryptographically linked distributed ledger first introduced by Satoshi Nakamoto in 2008 with Bitcoin and which is kept in common by several parties and does not need a central authority. This decentralized architecture will overcome numerous old IA problems through the removal of central points of failure, the availability of audit trails that are transparent and tamper evident, and the application of cryptographic methods to guarantee integrity and authenticity of data.</w:t>
+        <w:t>An entirely different concept is provided by blockchain technology, a cryptographically linked distributed ledger first introduced by Satoshi Nakamoto in 2008 with Bitcoin [1] and which is kept in common by several parties and does not need a central authority. This decentralized architecture will overcome numerous old IA problems through the removal of central points of failure, the availability of audit trails that are transparent and tamper evident, and the application of cryptographic methods to guarantee integrity and authenticity of data.</w:t>
       </w:r>
     </w:p>
     <w:p>
@@ -929,109 +913,7 @@
         </w:rPr>
       </w:pPr>
       <w:r>
-        <w:rPr>
-          <w:rFonts w:ascii="Times New Roman" w:cs="Times New Roman" w:eastAsia="Times New Roman" w:hAnsi="Times New Roman"/>
-          <w:b w:val="1"/>
-          <w:bCs w:val="1"/>
-          <w:i w:val="0"/>
-          <w:iCs w:val="0"/>
-          <w:smallCaps w:val="0"/>
-          <w:strike w:val="0"/>
-          <w:color w:val="000000"/>
-          <w:sz w:val="22"/>
-          <w:szCs w:val="22"/>
-          <w:u w:val="none"/>
-          <w:shd w:fill="auto" w:val="clear"/>
-          <w:vertAlign w:val="baseline"/>
-          <w:rtl w:val="0"/>
-        </w:rPr>
-        <w:t xml:space="preserve">Basic Architecture:</w:t>
-      </w:r>
-      <w:r>
-        <w:rPr>
-          <w:rFonts w:ascii="Times New Roman" w:cs="Times New Roman" w:eastAsia="Times New Roman" w:hAnsi="Times New Roman"/>
-          <w:b w:val="0"/>
-          <w:bCs w:val="0"/>
-          <w:i w:val="0"/>
-          <w:iCs w:val="0"/>
-          <w:smallCaps w:val="0"/>
-          <w:strike w:val="0"/>
-          <w:color w:val="000000"/>
-          <w:sz w:val="22"/>
-          <w:szCs w:val="22"/>
-          <w:u w:val="none"/>
-          <w:shd w:fill="auto" w:val="clear"/>
-          <w:vertAlign w:val="baseline"/>
-          <w:rtl w:val="0"/>
-        </w:rPr>
-        <w:t xml:space="preserve"> A blockchain is a distributed database which keeps an ever-expanding list of data known as blocks. Each block </w:t>
-      </w:r>
-      <w:r>
-        <w:rPr>
-          <w:sz w:val="22"/>
-          <w:szCs w:val="22"/>
-          <w:rtl w:val="0"/>
-        </w:rPr>
-        <w:t xml:space="preserve">consists</w:t>
-      </w:r>
-      <w:r>
-        <w:rPr>
-          <w:rFonts w:ascii="Times New Roman" w:cs="Times New Roman" w:eastAsia="Times New Roman" w:hAnsi="Times New Roman"/>
-          <w:b w:val="0"/>
-          <w:bCs w:val="0"/>
-          <w:i w:val="0"/>
-          <w:iCs w:val="0"/>
-          <w:smallCaps w:val="0"/>
-          <w:strike w:val="0"/>
-          <w:color w:val="000000"/>
-          <w:sz w:val="22"/>
-          <w:szCs w:val="22"/>
-          <w:u w:val="none"/>
-          <w:shd w:fill="auto" w:val="clear"/>
-          <w:vertAlign w:val="baseline"/>
-          <w:rtl w:val="0"/>
-        </w:rPr>
-        <w:t xml:space="preserve"> of a set of transactions, a timestamp, a cryptographic hash of the prior block, and a hash of that block, forming a chain, such that alteration of any block in history would</w:t>
-      </w:r>
-      <w:r>
-        <w:rPr>
-          <w:sz w:val="22"/>
-          <w:szCs w:val="22"/>
-          <w:rtl w:val="0"/>
-        </w:rPr>
-        <w:t xml:space="preserve"> </w:t>
-      </w:r>
-      <w:r>
-        <w:rPr>
-          <w:rFonts w:ascii="Times New Roman" w:cs="Times New Roman" w:eastAsia="Times New Roman" w:hAnsi="Times New Roman"/>
-          <w:b w:val="0"/>
-          <w:bCs w:val="0"/>
-          <w:i w:val="0"/>
-          <w:iCs w:val="0"/>
-          <w:smallCaps w:val="0"/>
-          <w:strike w:val="0"/>
-          <w:color w:val="000000"/>
-          <w:sz w:val="22"/>
-          <w:szCs w:val="22"/>
-          <w:u w:val="none"/>
-          <w:shd w:fill="auto" w:val="clear"/>
-          <w:vertAlign w:val="baseline"/>
-          <w:rtl w:val="0"/>
-        </w:rPr>
-        <w:t xml:space="preserve">involve recalculating of all the later blocks, which     have been made computationally infeasible in well-designed systems. </w:t>
-      </w:r>
-      <w:r>
-        <w:rPr>
-          <w:sz w:val="22"/>
-          <w:szCs w:val="22"/>
-          <w:rtl w:val="0"/>
-        </w:rPr>
-        <w:t xml:space="preserve">In 2008, Nakamoto, as indicated by Bitcoin, demonstrated how a decentralized network could maintain a single journal without making use of a central authority through novel use of consensus systems.</w:t>
-      </w:r>
-      <w:r>
-        <w:rPr>
-          <w:rtl w:val="0"/>
-        </w:rPr>
+        <w:t>Basic Architecture: A blockchain is a distributed database which keeps an ever-expanding list of data known as blocks. Each block consists of a set of transactions, a timestamp, a cryptographic hash of the prior block, and a hash of that block, forming a chain, such that alteration of any block in history would involve recalculating of all the later blocks, which     have been made computationally infeasible in well-designed systems. In 2008, Nakamoto, as indicated by Bitcoin [1], demonstrated how a decentralized network could maintain a single journal without making use of a central authority through novel use of consensus systems.</w:t>
       </w:r>
     </w:p>
     <w:p>
@@ -1137,95 +1019,7 @@
         </w:rPr>
       </w:pPr>
       <w:r>
-        <w:rPr>
-          <w:rFonts w:ascii="Times New Roman" w:cs="Times New Roman" w:eastAsia="Times New Roman" w:hAnsi="Times New Roman"/>
-          <w:b w:val="1"/>
-          <w:bCs w:val="1"/>
-          <w:i w:val="0"/>
-          <w:iCs w:val="0"/>
-          <w:smallCaps w:val="0"/>
-          <w:strike w:val="0"/>
-          <w:color w:val="000000"/>
-          <w:sz w:val="22"/>
-          <w:szCs w:val="22"/>
-          <w:u w:val="none"/>
-          <w:shd w:fill="auto" w:val="clear"/>
-          <w:vertAlign w:val="baseline"/>
-          <w:rtl w:val="0"/>
-        </w:rPr>
-        <w:t xml:space="preserve">Proof of Work (PoW): </w:t>
-      </w:r>
-      <w:r>
-        <w:rPr>
-          <w:b w:val="1"/>
-          <w:bCs w:val="1"/>
-          <w:sz w:val="22"/>
-          <w:szCs w:val="22"/>
-          <w:rtl w:val="0"/>
-        </w:rPr>
-        <w:t xml:space="preserve"> </w:t>
-      </w:r>
-      <w:r>
-        <w:rPr>
-          <w:sz w:val="22"/>
-          <w:szCs w:val="22"/>
-          <w:rtl w:val="0"/>
-        </w:rPr>
-        <w:t xml:space="preserve">Bitcoin also uses PoW which was initially used by Ethereum where the participants (miners) have to solve computationally intensive puzzles in an attempt to propose new blocks.</w:t>
-      </w:r>
-      <w:r>
-        <w:rPr>
-          <w:i w:val="1"/>
-          <w:iCs w:val="1"/>
-          <w:smallCaps w:val="0"/>
-          <w:strike w:val="0"/>
-          <w:color w:val="000000"/>
-          <w:sz w:val="22"/>
-          <w:szCs w:val="22"/>
-          <w:u w:val="none"/>
-          <w:shd w:fill="auto" w:val="clear"/>
-          <w:vertAlign w:val="baseline"/>
-          <w:rtl w:val="0"/>
-        </w:rPr>
-        <w:t xml:space="preserve"> </w:t>
-      </w:r>
-      <w:r>
-        <w:rPr>
-          <w:rFonts w:ascii="Times New Roman" w:cs="Times New Roman" w:eastAsia="Times New Roman" w:hAnsi="Times New Roman"/>
-          <w:b w:val="0"/>
-          <w:bCs w:val="0"/>
-          <w:i w:val="0"/>
-          <w:iCs w:val="0"/>
-          <w:smallCaps w:val="0"/>
-          <w:strike w:val="0"/>
-          <w:color w:val="000000"/>
-          <w:sz w:val="22"/>
-          <w:szCs w:val="22"/>
-          <w:u w:val="none"/>
-          <w:shd w:fill="auto" w:val="clear"/>
-          <w:vertAlign w:val="baseline"/>
-          <w:rtl w:val="0"/>
-        </w:rPr>
-        <w:t xml:space="preserve">The challenge makes the rewriting of blockchain history very expensive. Nevertheless, PoW uses a lot of energy (Bitcoin uses more energy than small nations) and reduces the number of transactions. Bonneau et al. present detailed discussion of PoW security features and attack combinations</w:t>
-      </w:r>
-      <w:r>
-        <w:rPr>
-          <w:rFonts w:ascii="Times New Roman" w:cs="Times New Roman" w:eastAsia="Times New Roman" w:hAnsi="Times New Roman"/>
-          <w:b w:val="0"/>
-          <w:bCs w:val="0"/>
-          <w:i w:val="1"/>
-          <w:iCs w:val="1"/>
-          <w:smallCaps w:val="0"/>
-          <w:strike w:val="0"/>
-          <w:color w:val="000000"/>
-          <w:sz w:val="22"/>
-          <w:szCs w:val="22"/>
-          <w:u w:val="none"/>
-          <w:shd w:fill="auto" w:val="clear"/>
-          <w:vertAlign w:val="baseline"/>
-          <w:rtl w:val="0"/>
-        </w:rPr>
-        <w:t xml:space="preserve">.</w:t>
+        <w:t>Proof of Work (PoW):  Bitcoin also uses PoW which was initially used by Ethereum where the participants (miners) have to solve computationally intensive puzzles in an attempt to propose new blocks. The challenge makes the rewriting of blockchain history very expensive. Nevertheless, PoW uses a lot of energy (Bitcoin uses more energy than small nations) and reduces the number of transactions. Bonneau et al. [6] present detailed discussion of PoW security features and attack combinations.</w:t>
       </w:r>
     </w:p>
     <w:p>
@@ -1317,69 +1111,7 @@
         </w:sectPr>
       </w:pPr>
       <w:r>
-        <w:rPr>
-          <w:rFonts w:ascii="Times New Roman" w:cs="Times New Roman" w:eastAsia="Times New Roman" w:hAnsi="Times New Roman"/>
-          <w:b w:val="1"/>
-          <w:bCs w:val="1"/>
-          <w:i w:val="0"/>
-          <w:iCs w:val="0"/>
-          <w:smallCaps w:val="0"/>
-          <w:strike w:val="0"/>
-          <w:color w:val="000000"/>
-          <w:sz w:val="22"/>
-          <w:szCs w:val="22"/>
-          <w:u w:val="none"/>
-          <w:shd w:fill="auto" w:val="clear"/>
-          <w:vertAlign w:val="baseline"/>
-          <w:rtl w:val="0"/>
-        </w:rPr>
-        <w:t xml:space="preserve">Proof of Stake (PoS):</w:t>
-      </w:r>
-      <w:r>
-        <w:rPr>
-          <w:rFonts w:ascii="Times New Roman" w:cs="Times New Roman" w:eastAsia="Times New Roman" w:hAnsi="Times New Roman"/>
-          <w:b w:val="0"/>
-          <w:bCs w:val="0"/>
-          <w:i w:val="1"/>
-          <w:iCs w:val="1"/>
-          <w:smallCaps w:val="0"/>
-          <w:strike w:val="0"/>
-          <w:color w:val="000000"/>
-          <w:sz w:val="22"/>
-          <w:szCs w:val="22"/>
-          <w:u w:val="none"/>
-          <w:shd w:fill="auto" w:val="clear"/>
-          <w:vertAlign w:val="baseline"/>
-          <w:rtl w:val="0"/>
-        </w:rPr>
-        <w:t xml:space="preserve"> </w:t>
-      </w:r>
-      <w:r>
-        <w:rPr>
-          <w:rFonts w:ascii="Times New Roman" w:cs="Times New Roman" w:eastAsia="Times New Roman" w:hAnsi="Times New Roman"/>
-          <w:b w:val="0"/>
-          <w:bCs w:val="0"/>
-          <w:i w:val="0"/>
-          <w:iCs w:val="0"/>
-          <w:smallCaps w:val="0"/>
-          <w:strike w:val="0"/>
-          <w:color w:val="000000"/>
-          <w:sz w:val="22"/>
-          <w:szCs w:val="22"/>
-          <w:u w:val="none"/>
-          <w:shd w:fill="auto" w:val="clear"/>
-          <w:vertAlign w:val="baseline"/>
-          <w:rtl w:val="0"/>
-        </w:rPr>
-        <w:t xml:space="preserve">PoS allows proposers of blocks to be chosen not by the amount of computational work they perform but by the amount of stake they hold (i.e. investment in cryptocurrency), which drastically lowers the amount of energy used, and security is ensured through economic incentives, since </w:t>
-      </w:r>
-      <w:r>
-        <w:rPr>
-          <w:sz w:val="22"/>
-          <w:szCs w:val="22"/>
-          <w:rtl w:val="0"/>
-        </w:rPr>
-        <w:t xml:space="preserve">attackers would have to buy large stakes, which is economically unprofitable. The evolutional change to PoS in Ethereum is one of the significant ones. Gazi and others examine PoS security assurance and long distance attack countermeasures such as the checkpointing.</w:t>
+        <w:t>Proof of Stake (PoS): PoS allows proposers of blocks to be chosen not by the amount of computational work they perform but by the amount of stake they hold (i.e. investment in cryptocurrency), which drastically lowers the amount of energy used, and security is ensured through economic incentives, since attackers would have to buy large stakes, which is economically unprofitable. The evolutional change to PoS in Ethereum is one of the significant ones. Gazi et al. [11] examine PoS security assurance and long distance attack countermeasures such as the checkpointing.</w:t>
       </w:r>
     </w:p>
     <w:p>
@@ -1416,42 +1148,7 @@
         </w:rPr>
       </w:pPr>
       <w:r>
-        <w:rPr>
-          <w:rFonts w:ascii="Times New Roman" w:cs="Times New Roman" w:eastAsia="Times New Roman" w:hAnsi="Times New Roman"/>
-          <w:b w:val="1"/>
-          <w:bCs w:val="1"/>
-          <w:i w:val="0"/>
-          <w:iCs w:val="0"/>
-          <w:smallCaps w:val="0"/>
-          <w:strike w:val="0"/>
-          <w:color w:val="000000"/>
-          <w:sz w:val="22"/>
-          <w:szCs w:val="22"/>
-          <w:u w:val="none"/>
-          <w:shd w:fill="auto" w:val="clear"/>
-          <w:vertAlign w:val="baseline"/>
-          <w:rtl w:val="0"/>
-        </w:rPr>
-        <w:t xml:space="preserve">Byzantine Fault Tolerance (BFT):</w:t>
-      </w:r>
-      <w:r>
-        <w:rPr>
-          <w:rFonts w:ascii="Times New Roman" w:cs="Times New Roman" w:eastAsia="Times New Roman" w:hAnsi="Times New Roman"/>
-          <w:b w:val="0"/>
-          <w:bCs w:val="0"/>
-          <w:i w:val="0"/>
-          <w:iCs w:val="0"/>
-          <w:smallCaps w:val="0"/>
-          <w:strike w:val="0"/>
-          <w:color w:val="000000"/>
-          <w:sz w:val="22"/>
-          <w:szCs w:val="22"/>
-          <w:u w:val="none"/>
-          <w:shd w:fill="auto" w:val="clear"/>
-          <w:vertAlign w:val="baseline"/>
-          <w:rtl w:val="0"/>
-        </w:rPr>
-        <w:t xml:space="preserve"> BFT-based consensus, such as Tendermint (Kwon and Buchman) and Hyperledger Fabric (Androulaki et al.), can provide finality and can support arbitrary failure of nodes, including malicious behavior if few more than a third of nodes are faulty. BFT systems are generally faster in finality and have greater throughput than PoW or PoS but need to know, comparatively fixed list of authorizers, which makes them more permissible to a permissioned setting.</w:t>
+        <w:t>Byzantine Fault Tolerance (BFT): BFT-based consensus, such as Tendermint (Kwon and Buchman [10]) and Hyperledger Fabric (Androulaki et al. [5]), can provide finality and can support arbitrary failure of nodes, including malicious behavior if few more than a third of nodes are faulty. BFT systems are generally faster in finality and have greater throughput than PoW or PoS but need to know, comparatively fixed list of authorizers, which makes them more permissible to a permissioned setting.</w:t>
       </w:r>
     </w:p>
     <w:p>
@@ -1488,74 +1185,7 @@
         </w:rPr>
       </w:pPr>
       <w:r>
-        <w:rPr>
-          <w:rFonts w:ascii="Times New Roman" w:cs="Times New Roman" w:eastAsia="Times New Roman" w:hAnsi="Times New Roman"/>
-          <w:b w:val="1"/>
-          <w:bCs w:val="1"/>
-          <w:i w:val="0"/>
-          <w:iCs w:val="0"/>
-          <w:smallCaps w:val="0"/>
-          <w:strike w:val="0"/>
-          <w:color w:val="000000"/>
-          <w:sz w:val="22"/>
-          <w:szCs w:val="22"/>
-          <w:u w:val="none"/>
-          <w:shd w:fill="auto" w:val="clear"/>
-          <w:vertAlign w:val="baseline"/>
-          <w:rtl w:val="0"/>
-        </w:rPr>
-        <w:t xml:space="preserve">Smart Contracts:</w:t>
-      </w:r>
-      <w:r>
-        <w:rPr>
-          <w:sz w:val="22"/>
-          <w:szCs w:val="22"/>
-          <w:rtl w:val="0"/>
-        </w:rPr>
-        <w:t xml:space="preserve">In 2014, Buterin proposed and in 2016, Wood described the Yellow Paper, which expanded the field of blockchain beyond simple value transfers to programmable transactions using smart contracts, or programs, which can run on the blockchain and execute themselves when specific conditions are satisfied. The smart contracts allow the issuance of complex business logic to be decentralized, such as financially using tokens to supply chain tracking. Nevertheless, smart contracts are posing serious security problems as thoroughly discussed by Atzei et al and Luu et al. Errors in contract code may cause significant financial loss - the 2016 DAO attack used a reentrancy vulnerability to drain about 60 million dollars. The vulnerabilities are frequently reentrancy (recursive calls prior to updating of state), arithmetic overflow/underflow, access control vulnerability, and oracle exploitation.</w:t>
-      </w:r>
-      <w:r>
-        <w:rPr>
-          <w:sz w:val="22"/>
-          <w:szCs w:val="22"/>
-        </w:rPr>
-        <w:drawing>
-          <wp:inline distB="114300" distT="114300" distL="114300" distR="114300">
-            <wp:extent cx="2930525" cy="1419225"/>
-            <wp:effectExtent b="0" l="0" r="0" t="0"/>
-            <wp:docPr id="16" name="image8.png"/>
-            <a:graphic>
-              <a:graphicData uri="http://schemas.openxmlformats.org/drawingml/2006/picture">
-                <pic:pic>
-                  <pic:nvPicPr>
-                    <pic:cNvPr id="0" name="image8.png"/>
-                    <pic:cNvPicPr preferRelativeResize="0"/>
-                  </pic:nvPicPr>
-                  <pic:blipFill>
-                    <a:blip r:embed="rId11"/>
-                    <a:srcRect b="0" l="0" r="0" t="0"/>
-                    <a:stretch>
-                      <a:fillRect/>
-                    </a:stretch>
-                  </pic:blipFill>
-                  <pic:spPr>
-                    <a:xfrm>
-                      <a:off x="0" y="0"/>
-                      <a:ext cx="2930525" cy="1419225"/>
-                    </a:xfrm>
-                    <a:prstGeom prst="rect"/>
-                    <a:ln/>
-                  </pic:spPr>
-                </pic:pic>
-              </a:graphicData>
-            </a:graphic>
-          </wp:inline>
-        </w:drawing>
-      </w:r>
-      <w:r>
-        <w:rPr>
-          <w:rtl w:val="0"/>
-        </w:rPr>
+        <w:t>Smart Contracts:In 2014, Buterin [2] proposed and in 2016, Wood [3] described the Yellow Paper, which expanded the field of blockchain beyond simple value transfers to programmable transactions using smart contracts, or programs, which can run on the blockchain and execute themselves when specific conditions are satisfied. The smart contracts allow the issuance of complex business logic to be decentralized, such as financially using tokens to supply chain tracking. Nevertheless, smart contracts are posing serious security problems as thoroughly discussed by Atzei et al. [12] and Luu et al. [13]. Errors in contract code may cause significant financial loss - the 2016 DAO attack used a reentrancy vulnerability to drain about 60 million dollars. The vulnerabilities are frequently reentrancy (recursive calls prior to updating of state), arithmetic overflow/underflow, access control vulnerability, and oracle exploitation.</w:t>
       </w:r>
     </w:p>
     <w:p>
@@ -1581,50 +1211,7 @@
         </w:rPr>
       </w:pPr>
       <w:r>
-        <w:rPr>
-          <w:rFonts w:ascii="Times New Roman" w:cs="Times New Roman" w:eastAsia="Times New Roman" w:hAnsi="Times New Roman"/>
-          <w:b w:val="1"/>
-          <w:bCs w:val="1"/>
-          <w:i w:val="0"/>
-          <w:iCs w:val="0"/>
-          <w:smallCaps w:val="0"/>
-          <w:strike w:val="0"/>
-          <w:color w:val="000000"/>
-          <w:sz w:val="22"/>
-          <w:szCs w:val="22"/>
-          <w:u w:val="none"/>
-          <w:shd w:fill="auto" w:val="clear"/>
-          <w:vertAlign w:val="baseline"/>
-          <w:rtl w:val="0"/>
-        </w:rPr>
-        <w:t xml:space="preserve">Cryptographic Primitives:</w:t>
-      </w:r>
-      <w:r>
-        <w:rPr>
-          <w:rFonts w:ascii="Times New Roman" w:cs="Times New Roman" w:eastAsia="Times New Roman" w:hAnsi="Times New Roman"/>
-          <w:b w:val="0"/>
-          <w:bCs w:val="0"/>
-          <w:i w:val="0"/>
-          <w:iCs w:val="0"/>
-          <w:smallCaps w:val="0"/>
-          <w:strike w:val="0"/>
-          <w:color w:val="000000"/>
-          <w:sz w:val="22"/>
-          <w:szCs w:val="22"/>
-          <w:u w:val="none"/>
-          <w:shd w:fill="auto" w:val="clear"/>
-          <w:vertAlign w:val="baseline"/>
-          <w:rtl w:val="0"/>
-        </w:rPr>
-        <w:t xml:space="preserve"> </w:t>
-      </w:r>
-      <w:r>
-        <w:rPr>
-          <w:sz w:val="22"/>
-          <w:szCs w:val="22"/>
-          <w:rtl w:val="0"/>
-        </w:rPr>
-        <w:t xml:space="preserve">Blockchain applies cryptography as a significant aspect in terms of security. The use of public-key cryptography enables users to sign their messages with their private keys and be authenticated and non-repudiated by the other users with the help of their public keys. Cryptographic hash functions produce deterministic-sized digests or hash values of information that are dependent upon any changes made to their input and that can be used to indicate that they have been altered. The merkle trees allow a request of the presence of a transaction in the block without downloading a complete block. Outside of primitives, like zero-knowledge proofs, it is possible to have systems like Zerocash (Ben-Sasson et al.) in which the user of an application can prove that they have enough money without revealing their balance.</w:t>
+        <w:t>Cryptographic Primitives: Blockchain applies cryptography as a significant aspect in terms of security. The use of public-key cryptography enables users to sign their messages with their private keys and be authenticated and non-repudiated by the other users with the help of their public keys. Cryptographic hash functions produce deterministic-sized digests or hash values of information that are dependent upon any changes made to their input and that can be used to indicate that they have been altered. The merkle trees allow a request of the presence of a transaction in the block without downloading a complete block. Outside of primitives, like zero-knowledge proofs, it is possible to have systems like Zerocash (Ben-Sasson et al. [8]) in which the user of an application can prove that they have enough money without revealing their balance.</w:t>
       </w:r>
     </w:p>
     <w:bookmarkStart w:colFirst="0" w:colLast="0" w:name="bookmark=id.c37ngynve07m" w:id="3"/>
@@ -2363,58 +1950,7 @@
         </w:rPr>
       </w:pPr>
       <w:r>
-        <w:rPr>
-          <w:rFonts w:ascii="Times New Roman" w:cs="Times New Roman" w:eastAsia="Times New Roman" w:hAnsi="Times New Roman"/>
-          <w:b w:val="1"/>
-          <w:bCs w:val="1"/>
-          <w:i w:val="0"/>
-          <w:iCs w:val="0"/>
-          <w:smallCaps w:val="0"/>
-          <w:strike w:val="0"/>
-          <w:color w:val="000000"/>
-          <w:sz w:val="22"/>
-          <w:szCs w:val="22"/>
-          <w:u w:val="none"/>
-          <w:shd w:fill="auto" w:val="clear"/>
-          <w:vertAlign w:val="baseline"/>
-          <w:rtl w:val="0"/>
-        </w:rPr>
-        <w:t xml:space="preserve">Immutable Ledger Structure: </w:t>
-      </w:r>
-      <w:r>
-        <w:rPr>
-          <w:sz w:val="22"/>
-          <w:szCs w:val="22"/>
-          <w:rtl w:val="0"/>
-        </w:rPr>
-        <w:t xml:space="preserve">Blockchain is fundamentally designed to enforce a tamper-evident record through cryptographically binding one block to the previous one, with hash functions. Any alterations to any historical transaction would alter the hash of that block, disconnecting it with the following block and necessitating the re-computation of all the following blocks. In a proof-of-work system such as Bitcoin, this recalculation must be performed by using colossal computational resources which increase exponentially with the block depth. Gervais et al. examined the evidence of the security of a proof-of-work blockchain, and they have proved that it is exponentially harder to rewrite several blockchain blocks as time passes, which means that it is nearly impossible to tamper with history with established blockchains</w:t>
-      </w:r>
-      <w:r>
-        <w:rPr>
-          <w:rFonts w:ascii="Times New Roman" w:cs="Times New Roman" w:eastAsia="Times New Roman" w:hAnsi="Times New Roman"/>
-          <w:b w:val="0"/>
-          <w:bCs w:val="0"/>
-          <w:i w:val="0"/>
-          <w:iCs w:val="0"/>
-          <w:smallCaps w:val="0"/>
-          <w:strike w:val="0"/>
-          <w:color w:val="000000"/>
-          <w:sz w:val="22"/>
-          <w:szCs w:val="22"/>
-          <w:u w:val="none"/>
-          <w:shd w:fill="auto" w:val="clear"/>
-          <w:vertAlign w:val="baseline"/>
-          <w:rtl w:val="0"/>
-        </w:rPr>
-        <w:t xml:space="preserve">.</w:t>
-      </w:r>
-      <w:r>
-        <w:rPr>
-          <w:sz w:val="22"/>
-          <w:szCs w:val="22"/>
-          <w:rtl w:val="0"/>
-        </w:rPr>
-        <w:t xml:space="preserve"> </w:t>
+        <w:t xml:space="preserve">Immutable Ledger Structure: Blockchain is fundamentally designed to enforce a tamper-evident record through cryptographically binding one block to the previous one, with hash functions. Any alterations to any historical transaction would alter the hash of that block, disconnecting it with the following block and necessitating the re-computation of all the following blocks. In a proof-of-work system such as Bitcoin, this recalculation must be performed by using colossal computational resources which increase exponentially with the block depth. Gervais et al. [22] examined the evidence of the security of a proof-of-work blockchain, and they have proved that it is exponentially harder to rewrite several blockchain blocks as time passes, which means that it is nearly impossible to tamper with history with established blockchains. </w:t>
       </w:r>
     </w:p>
     <w:p>
@@ -2663,86 +2199,9 @@
         </w:rPr>
       </w:pPr>
       <w:r>
-        <w:rPr>
-          <w:b w:val="1"/>
-          <w:bCs w:val="1"/>
-          <w:sz w:val="22"/>
-          <w:szCs w:val="22"/>
-          <w:rtl w:val="0"/>
-        </w:rPr>
-        <w:t xml:space="preserve">Probabilistic Integrity and Double-Spending Resistance:</w:t>
-        <w:br w:type="textWrapping"/>
-      </w:r>
-      <w:r>
-        <w:rPr>
-          <w:sz w:val="22"/>
-          <w:szCs w:val="22"/>
-          <w:rtl w:val="0"/>
-        </w:rPr>
-        <w:t xml:space="preserve"> The integrity guarantees of PoW blockchains are probabilistic rather than absolute. Nakamoto formalized this property by modeling the competition between honest miners and an adversary attempting a double-spending attack as a stochastic process. Let </w:t>
-      </w:r>
-      <w:r>
-        <w:rPr>
-          <w:b w:val="1"/>
-          <w:bCs w:val="1"/>
-          <w:sz w:val="22"/>
-          <w:szCs w:val="22"/>
-          <w:rtl w:val="0"/>
-        </w:rPr>
-        <w:t xml:space="preserve">q</w:t>
-      </w:r>
-      <w:r>
-        <w:rPr>
-          <w:sz w:val="22"/>
-          <w:szCs w:val="22"/>
-          <w:rtl w:val="0"/>
-        </w:rPr>
-        <w:t xml:space="preserve"> denote the fraction of total mining power controlled by an attacker and </w:t>
-      </w:r>
-      <w:sdt>
-        <w:sdtPr>
-          <w:id w:val="-897233332"/>
-          <w:tag w:val="goog_rdk_2"/>
-        </w:sdtPr>
-        <w:sdtContent>
-          <w:r>
-            <w:rPr>
-              <w:rFonts w:ascii="Gungsuh" w:cs="Gungsuh" w:eastAsia="Gungsuh" w:hAnsi="Gungsuh"/>
-              <w:b w:val="1"/>
-              <w:bCs w:val="1"/>
-              <w:sz w:val="22"/>
-              <w:szCs w:val="22"/>
-              <w:rtl w:val="0"/>
-            </w:rPr>
-            <w:t xml:space="preserve">p=1−q</w:t>
-          </w:r>
-        </w:sdtContent>
-      </w:sdt>
-      <w:r>
-        <w:rPr>
-          <w:sz w:val="22"/>
-          <w:szCs w:val="22"/>
-          <w:rtl w:val="0"/>
-        </w:rPr>
-        <w:t xml:space="preserve"> the fraction controlled by honest miners. If a transaction is buried under </w:t>
-      </w:r>
-      <w:r>
-        <w:rPr>
-          <w:b w:val="1"/>
-          <w:bCs w:val="1"/>
-          <w:sz w:val="22"/>
-          <w:szCs w:val="22"/>
-          <w:rtl w:val="0"/>
-        </w:rPr>
-        <w:t xml:space="preserve">z</w:t>
-      </w:r>
-      <w:r>
-        <w:rPr>
-          <w:sz w:val="22"/>
-          <w:szCs w:val="22"/>
-          <w:rtl w:val="0"/>
-        </w:rPr>
-        <w:t xml:space="preserve"> confirmations, the probability that an attacker can eventually catch up and reverse the transaction is given by:</w:t>
+        <w:t>Probabilistic Integrity and Double-Spending Resistance:</w:t>
+        <w:br/>
+        <w:t xml:space="preserve"> The integrity guarantees of PoW blockchains are probabilistic rather than absolute. Nakamoto [1] formalized this property by modeling the competition between honest miners and an adversary attempting a double-spending attack as a stochastic process. Let q denote the fraction of total mining power controlled by an attacker and  the fraction controlled by honest miners. If a transaction is buried under z confirmations, the probability that an attacker can eventually catch up and reverse the transaction is given by:</w:t>
       </w:r>
     </w:p>
     <w:p>
@@ -5044,31 +4503,7 @@
         </w:rPr>
       </w:pPr>
       <w:r>
-        <w:rPr>
-          <w:rFonts w:ascii="Times New Roman" w:cs="Times New Roman" w:eastAsia="Times New Roman" w:hAnsi="Times New Roman"/>
-          <w:b w:val="1"/>
-          <w:bCs w:val="1"/>
-          <w:i w:val="0"/>
-          <w:iCs w:val="0"/>
-          <w:smallCaps w:val="0"/>
-          <w:strike w:val="0"/>
-          <w:color w:val="000000"/>
-          <w:sz w:val="22"/>
-          <w:szCs w:val="22"/>
-          <w:u w:val="none"/>
-          <w:shd w:fill="auto" w:val="clear"/>
-          <w:vertAlign w:val="baseline"/>
-          <w:rtl w:val="0"/>
-        </w:rPr>
-        <w:t xml:space="preserve">Off-Chain Storage with On-Chain Commitments:</w:t>
-      </w:r>
-      <w:r>
-        <w:rPr>
-          <w:sz w:val="22"/>
-          <w:szCs w:val="22"/>
-          <w:rtl w:val="0"/>
-        </w:rPr>
-        <w:t xml:space="preserve"> It is common in many practical systems to store sensitive data off-chain (in private databases, encrypted file systems, and even distributed storage such as IPFS) and record cryptographic commitments (hashes or Merkle roots) on-chain. The architecture preserves integrity checks using the tamper-evident characteristics of the blockchain and keeps real information confidential and permits conventional access control measures. This pattern is widely implemented by healthcare applications, as thoroughly surveyed by Conti et al., as it is required to meet privacy laws such as HIPAA, but takes advantage of blockchain audit and tamper detection.</w:t>
+        <w:t>Off-Chain Storage with On-Chain Commitments: It is common in many practical systems to store sensitive data off-chain (in private databases, encrypted file systems, and even distributed storage such as IPFS) and record cryptographic commitments (hashes or Merkle roots) on-chain. The architecture preserves integrity checks using the tamper-evident characteristics of the blockchain and keeps real information confidential and permits conventional access control measures. This pattern is widely implemented by healthcare applications, as thoroughly surveyed by Conti et al. [16], as it is required to meet privacy laws such as HIPAA, but takes advantage of blockchain audit and tamper detection.</w:t>
       </w:r>
     </w:p>
     <w:p>
@@ -5433,55 +4868,7 @@
         </w:rPr>
       </w:pPr>
       <w:r>
-        <w:rPr>
-          <w:rFonts w:ascii="Times New Roman" w:cs="Times New Roman" w:eastAsia="Times New Roman" w:hAnsi="Times New Roman"/>
-          <w:b w:val="1"/>
-          <w:bCs w:val="1"/>
-          <w:i w:val="0"/>
-          <w:iCs w:val="0"/>
-          <w:smallCaps w:val="0"/>
-          <w:strike w:val="0"/>
-          <w:color w:val="000000"/>
-          <w:sz w:val="22"/>
-          <w:szCs w:val="22"/>
-          <w:u w:val="none"/>
-          <w:shd w:fill="auto" w:val="clear"/>
-          <w:vertAlign w:val="baseline"/>
-          <w:rtl w:val="0"/>
-        </w:rPr>
-        <w:t xml:space="preserve">Mixing and Anonymization:</w:t>
-      </w:r>
-      <w:r>
-        <w:rPr>
-          <w:rFonts w:ascii="Times New Roman" w:cs="Times New Roman" w:eastAsia="Times New Roman" w:hAnsi="Times New Roman"/>
-          <w:b w:val="0"/>
-          <w:bCs w:val="0"/>
-          <w:i w:val="0"/>
-          <w:iCs w:val="0"/>
-          <w:smallCaps w:val="0"/>
-          <w:strike w:val="0"/>
-          <w:color w:val="000000"/>
-          <w:sz w:val="22"/>
-          <w:szCs w:val="22"/>
-          <w:u w:val="none"/>
-          <w:shd w:fill="auto" w:val="clear"/>
-          <w:vertAlign w:val="baseline"/>
-          <w:rtl w:val="0"/>
-        </w:rPr>
-        <w:t xml:space="preserve"> Service</w:t>
-      </w:r>
-      <w:r>
-        <w:rPr>
-          <w:sz w:val="22"/>
-          <w:szCs w:val="22"/>
-          <w:rtl w:val="0"/>
-        </w:rPr>
-        <w:t xml:space="preserve"> providers that mix or tumble transactions of many users obscure the connections between the senders and the receivers by pooling money and re-distribing it with delays. Zhang et al. examined incentive-compatible mixing schemes that guarantee honest behavior by the participants. Nevertheless, there are inherent technical analysis (virtuous scholars such as Meiklejohn et al. have devised the complex de-anonymization heuristics that, although mixing, can be probabilistically linked), as well as regulating (mixing can facilitate money laundering and other crimes) problems with mixing.</w:t>
-      </w:r>
-      <w:r>
-        <w:rPr>
-          <w:rtl w:val="0"/>
-        </w:rPr>
+        <w:t>Mixing and Anonymization: Service providers that mix or tumble transactions of many users obscure the connections between the senders and the receivers by pooling money and re-distribing it with delays. Zhang et al. [21] examined incentive-compatible mixing schemes that guarantee honest behavior by the participants. Nevertheless, there are inherent technical analysis (virtuous scholars such as Meiklejohn et al. [7] have devised the complex de-anonymization heuristics that, although mixing, can be probabilistically linked), as well as regulating (mixing can facilitate money laundering and other crimes) problems with mixing.</w:t>
       </w:r>
     </w:p>
     <w:p>
@@ -5518,42 +4905,7 @@
         </w:rPr>
       </w:pPr>
       <w:r>
-        <w:rPr>
-          <w:rFonts w:ascii="Times New Roman" w:cs="Times New Roman" w:eastAsia="Times New Roman" w:hAnsi="Times New Roman"/>
-          <w:b w:val="1"/>
-          <w:bCs w:val="1"/>
-          <w:i w:val="0"/>
-          <w:iCs w:val="0"/>
-          <w:smallCaps w:val="0"/>
-          <w:strike w:val="0"/>
-          <w:color w:val="000000"/>
-          <w:sz w:val="22"/>
-          <w:szCs w:val="22"/>
-          <w:u w:val="none"/>
-          <w:shd w:fill="auto" w:val="clear"/>
-          <w:vertAlign w:val="baseline"/>
-          <w:rtl w:val="0"/>
-        </w:rPr>
-        <w:t xml:space="preserve">Secure Multi-Party Computation:</w:t>
-      </w:r>
-      <w:r>
-        <w:rPr>
-          <w:rFonts w:ascii="Times New Roman" w:cs="Times New Roman" w:eastAsia="Times New Roman" w:hAnsi="Times New Roman"/>
-          <w:b w:val="0"/>
-          <w:bCs w:val="0"/>
-          <w:i w:val="0"/>
-          <w:iCs w:val="0"/>
-          <w:smallCaps w:val="0"/>
-          <w:strike w:val="0"/>
-          <w:color w:val="000000"/>
-          <w:sz w:val="22"/>
-          <w:szCs w:val="22"/>
-          <w:u w:val="none"/>
-          <w:shd w:fill="auto" w:val="clear"/>
-          <w:vertAlign w:val="baseline"/>
-          <w:rtl w:val="0"/>
-        </w:rPr>
-        <w:t xml:space="preserve"> MPC protocols enable many parties to jointly arrive at computations on their own data without exposing that data to other parties or using trusted third parties. Almeida et al. investigated the idea of using MPC together with blockchain to have privacy preserving smart contracts where contract logic is executed using encrypted or secret shared data. Practical implementation is however not feasible because it has high performance costs (orders of magnitude slower than plaintext calculation) and high communication complexity (many message rounds) and coordination problems (when the parties are unreliable or malicious).</w:t>
+        <w:t>Secure Multi-Party Computation: MPC protocols enable many parties to jointly arrive at computations on their own data without exposing that data to other parties or using trusted third parties. Almeida et al. [19] investigated the idea of using MPC together with blockchain to have privacy preserving smart contracts where contract logic is executed using encrypted or secret shared data. Practical implementation is however not feasible because it has high performance costs (orders of magnitude slower than plaintext calculation) and high communication complexity (many message rounds) and coordination problems (when the parties are unreliable or malicious).</w:t>
       </w:r>
     </w:p>
     <w:p>
@@ -5590,50 +4942,7 @@
         </w:rPr>
       </w:pPr>
       <w:r>
-        <w:rPr>
-          <w:rFonts w:ascii="Times New Roman" w:cs="Times New Roman" w:eastAsia="Times New Roman" w:hAnsi="Times New Roman"/>
-          <w:b w:val="1"/>
-          <w:bCs w:val="1"/>
-          <w:i w:val="0"/>
-          <w:iCs w:val="0"/>
-          <w:smallCaps w:val="0"/>
-          <w:strike w:val="0"/>
-          <w:color w:val="000000"/>
-          <w:sz w:val="22"/>
-          <w:szCs w:val="22"/>
-          <w:u w:val="none"/>
-          <w:shd w:fill="auto" w:val="clear"/>
-          <w:vertAlign w:val="baseline"/>
-          <w:rtl w:val="0"/>
-        </w:rPr>
-        <w:t xml:space="preserve">Trusted Execution Environments:</w:t>
-      </w:r>
-      <w:r>
-        <w:rPr>
-          <w:sz w:val="22"/>
-          <w:szCs w:val="22"/>
-          <w:rtl w:val="0"/>
-        </w:rPr>
-        <w:t xml:space="preserve">MPC protocols enable many parties to jointly arrive at computations on their own data without exposing that data to other parties or using trusted third parties. Almeida et al. investigated the idea of using MPC together with blockchain to have privacy preserving smart contracts where contract logic is executed using encrypted or secret shared data. Practical implementation is however not feasible because it has high performance costs (orders of magnitude slower than plaintext calculation) and high communication complexity (many message rounds) and coordination problems (when the parties are unreliable or malicious)</w:t>
-      </w:r>
-      <w:r>
-        <w:rPr>
-          <w:rFonts w:ascii="Times New Roman" w:cs="Times New Roman" w:eastAsia="Times New Roman" w:hAnsi="Times New Roman"/>
-          <w:b w:val="0"/>
-          <w:bCs w:val="0"/>
-          <w:i w:val="0"/>
-          <w:iCs w:val="0"/>
-          <w:smallCaps w:val="0"/>
-          <w:strike w:val="0"/>
-          <w:color w:val="000000"/>
-          <w:sz w:val="22"/>
-          <w:szCs w:val="22"/>
-          <w:u w:val="none"/>
-          <w:shd w:fill="auto" w:val="clear"/>
-          <w:vertAlign w:val="baseline"/>
-          <w:rtl w:val="0"/>
-        </w:rPr>
-        <w:t xml:space="preserve">.</w:t>
+        <w:t>Trusted Execution Environments:MPC protocols enable many parties to jointly arrive at computations on their own data without exposing that data to other parties or using trusted third parties. Almeida et al. [19] investigated the idea of using MPC together with blockchain to have privacy preserving smart contracts where contract logic is executed using encrypted or secret shared data. Practical implementation is however not feasible because it has high performance costs (orders of magnitude slower than plaintext calculation) and high communication complexity (many message rounds) and coordination problems (when the parties are unreliable or malicious).</w:t>
       </w:r>
     </w:p>
     <w:bookmarkStart w:colFirst="0" w:colLast="0" w:name="bookmark=id.7yyq17en9h51" w:id="9"/>
@@ -5953,36 +5262,7 @@
         </w:rPr>
       </w:pPr>
       <w:r>
-        <w:rPr>
-          <w:rFonts w:ascii="Times New Roman" w:cs="Times New Roman" w:eastAsia="Times New Roman" w:hAnsi="Times New Roman"/>
-          <w:b w:val="1"/>
-          <w:bCs w:val="1"/>
-          <w:i w:val="0"/>
-          <w:iCs w:val="0"/>
-          <w:smallCaps w:val="0"/>
-          <w:strike w:val="0"/>
-          <w:color w:val="000000"/>
-          <w:sz w:val="22"/>
-          <w:szCs w:val="22"/>
-          <w:u w:val="none"/>
-          <w:shd w:fill="auto" w:val="clear"/>
-          <w:vertAlign w:val="baseline"/>
-          <w:rtl w:val="0"/>
-        </w:rPr>
-        <w:t xml:space="preserve">Decentralized Identity: </w:t>
-      </w:r>
-      <w:r>
-        <w:rPr>
-          <w:sz w:val="22"/>
-          <w:szCs w:val="22"/>
-          <w:rtl w:val="0"/>
-        </w:rPr>
-        <w:t xml:space="preserve">Ali et al. have researched decentralized identities (DID) using Blockstack, and Hardjono and Smith on decentralized public key infrastructure (DPKI) based on blockchains. These systems allow the user to manage their identity credentials, without having to use centralized identity providers such as governments or corporations. The models of self-sovereign identity enable users to administer their own credentials, share particular aspects of them selectively (such as demonstrating age without revealing date of birth), and recall credentials in case of an intrusion.</w:t>
-      </w:r>
-      <w:r>
-        <w:rPr>
-          <w:rtl w:val="0"/>
-        </w:rPr>
+        <w:t>Decentralized Identity: Ali et al. [24] have researched decentralized identities (DID) using Blockstack, and Hardjono and Smith [20] on decentralized public key infrastructure (DPKI) based on blockchains. These systems allow the user to manage their identity credentials, without having to use centralized identity providers such as governments or corporations. The models of self-sovereign identity enable users to administer their own credentials, share particular aspects of them selectively (such as demonstrating age without revealing date of birth), and recall credentials in case of an intrusion.</w:t>
       </w:r>
     </w:p>
     <w:p>
@@ -6885,42 +6165,7 @@
         </w:rPr>
       </w:pPr>
       <w:r>
-        <w:rPr>
-          <w:rFonts w:ascii="Times New Roman" w:cs="Times New Roman" w:eastAsia="Times New Roman" w:hAnsi="Times New Roman"/>
-          <w:b w:val="1"/>
-          <w:bCs w:val="1"/>
-          <w:i w:val="0"/>
-          <w:iCs w:val="0"/>
-          <w:smallCaps w:val="0"/>
-          <w:strike w:val="0"/>
-          <w:color w:val="000000"/>
-          <w:sz w:val="22"/>
-          <w:szCs w:val="22"/>
-          <w:u w:val="none"/>
-          <w:shd w:fill="auto" w:val="clear"/>
-          <w:vertAlign w:val="baseline"/>
-          <w:rtl w:val="0"/>
-        </w:rPr>
-        <w:t xml:space="preserve">51% Attacks:</w:t>
-      </w:r>
-      <w:r>
-        <w:rPr>
-          <w:rFonts w:ascii="Times New Roman" w:cs="Times New Roman" w:eastAsia="Times New Roman" w:hAnsi="Times New Roman"/>
-          <w:b w:val="0"/>
-          <w:bCs w:val="0"/>
-          <w:i w:val="0"/>
-          <w:iCs w:val="0"/>
-          <w:smallCaps w:val="0"/>
-          <w:strike w:val="0"/>
-          <w:color w:val="000000"/>
-          <w:sz w:val="22"/>
-          <w:szCs w:val="22"/>
-          <w:u w:val="none"/>
-          <w:shd w:fill="auto" w:val="clear"/>
-          <w:vertAlign w:val="baseline"/>
-          <w:rtl w:val="0"/>
-        </w:rPr>
-        <w:t xml:space="preserve"> In Proof of work systems, a network with greater than half the available hash power is vulnerable to attacks by the attacker because they can reject all other miners and use their coins to perform a double-spending attack (use the same coins twice). Where large public blockchains such as Bitcoin have huge hash rates where such attacks are costly economically (millions per hour attack cost), smaller cryptocurrencies have been compromised with 51% attacks costing millions of dollars. Gervais et al. give a thorough examination of situations where such attacks are made possible and the cost thereof, such as network latency, and block propagation times.</w:t>
+        <w:t>51% Attacks: In Proof of work systems, a network with greater than half the available hash power is vulnerable to attacks by the attacker because they can reject all other miners and use their coins to perform a double-spending attack (use the same coins twice). Where large public blockchains such as Bitcoin have huge hash rates where such attacks are costly economically (millions per hour attack cost), smaller cryptocurrencies have been compromised with 51% attacks costing millions of dollars. Gervais et al. [22] give a thorough examination of situations where such attacks are made possible and the cost thereof, such as network latency, and block propagation times.</w:t>
       </w:r>
     </w:p>
     <w:p>
@@ -7569,150 +6814,7 @@
         </w:rPr>
       </w:pPr>
       <w:r>
-        <w:rPr>
-          <w:rFonts w:ascii="Times New Roman" w:cs="Times New Roman" w:eastAsia="Times New Roman" w:hAnsi="Times New Roman"/>
-          <w:b w:val="1"/>
-          <w:bCs w:val="1"/>
-          <w:i w:val="0"/>
-          <w:iCs w:val="0"/>
-          <w:smallCaps w:val="0"/>
-          <w:strike w:val="0"/>
-          <w:color w:val="000000"/>
-          <w:sz w:val="22"/>
-          <w:szCs w:val="22"/>
-          <w:u w:val="none"/>
-          <w:shd w:fill="auto" w:val="clear"/>
-          <w:vertAlign w:val="baseline"/>
-          <w:rtl w:val="0"/>
-        </w:rPr>
-        <w:t xml:space="preserve">Reentrancy Attacks:</w:t>
-      </w:r>
-      <w:r>
-        <w:rPr>
-          <w:rFonts w:ascii="Times New Roman" w:cs="Times New Roman" w:eastAsia="Times New Roman" w:hAnsi="Times New Roman"/>
-          <w:b w:val="0"/>
-          <w:bCs w:val="0"/>
-          <w:i w:val="0"/>
-          <w:iCs w:val="0"/>
-          <w:smallCaps w:val="0"/>
-          <w:strike w:val="0"/>
-          <w:color w:val="000000"/>
-          <w:sz w:val="22"/>
-          <w:szCs w:val="22"/>
-          <w:u w:val="none"/>
-          <w:shd w:fill="auto" w:val="clear"/>
-          <w:vertAlign w:val="baseline"/>
-          <w:rtl w:val="0"/>
-        </w:rPr>
-        <w:t xml:space="preserve"> The notorious 2016 DAO attack was a reentrancy attack that used the reentrancy vulnerability in which a malicious contract can recursively call into the victim contract prior to the initial invocation making its state updates, effectively withdrawing funds on multiple occasions. The attack cost about 60 million and </w:t>
-      </w:r>
-      <w:r>
-        <w:rPr>
-          <w:sz w:val="22"/>
-          <w:szCs w:val="22"/>
-          <w:rtl w:val="0"/>
-        </w:rPr>
-        <w:t xml:space="preserve">resulted</w:t>
-      </w:r>
-      <w:r>
-        <w:rPr>
-          <w:rFonts w:ascii="Times New Roman" w:cs="Times New Roman" w:eastAsia="Times New Roman" w:hAnsi="Times New Roman"/>
-          <w:b w:val="0"/>
-          <w:bCs w:val="0"/>
-          <w:i w:val="0"/>
-          <w:iCs w:val="0"/>
-          <w:smallCaps w:val="0"/>
-          <w:strike w:val="0"/>
-          <w:color w:val="000000"/>
-          <w:sz w:val="22"/>
-          <w:szCs w:val="22"/>
-          <w:u w:val="none"/>
-          <w:shd w:fill="auto" w:val="clear"/>
-          <w:vertAlign w:val="baseline"/>
-          <w:rtl w:val="0"/>
-        </w:rPr>
-        <w:t xml:space="preserve"> in an Ethereum hard fork that was controversial. This weakness was caused by the fact that contracts updated their state after (not before) external calls (which is a violation of the checks-effects-interactions pattern). Atzei et al. </w:t>
-      </w:r>
-      <w:r>
-        <w:rPr>
-          <w:sz w:val="22"/>
-          <w:szCs w:val="22"/>
-          <w:rtl w:val="0"/>
-        </w:rPr>
-        <w:t xml:space="preserve">give a more</w:t>
-      </w:r>
-      <w:r>
-        <w:rPr>
-          <w:rFonts w:ascii="Times New Roman" w:cs="Times New Roman" w:eastAsia="Times New Roman" w:hAnsi="Times New Roman"/>
-          <w:b w:val="0"/>
-          <w:bCs w:val="0"/>
-          <w:i w:val="0"/>
-          <w:iCs w:val="0"/>
-          <w:smallCaps w:val="0"/>
-          <w:strike w:val="0"/>
-          <w:color w:val="000000"/>
-          <w:sz w:val="22"/>
-          <w:szCs w:val="22"/>
-          <w:u w:val="none"/>
-          <w:shd w:fill="auto" w:val="clear"/>
-          <w:vertAlign w:val="baseline"/>
-          <w:rtl w:val="0"/>
-        </w:rPr>
-        <w:t xml:space="preserve"> detailed taxonomy of Ethereum smart contract attacks including reentrancy variants.</w:t>
-      </w:r>
-      <w:r>
-        <w:rPr>
-          <w:rFonts w:ascii="Times New Roman" w:cs="Times New Roman" w:eastAsia="Times New Roman" w:hAnsi="Times New Roman"/>
-          <w:b w:val="0"/>
-          <w:bCs w:val="0"/>
-          <w:i w:val="0"/>
-          <w:iCs w:val="0"/>
-          <w:smallCaps w:val="0"/>
-          <w:strike w:val="0"/>
-          <w:color w:val="000000"/>
-          <w:sz w:val="22"/>
-          <w:szCs w:val="22"/>
-          <w:u w:val="none"/>
-          <w:shd w:fill="auto" w:val="clear"/>
-          <w:vertAlign w:val="baseline"/>
-        </w:rPr>
-        <w:drawing>
-          <wp:inline distB="114300" distT="114300" distL="114300" distR="114300">
-            <wp:extent cx="3086100" cy="2044700"/>
-            <wp:effectExtent b="0" l="0" r="0" t="0"/>
-            <wp:docPr id="1" name="image7.png"/>
-            <a:graphic>
-              <a:graphicData uri="http://schemas.openxmlformats.org/drawingml/2006/picture">
-                <pic:pic>
-                  <pic:nvPicPr>
-                    <pic:cNvPr id="0" name="image7.png"/>
-                    <pic:cNvPicPr preferRelativeResize="0"/>
-                  </pic:nvPicPr>
-                  <pic:blipFill>
-                    <a:blip r:embed="rId26"/>
-                    <a:srcRect b="0" l="0" r="0" t="0"/>
-                    <a:stretch>
-                      <a:fillRect/>
-                    </a:stretch>
-                  </pic:blipFill>
-                  <pic:spPr>
-                    <a:xfrm>
-                      <a:off x="0" y="0"/>
-                      <a:ext cx="3086100" cy="2044700"/>
-                    </a:xfrm>
-                    <a:prstGeom prst="rect"/>
-                    <a:ln/>
-                  </pic:spPr>
-                </pic:pic>
-              </a:graphicData>
-            </a:graphic>
-          </wp:inline>
-        </w:drawing>
-      </w:r>
-      <w:r>
-        <w:rPr>
-          <w:rtl w:val="0"/>
-        </w:rPr>
+        <w:t>Reentrancy Attacks: The notorious 2016 DAO attack was a reentrancy attack that used the reentrancy vulnerability in which a malicious contract can recursively call into the victim contract prior to the initial invocation making its state updates, effectively withdrawing funds on multiple occasions. The attack cost about 60 million and resulted in an Ethereum hard fork that was controversial. This weakness was caused by the fact that contracts updated their state after (not before) external calls (which is a violation of the checks-effects-interactions pattern). Atzei et al. [12] give a more detailed taxonomy of Ethereum smart contract attacks including reentrancy variants.</w:t>
       </w:r>
     </w:p>
     <w:p>
@@ -7893,42 +6995,7 @@
         </w:rPr>
       </w:pPr>
       <w:r>
-        <w:rPr>
-          <w:rFonts w:ascii="Times New Roman" w:cs="Times New Roman" w:eastAsia="Times New Roman" w:hAnsi="Times New Roman"/>
-          <w:b w:val="1"/>
-          <w:bCs w:val="1"/>
-          <w:i w:val="0"/>
-          <w:iCs w:val="0"/>
-          <w:smallCaps w:val="0"/>
-          <w:strike w:val="0"/>
-          <w:color w:val="000000"/>
-          <w:sz w:val="22"/>
-          <w:szCs w:val="22"/>
-          <w:u w:val="none"/>
-          <w:shd w:fill="auto" w:val="clear"/>
-          <w:vertAlign w:val="baseline"/>
-          <w:rtl w:val="0"/>
-        </w:rPr>
-        <w:t xml:space="preserve">Oracle Manipulation:</w:t>
-      </w:r>
-      <w:r>
-        <w:rPr>
-          <w:rFonts w:ascii="Times New Roman" w:cs="Times New Roman" w:eastAsia="Times New Roman" w:hAnsi="Times New Roman"/>
-          <w:b w:val="0"/>
-          <w:bCs w:val="0"/>
-          <w:i w:val="0"/>
-          <w:iCs w:val="0"/>
-          <w:smallCaps w:val="0"/>
-          <w:strike w:val="0"/>
-          <w:color w:val="000000"/>
-          <w:sz w:val="22"/>
-          <w:szCs w:val="22"/>
-          <w:u w:val="none"/>
-          <w:shd w:fill="auto" w:val="clear"/>
-          <w:vertAlign w:val="baseline"/>
-          <w:rtl w:val="0"/>
-        </w:rPr>
-        <w:t xml:space="preserve"> Smart contracts frequently require external information sources (oracles) which supply real-world information, such as asset prices, weather, or sport scores. There are attackers who are capable of manipulation of the oracle data which may lead to wrong decisions made by contracts. Manipulation of price oracles Attacks on decentralized finance platforms that use flash loans have been used to exploit manipulation of market prices and oracle updates based on manipulated prices to make a profit on contracts at stale prices and repay the loan in a single atomic transaction. Daian et al. evaluated maximum extractable value (MEV) that indicates how validators can get profits by strategizing the order of transactions.</w:t>
+        <w:t>Oracle Manipulation: Smart contracts frequently require external information sources (oracles) which supply real-world information, such as asset prices, weather, or sport scores. There are attackers who are capable of manipulation of the oracle data which may lead to wrong decisions made by contracts. Manipulation of price oracles Attacks on decentralized finance platforms that use flash loans have been used to exploit manipulation of market prices and oracle updates based on manipulated prices to make a profit on contracts at stale prices and repay the loan in a single atomic transaction. Daian et al. [14] evaluated maximum extractable value (MEV) that indicates how validators can get profits by strategizing the order of transactions.</w:t>
       </w:r>
     </w:p>
     <w:p>
@@ -8031,42 +7098,7 @@
         </w:rPr>
       </w:pPr>
       <w:r>
-        <w:rPr>
-          <w:rFonts w:ascii="Times New Roman" w:cs="Times New Roman" w:eastAsia="Times New Roman" w:hAnsi="Times New Roman"/>
-          <w:b w:val="1"/>
-          <w:bCs w:val="1"/>
-          <w:i w:val="0"/>
-          <w:iCs w:val="0"/>
-          <w:smallCaps w:val="0"/>
-          <w:strike w:val="0"/>
-          <w:color w:val="000000"/>
-          <w:sz w:val="22"/>
-          <w:szCs w:val="22"/>
-          <w:u w:val="none"/>
-          <w:shd w:fill="auto" w:val="clear"/>
-          <w:vertAlign w:val="baseline"/>
-          <w:rtl w:val="0"/>
-        </w:rPr>
-        <w:t xml:space="preserve">Defenses:</w:t>
-      </w:r>
-      <w:r>
-        <w:rPr>
-          <w:rFonts w:ascii="Times New Roman" w:cs="Times New Roman" w:eastAsia="Times New Roman" w:hAnsi="Times New Roman"/>
-          <w:b w:val="0"/>
-          <w:bCs w:val="0"/>
-          <w:i w:val="0"/>
-          <w:iCs w:val="0"/>
-          <w:smallCaps w:val="0"/>
-          <w:strike w:val="0"/>
-          <w:color w:val="000000"/>
-          <w:sz w:val="22"/>
-          <w:szCs w:val="22"/>
-          <w:u w:val="none"/>
-          <w:shd w:fill="auto" w:val="clear"/>
-          <w:vertAlign w:val="baseline"/>
-          <w:rtl w:val="0"/>
-        </w:rPr>
-        <w:t xml:space="preserve"> To mitigate the vulnerability of smart contracts, there is a need to take multifaceted strategies. The secure development lifecycle practices are threat modelling in design, security oriented design patterns (checks-effects-interactions to prevent reentrancy, pull-over-push to distribute payments) and compliance with accepted standards and best practices. Such automatic analysis tools as Oyente (created by Luu et al.) find known vulnerabilities using symbolic execution and data flow analysis, but they are not able to identify every problem. Ad hoc professional security audits by expert auditors uncover latent weaknesses unnoticed by automated tools by conducting a manual review of source code and through trying to reason as an attacker. Formal verification Formal verification mathematically establishes that contracts meet security properties, which offers maximum confidence, but it is nevertheless costly and can only be accomplished by expert knowledge. Bug bounty programs encourage independent security researchers to discover and report vulnerabilities in a responsible manner before the vulnerabilities are exploited maliciously. With runtime monitoring and circuit breakers, the damage can be restricted in case the vulnerabilities are used in spite of the preventive measures employed by permitting the emergency suspension of the vulnerable contracts.</w:t>
+        <w:t>Defenses: To mitigate the vulnerability of smart contracts, there is a need to take multifaceted strategies. The secure development lifecycle practices are threat modelling in design, security oriented design patterns (checks-effects-interactions to prevent reentrancy, pull-over-push to distribute payments) and compliance with accepted standards and best practices. Such automatic analysis tools as Oyente (created by Luu et al. [13]) find known vulnerabilities using symbolic execution and data flow analysis, but they are not able to identify every problem. Ad hoc professional security audits by expert auditors uncover latent weaknesses unnoticed by automated tools by conducting a manual review of source code and through trying to reason as an attacker. Formal verification Formal verification mathematically establishes that contracts meet security properties, which offers maximum confidence, but it is nevertheless costly and can only be accomplished by expert knowledge. Bug bounty programs encourage independent security researchers to discover and report vulnerabilities in a responsible manner before the vulnerabilities are exploited maliciously. With runtime monitoring and circuit breakers, the damage can be restricted in case the vulnerabilities are used in spite of the preventive measures employed by permitting the emergency suspension of the vulnerable contracts.</w:t>
       </w:r>
     </w:p>
     <w:bookmarkStart w:colFirst="0" w:colLast="0" w:name="bookmark=id.31q6b4z4apgq" w:id="14"/>
@@ -8884,96 +7916,7 @@
         </w:rPr>
       </w:pPr>
       <w:r>
-        <w:rPr>
-          <w:rFonts w:ascii="Times New Roman" w:cs="Times New Roman" w:eastAsia="Times New Roman" w:hAnsi="Times New Roman"/>
-          <w:b w:val="1"/>
-          <w:bCs w:val="1"/>
-          <w:i w:val="0"/>
-          <w:iCs w:val="0"/>
-          <w:smallCaps w:val="0"/>
-          <w:strike w:val="0"/>
-          <w:color w:val="000000"/>
-          <w:sz w:val="22"/>
-          <w:szCs w:val="22"/>
-          <w:u w:val="none"/>
-          <w:shd w:fill="auto" w:val="clear"/>
-          <w:vertAlign w:val="baseline"/>
-          <w:rtl w:val="0"/>
-        </w:rPr>
-        <w:t xml:space="preserve">Transaction Graph Analysis:</w:t>
-      </w:r>
-      <w:r>
-        <w:rPr>
-          <w:rFonts w:ascii="Times New Roman" w:cs="Times New Roman" w:eastAsia="Times New Roman" w:hAnsi="Times New Roman"/>
-          <w:b w:val="0"/>
-          <w:bCs w:val="0"/>
-          <w:i w:val="0"/>
-          <w:iCs w:val="0"/>
-          <w:smallCaps w:val="0"/>
-          <w:strike w:val="0"/>
-          <w:color w:val="000000"/>
-          <w:sz w:val="22"/>
-          <w:szCs w:val="22"/>
-          <w:u w:val="none"/>
-          <w:shd w:fill="auto" w:val="clear"/>
-          <w:vertAlign w:val="baseline"/>
-          <w:rtl w:val="0"/>
-        </w:rPr>
-        <w:t xml:space="preserve"> Meiklejohn et al. showed </w:t>
-      </w:r>
-      <w:r>
-        <w:rPr>
-          <w:sz w:val="22"/>
-          <w:szCs w:val="22"/>
-          <w:rtl w:val="0"/>
-        </w:rPr>
-        <w:t xml:space="preserve">that comprehending</w:t>
-      </w:r>
-      <w:r>
-        <w:rPr>
-          <w:rFonts w:ascii="Times New Roman" w:cs="Times New Roman" w:eastAsia="Times New Roman" w:hAnsi="Times New Roman"/>
-          <w:b w:val="0"/>
-          <w:bCs w:val="0"/>
-          <w:i w:val="0"/>
-          <w:iCs w:val="0"/>
-          <w:smallCaps w:val="0"/>
-          <w:strike w:val="0"/>
-          <w:color w:val="000000"/>
-          <w:sz w:val="22"/>
-          <w:szCs w:val="22"/>
-          <w:u w:val="none"/>
-          <w:shd w:fill="auto" w:val="clear"/>
-          <w:vertAlign w:val="baseline"/>
-          <w:rtl w:val="0"/>
-        </w:rPr>
-        <w:t xml:space="preserve"> the graph structure of Bitcoin transactions (who paid whom) enables grouping addresses that are probably those of the same user in common input ownership heuristics and other tendencies. </w:t>
-      </w:r>
-      <w:r>
-        <w:rPr>
-          <w:sz w:val="22"/>
-          <w:szCs w:val="22"/>
-          <w:rtl w:val="0"/>
-        </w:rPr>
-        <w:t xml:space="preserve">These clusters can be then associated with real world identities through addresses familiar to them such as exchange withdrawal address, publicly posted address on donations or addresses that are disclosed during purchase transaction.</w:t>
-      </w:r>
-      <w:r>
-        <w:rPr>
-          <w:rFonts w:ascii="Times New Roman" w:cs="Times New Roman" w:eastAsia="Times New Roman" w:hAnsi="Times New Roman"/>
-          <w:b w:val="0"/>
-          <w:bCs w:val="0"/>
-          <w:i w:val="0"/>
-          <w:iCs w:val="0"/>
-          <w:smallCaps w:val="0"/>
-          <w:strike w:val="0"/>
-          <w:color w:val="000000"/>
-          <w:sz w:val="22"/>
-          <w:szCs w:val="22"/>
-          <w:u w:val="none"/>
-          <w:shd w:fill="auto" w:val="clear"/>
-          <w:vertAlign w:val="baseline"/>
-          <w:rtl w:val="0"/>
-        </w:rPr>
-        <w:t xml:space="preserve"> This deanonymization is even in the presence of pseudonymity since patterns and relationships of transactions provide a lot of information about user identities and user behaviors.</w:t>
+        <w:t>Transaction Graph Analysis: Meiklejohn et al. [7] showed that comprehending the graph structure of Bitcoin transactions (who paid whom) enables grouping addresses that are probably those of the same user in common input ownership heuristics and other tendencies. These clusters can be then associated with real world identities through addresses familiar to them such as exchange withdrawal address, publicly posted address on donations or addresses that are disclosed during purchase transaction. This deanonymization is even in the presence of pseudonymity since patterns and relationships of transactions provide a lot of information about user identities and user behaviors.</w:t>
       </w:r>
     </w:p>
     <w:p>
@@ -9387,36 +8330,7 @@
         </w:rPr>
       </w:pPr>
       <w:r>
-        <w:rPr>
-          <w:rFonts w:ascii="Times New Roman" w:cs="Times New Roman" w:eastAsia="Times New Roman" w:hAnsi="Times New Roman"/>
-          <w:b w:val="1"/>
-          <w:bCs w:val="1"/>
-          <w:i w:val="0"/>
-          <w:iCs w:val="0"/>
-          <w:smallCaps w:val="0"/>
-          <w:strike w:val="0"/>
-          <w:color w:val="000000"/>
-          <w:sz w:val="22"/>
-          <w:szCs w:val="22"/>
-          <w:u w:val="none"/>
-          <w:shd w:fill="auto" w:val="clear"/>
-          <w:vertAlign w:val="baseline"/>
-          <w:rtl w:val="0"/>
-        </w:rPr>
-        <w:t xml:space="preserve">Analysis:</w:t>
-      </w:r>
-      <w:r>
-        <w:rPr>
-          <w:sz w:val="22"/>
-          <w:szCs w:val="22"/>
-          <w:rtl w:val="0"/>
-        </w:rPr>
-        <w:t xml:space="preserve"> Privacy against non castral observers The right mixing with sufficient numbers and time delays provides adequate privacy. Zhang et al. analyzed the incentives-compatible mixing protocols that guarantee honesty within the participants. Mixing, however, contains some basic restrictions. Advanced attackers can use timing correlation (when money gets deposited and picked out of mixers), amount fingerprinting (different amounts of transaction) and repeated measurement as the basis of their probabilistic deanonymization of a transaction. The money might be stolen away or the transaction mappings could be stolen in case the mixers concocted are malicious, or the mixers themselves are spoiled. Scrutiny by the regulators restricts the use of mixing--in certain jurisdictions, it would be considered an offense to operate the mixing services, and users might be subjected to greater scrutiny of exchanges.</w:t>
-      </w:r>
-      <w:r>
-        <w:rPr>
-          <w:rtl w:val="0"/>
-        </w:rPr>
+        <w:t>Analysis: Privacy against non castral observers The right mixing with sufficient numbers and time delays provides adequate privacy. Zhang et al. [21] analyzed the incentives-compatible mixing protocols that guarantee honesty within the participants. Mixing, however, contains some basic restrictions. Advanced attackers can use timing correlation (when money gets deposited and picked out of mixers), amount fingerprinting (different amounts of transaction) and repeated measurement as the basis of their probabilistic deanonymization of a transaction. The money might be stolen away or the transaction mappings could be stolen in case the mixers concocted are malicious, or the mixers themselves are spoiled. Scrutiny by the regulators restricts the use of mixing--in certain jurisdictions, it would be considered an offense to operate the mixing services, and users might be subjected to greater scrutiny of exchanges.</w:t>
       </w:r>
     </w:p>
     <w:bookmarkStart w:colFirst="0" w:colLast="0" w:name="bookmark=id.z6b2xtk8pigc" w:id="19"/>
@@ -9616,55 +8530,7 @@
         </w:rPr>
       </w:pPr>
       <w:r>
-        <w:rPr>
-          <w:rFonts w:ascii="Times New Roman" w:cs="Times New Roman" w:eastAsia="Times New Roman" w:hAnsi="Times New Roman"/>
-          <w:b w:val="1"/>
-          <w:bCs w:val="1"/>
-          <w:i w:val="0"/>
-          <w:iCs w:val="0"/>
-          <w:smallCaps w:val="0"/>
-          <w:strike w:val="0"/>
-          <w:color w:val="000000"/>
-          <w:sz w:val="22"/>
-          <w:szCs w:val="22"/>
-          <w:u w:val="none"/>
-          <w:shd w:fill="auto" w:val="clear"/>
-          <w:vertAlign w:val="baseline"/>
-          <w:rtl w:val="0"/>
-        </w:rPr>
-        <w:t xml:space="preserve">Zerocash:</w:t>
-      </w:r>
-      <w:r>
-        <w:rPr>
-          <w:rFonts w:ascii="Times New Roman" w:cs="Times New Roman" w:eastAsia="Times New Roman" w:hAnsi="Times New Roman"/>
-          <w:b w:val="0"/>
-          <w:bCs w:val="0"/>
-          <w:i w:val="0"/>
-          <w:iCs w:val="0"/>
-          <w:smallCaps w:val="0"/>
-          <w:strike w:val="0"/>
-          <w:color w:val="000000"/>
-          <w:sz w:val="22"/>
-          <w:szCs w:val="22"/>
-          <w:u w:val="none"/>
-          <w:shd w:fill="auto" w:val="clear"/>
-          <w:vertAlign w:val="baseline"/>
-          <w:rtl w:val="0"/>
-        </w:rPr>
-        <w:t xml:space="preserve"> </w:t>
-      </w:r>
-      <w:r>
-        <w:rPr>
-          <w:sz w:val="22"/>
-          <w:szCs w:val="22"/>
-          <w:rtl w:val="0"/>
-        </w:rPr>
-        <w:t xml:space="preserve">ZKPs have a transformative capacity, which is exhibited by the Zerocash protocol by Ben-Sasson et al. Zerocash is unaware of the senders, receivers or the transaction amounts using zk-SNARKs ( Zero-Knowledge Succinct Non-Interactive Arguments of Knowledge ) but it enables networks to confirm whether or not the transactions are valid ( senders possess enough funds, amounts balance correctly, there is no double-spending). This will create Zcash cryptocurrency that offers users a choice between transparent and shielded transactions in which shielded transactions offer near unmatched privacy, even to the opponents that track all the blockchain data.</w:t>
-      </w:r>
-      <w:r>
-        <w:rPr>
-          <w:rtl w:val="0"/>
-        </w:rPr>
+        <w:t>Zerocash: ZKPs have a transformative capacity, which is exhibited by the Zerocash protocol by Ben-Sasson et al. [8]. Zerocash is unaware of the senders, receivers or the transaction amounts using zk-SNARKs ( Zero-Knowledge Succinct Non-Interactive Arguments of Knowledge ) but it enables networks to confirm whether or not the transactions are valid ( senders possess enough funds, amounts balance correctly, there is no double-spending). This will create Zcash cryptocurrency that offers users a choice between transparent and shielded transactions in which shielded transactions offer near unmatched privacy, even to the opponents that track all the blockchain data.</w:t>
       </w:r>
     </w:p>
     <w:p>
@@ -9797,69 +8663,7 @@
         </w:rPr>
       </w:pPr>
       <w:r>
-        <w:rPr>
-          <w:rFonts w:ascii="Times New Roman" w:cs="Times New Roman" w:eastAsia="Times New Roman" w:hAnsi="Times New Roman"/>
-          <w:b w:val="1"/>
-          <w:bCs w:val="1"/>
-          <w:i w:val="0"/>
-          <w:iCs w:val="0"/>
-          <w:smallCaps w:val="0"/>
-          <w:strike w:val="0"/>
-          <w:color w:val="000000"/>
-          <w:sz w:val="22"/>
-          <w:szCs w:val="22"/>
-          <w:u w:val="none"/>
-          <w:shd w:fill="auto" w:val="clear"/>
-          <w:vertAlign w:val="baseline"/>
-          <w:rtl w:val="0"/>
-        </w:rPr>
-        <w:t xml:space="preserve">Applications:</w:t>
-      </w:r>
-      <w:r>
-        <w:rPr>
-          <w:rFonts w:ascii="Times New Roman" w:cs="Times New Roman" w:eastAsia="Times New Roman" w:hAnsi="Times New Roman"/>
-          <w:b w:val="0"/>
-          <w:bCs w:val="0"/>
-          <w:i w:val="0"/>
-          <w:iCs w:val="0"/>
-          <w:smallCaps w:val="0"/>
-          <w:strike w:val="0"/>
-          <w:color w:val="000000"/>
-          <w:sz w:val="22"/>
-          <w:szCs w:val="22"/>
-          <w:u w:val="none"/>
-          <w:shd w:fill="auto" w:val="clear"/>
-          <w:vertAlign w:val="baseline"/>
-          <w:rtl w:val="0"/>
-        </w:rPr>
-        <w:t xml:space="preserve"> </w:t>
-      </w:r>
-      <w:r>
-        <w:rPr>
-          <w:sz w:val="22"/>
-          <w:szCs w:val="22"/>
-          <w:rtl w:val="0"/>
-        </w:rPr>
-        <w:t xml:space="preserve">In addition to cryptocurrencies, ZKPs can be used to help in privacy-preserving smart contracts such as where inputs, outputs and intermediate states are hidden and yet, it is possible to verify that the smart contract was executed correctly. ZKPs can facilitate regulatory adherence to financial regulations in which depository institutions can prove that they are holding reserves at thresholds required without revealing actual asset ownership</w:t>
-      </w:r>
-      <w:r>
-        <w:rPr>
-          <w:rFonts w:ascii="Times New Roman" w:cs="Times New Roman" w:eastAsia="Times New Roman" w:hAnsi="Times New Roman"/>
-          <w:b w:val="0"/>
-          <w:bCs w:val="0"/>
-          <w:i w:val="0"/>
-          <w:iCs w:val="0"/>
-          <w:smallCaps w:val="0"/>
-          <w:strike w:val="0"/>
-          <w:color w:val="000000"/>
-          <w:sz w:val="22"/>
-          <w:szCs w:val="22"/>
-          <w:u w:val="none"/>
-          <w:shd w:fill="auto" w:val="clear"/>
-          <w:vertAlign w:val="baseline"/>
-          <w:rtl w:val="0"/>
-        </w:rPr>
-        <w:t xml:space="preserve">(as explored by Boneh et al.). Identity systems can use ZKPs for selective disclosure—proving age without revealing birthdates, proving credentials without revealing identities.</w:t>
+        <w:t>Applications: In addition to cryptocurrencies, ZKPs can be used to help in privacy-preserving smart contracts such as where inputs, outputs and intermediate states are hidden and yet, it is possible to verify that the smart contract was executed correctly. ZKPs can facilitate regulatory adherence to financial regulations in which depository institutions can prove that they are holding reserves at thresholds required without revealing actual asset ownership(as explored by Boneh et al. [18]). Identity systems can use ZKPs for selective disclosure—proving age without revealing birthdates, proving credentials without revealing identities.</w:t>
       </w:r>
     </w:p>
     <w:bookmarkStart w:colFirst="0" w:colLast="0" w:name="bookmark=id.q4agwwtlrsha" w:id="20"/>
@@ -10107,17 +8911,7 @@
         </w:rPr>
       </w:pPr>
       <w:r>
-        <w:rPr>
-          <w:sz w:val="22"/>
-          <w:szCs w:val="22"/>
-          <w:rtl w:val="0"/>
-        </w:rPr>
-        <w:t xml:space="preserve">Most real-world systems keep sensitive data (off-chain) in the form of private database or distributed file systems but store cryptographic hash (on-chain). This sustains the integrity checking using blockchain but actual data remains hidden. Healthcare applications normally adopt this pattern in order to meet privacy regulation goals by taking advantage of audit capabilities presented by blockchain (Conti et al.). Advantages are privacy, performance and utilization of existing infrastructure. Disagreements such as off-chain availability dependencies and split architecture are limitations.</w:t>
-      </w:r>
-      <w:r>
-        <w:rPr>
-          <w:rtl w:val="0"/>
-        </w:rPr>
+        <w:t>Most real-world systems keep sensitive data (off-chain) in the form of private database or distributed file systems but store cryptographic hash (on-chain). This sustains the integrity checking using blockchain but actual data remains hidden. Healthcare applications normally adopt this pattern in order to meet privacy regulation goals by taking advantage of audit capabilities presented by blockchain (Conti et al. [16]). Advantages are privacy, performance and utilization of existing infrastructure. Disagreements such as off-chain availability dependencies and split architecture are limitations.</w:t>
       </w:r>
     </w:p>
     <w:bookmarkStart w:colFirst="0" w:colLast="0" w:name="bookmark=id.h608e0yw1pjo" w:id="22"/>
@@ -10411,42 +9205,7 @@
         </w:rPr>
       </w:pPr>
       <w:r>
-        <w:rPr>
-          <w:rFonts w:ascii="Times New Roman" w:cs="Times New Roman" w:eastAsia="Times New Roman" w:hAnsi="Times New Roman"/>
-          <w:b w:val="1"/>
-          <w:bCs w:val="1"/>
-          <w:i w:val="0"/>
-          <w:iCs w:val="0"/>
-          <w:smallCaps w:val="0"/>
-          <w:strike w:val="0"/>
-          <w:color w:val="000000"/>
-          <w:sz w:val="22"/>
-          <w:szCs w:val="22"/>
-          <w:u w:val="none"/>
-          <w:shd w:fill="auto" w:val="clear"/>
-          <w:vertAlign w:val="baseline"/>
-          <w:rtl w:val="0"/>
-        </w:rPr>
-        <w:t xml:space="preserve">Privacy Challenges:</w:t>
-      </w:r>
-      <w:r>
-        <w:rPr>
-          <w:rFonts w:ascii="Times New Roman" w:cs="Times New Roman" w:eastAsia="Times New Roman" w:hAnsi="Times New Roman"/>
-          <w:b w:val="0"/>
-          <w:bCs w:val="0"/>
-          <w:i w:val="0"/>
-          <w:iCs w:val="0"/>
-          <w:smallCaps w:val="0"/>
-          <w:strike w:val="0"/>
-          <w:color w:val="000000"/>
-          <w:sz w:val="22"/>
-          <w:szCs w:val="22"/>
-          <w:u w:val="none"/>
-          <w:shd w:fill="auto" w:val="clear"/>
-          <w:vertAlign w:val="baseline"/>
-          <w:rtl w:val="0"/>
-        </w:rPr>
-        <w:t xml:space="preserve"> Public visibility introduces significant privacy concerns, as all transaction data is permanently recorded and accessible to anyone. Users are identified by cryptographic addresses rather than real names; however, transaction graph analysis can reveal behavioral patterns and potentially link these addresses to real-world identities, as shown by Meiklejohn et al. To mitigate these risks, privacy must be achieved through additional mechanisms such as mixing services or zero-knowledge proofs, which increase system complexity and operational costs.</w:t>
+        <w:t>Privacy Challenges: Public visibility introduces significant privacy concerns, as all transaction data is permanently recorded and accessible to anyone. Users are identified by cryptographic addresses rather than real names; however, transaction graph analysis can reveal behavioral patterns and potentially link these addresses to real-world identities, as shown by Meiklejohn et al. [7]. To mitigate these risks, privacy must be achieved through additional mechanisms such as mixing services or zero-knowledge proofs, which increase system complexity and operational costs.</w:t>
       </w:r>
     </w:p>
     <w:p>
@@ -10483,82 +9242,7 @@
         </w:rPr>
       </w:pPr>
       <w:r>
-        <w:rPr>
-          <w:rFonts w:ascii="Times New Roman" w:cs="Times New Roman" w:eastAsia="Times New Roman" w:hAnsi="Times New Roman"/>
-          <w:b w:val="1"/>
-          <w:bCs w:val="1"/>
-          <w:i w:val="0"/>
-          <w:iCs w:val="0"/>
-          <w:smallCaps w:val="0"/>
-          <w:strike w:val="0"/>
-          <w:color w:val="000000"/>
-          <w:sz w:val="22"/>
-          <w:szCs w:val="22"/>
-          <w:u w:val="none"/>
-          <w:shd w:fill="auto" w:val="clear"/>
-          <w:vertAlign w:val="baseline"/>
-          <w:rtl w:val="0"/>
-        </w:rPr>
-        <w:t xml:space="preserve">Performance Limitations:</w:t>
-      </w:r>
-      <w:r>
-        <w:rPr>
-          <w:rFonts w:ascii="Times New Roman" w:cs="Times New Roman" w:eastAsia="Times New Roman" w:hAnsi="Times New Roman"/>
-          <w:b w:val="0"/>
-          <w:bCs w:val="0"/>
-          <w:i w:val="0"/>
-          <w:iCs w:val="0"/>
-          <w:smallCaps w:val="0"/>
-          <w:strike w:val="0"/>
-          <w:color w:val="000000"/>
-          <w:sz w:val="22"/>
-          <w:szCs w:val="22"/>
-          <w:u w:val="none"/>
-          <w:shd w:fill="auto" w:val="clear"/>
-          <w:vertAlign w:val="baseline"/>
-          <w:rtl w:val="0"/>
-        </w:rPr>
-        <w:t xml:space="preserve"> T</w:t>
-      </w:r>
-      <w:r>
-        <w:rPr>
-          <w:sz w:val="22"/>
-          <w:szCs w:val="22"/>
-          <w:rtl w:val="0"/>
-        </w:rPr>
-        <w:t xml:space="preserve">he process of reaching an agreement between thousands of mistrusted participants puts a constraint on throughput. Bitcoin can manage about 7 transactions per second; Ethereum (before sharding) is able to manage approximately 15-30 TPS.</w:t>
-      </w:r>
-      <w:r>
-        <w:rPr>
-          <w:rFonts w:ascii="Times New Roman" w:cs="Times New Roman" w:eastAsia="Times New Roman" w:hAnsi="Times New Roman"/>
-          <w:b w:val="0"/>
-          <w:bCs w:val="0"/>
-          <w:i w:val="0"/>
-          <w:iCs w:val="0"/>
-          <w:smallCaps w:val="0"/>
-          <w:strike w:val="0"/>
-          <w:color w:val="000000"/>
-          <w:sz w:val="22"/>
-          <w:szCs w:val="22"/>
-          <w:u w:val="none"/>
-          <w:shd w:fill="auto" w:val="clear"/>
-          <w:vertAlign w:val="baseline"/>
-          <w:rtl w:val="0"/>
-        </w:rPr>
-        <w:t xml:space="preserve"> </w:t>
-      </w:r>
-      <w:r>
-        <w:rPr>
-          <w:sz w:val="22"/>
-          <w:szCs w:val="22"/>
-          <w:rtl w:val="0"/>
-        </w:rPr>
-        <w:t xml:space="preserve">Such rates are much less as compared to conventional payment networks (Visa handles thousands of TPS) or databases. Rouhani and Deters compared the performance of Ethereum transactions processing and found that there are bottlenecks in validation, access to state, and the coordination of consensus.</w:t>
-      </w:r>
-      <w:r>
-        <w:rPr>
-          <w:rtl w:val="0"/>
-        </w:rPr>
+        <w:t>Performance Limitations: The process of reaching an agreement between thousands of mistrusted participants puts a constraint on throughput. Bitcoin can manage about 7 transactions per second; Ethereum (before sharding) is able to manage approximately 15-30 TPS. Such rates are much less as compared to conventional payment networks (Visa handles thousands of TPS) or databases. Rouhani and Deters [17] compared the performance of Ethereum transactions processing and found that there are bottlenecks in validation, access to state, and the coordination of consensus.</w:t>
       </w:r>
     </w:p>
     <w:p>
@@ -10738,55 +9422,7 @@
         </w:rPr>
       </w:pPr>
       <w:r>
-        <w:rPr>
-          <w:rFonts w:ascii="Times New Roman" w:cs="Times New Roman" w:eastAsia="Times New Roman" w:hAnsi="Times New Roman"/>
-          <w:b w:val="1"/>
-          <w:bCs w:val="1"/>
-          <w:i w:val="0"/>
-          <w:iCs w:val="0"/>
-          <w:smallCaps w:val="0"/>
-          <w:strike w:val="0"/>
-          <w:color w:val="000000"/>
-          <w:sz w:val="22"/>
-          <w:szCs w:val="22"/>
-          <w:u w:val="none"/>
-          <w:shd w:fill="auto" w:val="clear"/>
-          <w:vertAlign w:val="baseline"/>
-          <w:rtl w:val="0"/>
-        </w:rPr>
-        <w:t xml:space="preserve">Characteristics:</w:t>
-      </w:r>
-      <w:r>
-        <w:rPr>
-          <w:rFonts w:ascii="Times New Roman" w:cs="Times New Roman" w:eastAsia="Times New Roman" w:hAnsi="Times New Roman"/>
-          <w:b w:val="0"/>
-          <w:bCs w:val="0"/>
-          <w:i w:val="0"/>
-          <w:iCs w:val="0"/>
-          <w:smallCaps w:val="0"/>
-          <w:strike w:val="0"/>
-          <w:color w:val="000000"/>
-          <w:sz w:val="22"/>
-          <w:szCs w:val="22"/>
-          <w:u w:val="none"/>
-          <w:shd w:fill="auto" w:val="clear"/>
-          <w:vertAlign w:val="baseline"/>
-          <w:rtl w:val="0"/>
-        </w:rPr>
-        <w:t xml:space="preserve"> </w:t>
-      </w:r>
-      <w:r>
-        <w:rPr>
-          <w:sz w:val="22"/>
-          <w:szCs w:val="22"/>
-          <w:rtl w:val="0"/>
-        </w:rPr>
-        <w:t xml:space="preserve">Permissioned blockchains have the access restriction to identified, approved entities. The various organizations administer consortium blockchains; the individual blockchains are run by single organizations. These are Hyperledger Fabric (Androulaki et al.) and R3 Corda. Hashemi et al. compared several of the permissioned systems to be used in the enterprise.</w:t>
-      </w:r>
-      <w:r>
-        <w:rPr>
-          <w:rtl w:val="0"/>
-        </w:rPr>
+        <w:t>Characteristics: Permissioned blockchains have the access restriction to identified, approved entities. The various organizations administer consortium blockchains; the individual blockchains are run by single organizations. These are Hyperledger Fabric (Androulaki et al. [5]) and R3 Corda. Hashemi et al. [15] compared several of the permissioned systems to be used in the enterprise.</w:t>
       </w:r>
     </w:p>
     <w:p>
@@ -12768,163 +11404,7 @@
         </w:rPr>
       </w:pPr>
       <w:r>
-        <w:rPr>
-          <w:rFonts w:ascii="Times New Roman" w:cs="Times New Roman" w:eastAsia="Times New Roman" w:hAnsi="Times New Roman"/>
-          <w:b w:val="1"/>
-          <w:bCs w:val="1"/>
-          <w:i w:val="0"/>
-          <w:iCs w:val="0"/>
-          <w:smallCaps w:val="0"/>
-          <w:strike w:val="0"/>
-          <w:color w:val="000000"/>
-          <w:sz w:val="22"/>
-          <w:szCs w:val="22"/>
-          <w:u w:val="none"/>
-          <w:shd w:fill="auto" w:val="clear"/>
-          <w:vertAlign w:val="baseline"/>
-          <w:rtl w:val="0"/>
-        </w:rPr>
-        <w:t xml:space="preserve">Financial:</w:t>
-      </w:r>
-      <w:r>
-        <w:rPr>
-          <w:rFonts w:ascii="Times New Roman" w:cs="Times New Roman" w:eastAsia="Times New Roman" w:hAnsi="Times New Roman"/>
-          <w:b w:val="0"/>
-          <w:bCs w:val="0"/>
-          <w:i w:val="0"/>
-          <w:iCs w:val="0"/>
-          <w:smallCaps w:val="0"/>
-          <w:strike w:val="0"/>
-          <w:color w:val="000000"/>
-          <w:sz w:val="22"/>
-          <w:szCs w:val="22"/>
-          <w:u w:val="none"/>
-          <w:shd w:fill="auto" w:val="clear"/>
-          <w:vertAlign w:val="baseline"/>
-          <w:rtl w:val="0"/>
-        </w:rPr>
-        <w:t xml:space="preserve"> AML/KYC is </w:t>
-      </w:r>
-      <w:r>
-        <w:rPr>
-          <w:sz w:val="22"/>
-          <w:szCs w:val="22"/>
-          <w:rtl w:val="0"/>
-        </w:rPr>
-        <w:t xml:space="preserve">ineffective</w:t>
-      </w:r>
-      <w:r>
-        <w:rPr>
-          <w:rFonts w:ascii="Times New Roman" w:cs="Times New Roman" w:eastAsia="Times New Roman" w:hAnsi="Times New Roman"/>
-          <w:b w:val="0"/>
-          <w:bCs w:val="0"/>
-          <w:i w:val="0"/>
-          <w:iCs w:val="0"/>
-          <w:smallCaps w:val="0"/>
-          <w:strike w:val="0"/>
-          <w:color w:val="000000"/>
-          <w:sz w:val="22"/>
-          <w:szCs w:val="22"/>
-          <w:u w:val="none"/>
-          <w:shd w:fill="auto" w:val="clear"/>
-          <w:vertAlign w:val="baseline"/>
-          <w:rtl w:val="0"/>
-        </w:rPr>
-        <w:t xml:space="preserve"> in permissionless sys</w:t>
-      </w:r>
-      <w:r>
-        <w:rPr>
-          <w:sz w:val="22"/>
-          <w:szCs w:val="22"/>
-          <w:rtl w:val="0"/>
-        </w:rPr>
-        <w:t xml:space="preserve">tems</w:t>
-      </w:r>
-      <w:r>
-        <w:rPr>
-          <w:rFonts w:ascii="Times New Roman" w:cs="Times New Roman" w:eastAsia="Times New Roman" w:hAnsi="Times New Roman"/>
-          <w:b w:val="0"/>
-          <w:bCs w:val="0"/>
-          <w:i w:val="0"/>
-          <w:iCs w:val="0"/>
-          <w:smallCaps w:val="0"/>
-          <w:strike w:val="0"/>
-          <w:color w:val="000000"/>
-          <w:sz w:val="22"/>
-          <w:szCs w:val="22"/>
-          <w:u w:val="none"/>
-          <w:shd w:fill="auto" w:val="clear"/>
-          <w:vertAlign w:val="baseline"/>
-          <w:rtl w:val="0"/>
-        </w:rPr>
-        <w:t xml:space="preserve"> (Victor and Andelfinger made a </w:t>
-      </w:r>
-      <w:r>
-        <w:rPr>
-          <w:sz w:val="22"/>
-          <w:szCs w:val="22"/>
-          <w:rtl w:val="0"/>
-        </w:rPr>
-        <w:t xml:space="preserve">lot of progress </w:t>
-      </w:r>
-      <w:r>
-        <w:rPr>
-          <w:rFonts w:ascii="Times New Roman" w:cs="Times New Roman" w:eastAsia="Times New Roman" w:hAnsi="Times New Roman"/>
-          <w:b w:val="0"/>
-          <w:bCs w:val="0"/>
-          <w:i w:val="0"/>
-          <w:iCs w:val="0"/>
-          <w:smallCaps w:val="0"/>
-          <w:strike w:val="0"/>
-          <w:color w:val="000000"/>
-          <w:sz w:val="22"/>
-          <w:szCs w:val="22"/>
-          <w:u w:val="none"/>
-          <w:shd w:fill="auto" w:val="clear"/>
-          <w:vertAlign w:val="baseline"/>
-          <w:rtl w:val="0"/>
-        </w:rPr>
-        <w:t xml:space="preserve">on detection)</w:t>
-      </w:r>
-      <w:r>
-        <w:rPr>
-          <w:sz w:val="22"/>
-          <w:szCs w:val="22"/>
-          <w:rtl w:val="0"/>
-        </w:rPr>
-        <w:t xml:space="preserve"> but much easier in</w:t>
-      </w:r>
-      <w:r>
-        <w:rPr>
-          <w:rFonts w:ascii="Times New Roman" w:cs="Times New Roman" w:eastAsia="Times New Roman" w:hAnsi="Times New Roman"/>
-          <w:b w:val="0"/>
-          <w:bCs w:val="0"/>
-          <w:i w:val="0"/>
-          <w:iCs w:val="0"/>
-          <w:smallCaps w:val="0"/>
-          <w:strike w:val="0"/>
-          <w:color w:val="000000"/>
-          <w:sz w:val="22"/>
-          <w:szCs w:val="22"/>
-          <w:u w:val="none"/>
-          <w:shd w:fill="auto" w:val="clear"/>
-          <w:vertAlign w:val="baseline"/>
-          <w:rtl w:val="0"/>
-        </w:rPr>
-        <w:t xml:space="preserve"> permissioned syste</w:t>
-      </w:r>
-      <w:r>
-        <w:rPr>
-          <w:sz w:val="22"/>
-          <w:szCs w:val="22"/>
-          <w:rtl w:val="0"/>
-        </w:rPr>
-        <w:t xml:space="preserve">ms.</w:t>
-      </w:r>
-      <w:r>
-        <w:rPr>
-          <w:rtl w:val="0"/>
-        </w:rPr>
+        <w:t>Financial: AML/KYC is ineffective in permissionless systems (Victor and Andelfinger [23] made a lot of progress on detection) but much easier in permissioned systems.</w:t>
       </w:r>
     </w:p>
     <w:p>
@@ -13049,66 +11529,7 @@
         </w:rPr>
       </w:pPr>
       <w:r>
-        <w:rPr>
-          <w:rFonts w:ascii="Times New Roman" w:cs="Times New Roman" w:eastAsia="Times New Roman" w:hAnsi="Times New Roman"/>
-          <w:b w:val="1"/>
-          <w:bCs w:val="1"/>
-          <w:i w:val="0"/>
-          <w:iCs w:val="0"/>
-          <w:smallCaps w:val="0"/>
-          <w:strike w:val="0"/>
-          <w:color w:val="000000"/>
-          <w:sz w:val="22"/>
-          <w:szCs w:val="22"/>
-          <w:u w:val="none"/>
-          <w:shd w:fill="auto" w:val="clear"/>
-          <w:vertAlign w:val="baseline"/>
-          <w:rtl w:val="0"/>
-        </w:rPr>
-        <w:t xml:space="preserve">Healthcare:</w:t>
-      </w:r>
-      <w:r>
-        <w:rPr>
-          <w:rFonts w:ascii="Times New Roman" w:cs="Times New Roman" w:eastAsia="Times New Roman" w:hAnsi="Times New Roman"/>
-          <w:b w:val="0"/>
-          <w:bCs w:val="0"/>
-          <w:i w:val="0"/>
-          <w:iCs w:val="0"/>
-          <w:smallCaps w:val="0"/>
-          <w:strike w:val="0"/>
-          <w:color w:val="000000"/>
-          <w:sz w:val="22"/>
-          <w:szCs w:val="22"/>
-          <w:u w:val="none"/>
-          <w:shd w:fill="auto" w:val="clear"/>
-          <w:vertAlign w:val="baseline"/>
-          <w:rtl w:val="0"/>
-        </w:rPr>
-        <w:t xml:space="preserve"> </w:t>
-      </w:r>
-      <w:r>
-        <w:rPr>
-          <w:sz w:val="22"/>
-          <w:szCs w:val="22"/>
-          <w:rtl w:val="0"/>
-        </w:rPr>
-        <w:t xml:space="preserve">There is a strong tendency to employ strict access control, audit log, and encryption to HIPAA compliance (Conti et al. put that in there)</w:t>
-      </w:r>
-      <w:r>
-        <w:rPr>
-          <w:i w:val="0"/>
-          <w:iCs w:val="0"/>
-          <w:smallCaps w:val="0"/>
-          <w:strike w:val="0"/>
-          <w:color w:val="000000"/>
-          <w:sz w:val="22"/>
-          <w:szCs w:val="22"/>
-          <w:u w:val="none"/>
-          <w:shd w:fill="auto" w:val="clear"/>
-          <w:vertAlign w:val="baseline"/>
-          <w:rtl w:val="0"/>
-        </w:rPr>
-        <w:t xml:space="preserve"> (Conti et al.)</w:t>
+        <w:t>Healthcare: There is a strong tendency to employ strict access control, audit log, and encryption to HIPAA compliance (Conti et al. [16])</w:t>
       </w:r>
     </w:p>
     <w:p>
@@ -14698,55 +13119,7 @@
         </w:rPr>
       </w:pPr>
       <w:r>
-        <w:rPr>
-          <w:rFonts w:ascii="Times New Roman" w:cs="Times New Roman" w:eastAsia="Times New Roman" w:hAnsi="Times New Roman"/>
-          <w:b w:val="1"/>
-          <w:bCs w:val="1"/>
-          <w:i w:val="0"/>
-          <w:iCs w:val="0"/>
-          <w:smallCaps w:val="0"/>
-          <w:strike w:val="0"/>
-          <w:color w:val="000000"/>
-          <w:sz w:val="22"/>
-          <w:szCs w:val="22"/>
-          <w:u w:val="none"/>
-          <w:shd w:fill="auto" w:val="clear"/>
-          <w:vertAlign w:val="baseline"/>
-          <w:rtl w:val="0"/>
-        </w:rPr>
-        <w:t xml:space="preserve">MEV and Fairness:</w:t>
-      </w:r>
-      <w:r>
-        <w:rPr>
-          <w:rFonts w:ascii="Times New Roman" w:cs="Times New Roman" w:eastAsia="Times New Roman" w:hAnsi="Times New Roman"/>
-          <w:b w:val="0"/>
-          <w:bCs w:val="0"/>
-          <w:i w:val="0"/>
-          <w:iCs w:val="0"/>
-          <w:smallCaps w:val="0"/>
-          <w:strike w:val="0"/>
-          <w:color w:val="000000"/>
-          <w:sz w:val="22"/>
-          <w:szCs w:val="22"/>
-          <w:u w:val="none"/>
-          <w:shd w:fill="auto" w:val="clear"/>
-          <w:vertAlign w:val="baseline"/>
-          <w:rtl w:val="0"/>
-        </w:rPr>
-        <w:t xml:space="preserve"> </w:t>
-      </w:r>
-      <w:r>
-        <w:rPr>
-          <w:sz w:val="22"/>
-          <w:szCs w:val="22"/>
-          <w:rtl w:val="0"/>
-        </w:rPr>
-        <w:t xml:space="preserve">It ensures encrypted mempools and fair ordering everywhere to distribute MEV evenly, and have application-level defenses as suggested by Daian and co.</w:t>
-      </w:r>
-      <w:r>
-        <w:rPr>
-          <w:rtl w:val="0"/>
-        </w:rPr>
+        <w:t>MEV and Fairness: It ensures encrypted mempools and fair ordering everywhere to distribute MEV evenly, and have application-level defenses as suggested by Daian et al. [14].</w:t>
       </w:r>
     </w:p>
     <w:p>

</xml_diff>

<commit_message>
Revert "Add in-text citations to Full n Final Review document"
</commit_message>
<xml_diff>
--- a/FULL N FINAL Review BlockChain.docx
+++ b/FULL N FINAL Review BlockChain.docx
@@ -540,7 +540,23 @@
         </w:rPr>
       </w:pPr>
       <w:r>
-        <w:t>An entirely different concept is provided by blockchain technology, a cryptographically linked distributed ledger first introduced by Satoshi Nakamoto in 2008 with Bitcoin [1] and which is kept in common by several parties and does not need a central authority. This decentralized architecture will overcome numerous old IA problems through the removal of central points of failure, the availability of audit trails that are transparent and tamper evident, and the application of cryptographic methods to guarantee integrity and authenticity of data.</w:t>
+        <w:rPr>
+          <w:rFonts w:ascii="Times New Roman" w:cs="Times New Roman" w:eastAsia="Times New Roman" w:hAnsi="Times New Roman"/>
+          <w:b w:val="0"/>
+          <w:bCs w:val="0"/>
+          <w:i w:val="0"/>
+          <w:iCs w:val="0"/>
+          <w:smallCaps w:val="0"/>
+          <w:strike w:val="0"/>
+          <w:color w:val="000000"/>
+          <w:sz w:val="22"/>
+          <w:szCs w:val="22"/>
+          <w:u w:val="none"/>
+          <w:shd w:fill="auto" w:val="clear"/>
+          <w:vertAlign w:val="baseline"/>
+          <w:rtl w:val="0"/>
+        </w:rPr>
+        <w:t xml:space="preserve">An entirely different concept is provided by blockchain technology, a cryptographically linked distributed ledger first introduced by Satoshi Nakamoto in 2008 with Bitcoin and which is kept in common by several parties and does not need a central authority. This decentralized architecture will overcome numerous old IA problems through the removal of central points of failure, the availability of audit trails that are transparent and tamper evident, and the application of cryptographic methods to guarantee integrity and authenticity of data.</w:t>
       </w:r>
     </w:p>
     <w:p>
@@ -913,7 +929,109 @@
         </w:rPr>
       </w:pPr>
       <w:r>
-        <w:t>Basic Architecture: A blockchain is a distributed database which keeps an ever-expanding list of data known as blocks. Each block consists of a set of transactions, a timestamp, a cryptographic hash of the prior block, and a hash of that block, forming a chain, such that alteration of any block in history would involve recalculating of all the later blocks, which     have been made computationally infeasible in well-designed systems. In 2008, Nakamoto, as indicated by Bitcoin [1], demonstrated how a decentralized network could maintain a single journal without making use of a central authority through novel use of consensus systems.</w:t>
+        <w:rPr>
+          <w:rFonts w:ascii="Times New Roman" w:cs="Times New Roman" w:eastAsia="Times New Roman" w:hAnsi="Times New Roman"/>
+          <w:b w:val="1"/>
+          <w:bCs w:val="1"/>
+          <w:i w:val="0"/>
+          <w:iCs w:val="0"/>
+          <w:smallCaps w:val="0"/>
+          <w:strike w:val="0"/>
+          <w:color w:val="000000"/>
+          <w:sz w:val="22"/>
+          <w:szCs w:val="22"/>
+          <w:u w:val="none"/>
+          <w:shd w:fill="auto" w:val="clear"/>
+          <w:vertAlign w:val="baseline"/>
+          <w:rtl w:val="0"/>
+        </w:rPr>
+        <w:t xml:space="preserve">Basic Architecture:</w:t>
+      </w:r>
+      <w:r>
+        <w:rPr>
+          <w:rFonts w:ascii="Times New Roman" w:cs="Times New Roman" w:eastAsia="Times New Roman" w:hAnsi="Times New Roman"/>
+          <w:b w:val="0"/>
+          <w:bCs w:val="0"/>
+          <w:i w:val="0"/>
+          <w:iCs w:val="0"/>
+          <w:smallCaps w:val="0"/>
+          <w:strike w:val="0"/>
+          <w:color w:val="000000"/>
+          <w:sz w:val="22"/>
+          <w:szCs w:val="22"/>
+          <w:u w:val="none"/>
+          <w:shd w:fill="auto" w:val="clear"/>
+          <w:vertAlign w:val="baseline"/>
+          <w:rtl w:val="0"/>
+        </w:rPr>
+        <w:t xml:space="preserve"> A blockchain is a distributed database which keeps an ever-expanding list of data known as blocks. Each block </w:t>
+      </w:r>
+      <w:r>
+        <w:rPr>
+          <w:sz w:val="22"/>
+          <w:szCs w:val="22"/>
+          <w:rtl w:val="0"/>
+        </w:rPr>
+        <w:t xml:space="preserve">consists</w:t>
+      </w:r>
+      <w:r>
+        <w:rPr>
+          <w:rFonts w:ascii="Times New Roman" w:cs="Times New Roman" w:eastAsia="Times New Roman" w:hAnsi="Times New Roman"/>
+          <w:b w:val="0"/>
+          <w:bCs w:val="0"/>
+          <w:i w:val="0"/>
+          <w:iCs w:val="0"/>
+          <w:smallCaps w:val="0"/>
+          <w:strike w:val="0"/>
+          <w:color w:val="000000"/>
+          <w:sz w:val="22"/>
+          <w:szCs w:val="22"/>
+          <w:u w:val="none"/>
+          <w:shd w:fill="auto" w:val="clear"/>
+          <w:vertAlign w:val="baseline"/>
+          <w:rtl w:val="0"/>
+        </w:rPr>
+        <w:t xml:space="preserve"> of a set of transactions, a timestamp, a cryptographic hash of the prior block, and a hash of that block, forming a chain, such that alteration of any block in history would</w:t>
+      </w:r>
+      <w:r>
+        <w:rPr>
+          <w:sz w:val="22"/>
+          <w:szCs w:val="22"/>
+          <w:rtl w:val="0"/>
+        </w:rPr>
+        <w:t xml:space="preserve"> </w:t>
+      </w:r>
+      <w:r>
+        <w:rPr>
+          <w:rFonts w:ascii="Times New Roman" w:cs="Times New Roman" w:eastAsia="Times New Roman" w:hAnsi="Times New Roman"/>
+          <w:b w:val="0"/>
+          <w:bCs w:val="0"/>
+          <w:i w:val="0"/>
+          <w:iCs w:val="0"/>
+          <w:smallCaps w:val="0"/>
+          <w:strike w:val="0"/>
+          <w:color w:val="000000"/>
+          <w:sz w:val="22"/>
+          <w:szCs w:val="22"/>
+          <w:u w:val="none"/>
+          <w:shd w:fill="auto" w:val="clear"/>
+          <w:vertAlign w:val="baseline"/>
+          <w:rtl w:val="0"/>
+        </w:rPr>
+        <w:t xml:space="preserve">involve recalculating of all the later blocks, which     have been made computationally infeasible in well-designed systems. </w:t>
+      </w:r>
+      <w:r>
+        <w:rPr>
+          <w:sz w:val="22"/>
+          <w:szCs w:val="22"/>
+          <w:rtl w:val="0"/>
+        </w:rPr>
+        <w:t xml:space="preserve">In 2008, Nakamoto, as indicated by Bitcoin, demonstrated how a decentralized network could maintain a single journal without making use of a central authority through novel use of consensus systems.</w:t>
+      </w:r>
+      <w:r>
+        <w:rPr>
+          <w:rtl w:val="0"/>
+        </w:rPr>
       </w:r>
     </w:p>
     <w:p>
@@ -1019,7 +1137,95 @@
         </w:rPr>
       </w:pPr>
       <w:r>
-        <w:t>Proof of Work (PoW):  Bitcoin also uses PoW which was initially used by Ethereum where the participants (miners) have to solve computationally intensive puzzles in an attempt to propose new blocks. The challenge makes the rewriting of blockchain history very expensive. Nevertheless, PoW uses a lot of energy (Bitcoin uses more energy than small nations) and reduces the number of transactions. Bonneau et al. [6] present detailed discussion of PoW security features and attack combinations.</w:t>
+        <w:rPr>
+          <w:rFonts w:ascii="Times New Roman" w:cs="Times New Roman" w:eastAsia="Times New Roman" w:hAnsi="Times New Roman"/>
+          <w:b w:val="1"/>
+          <w:bCs w:val="1"/>
+          <w:i w:val="0"/>
+          <w:iCs w:val="0"/>
+          <w:smallCaps w:val="0"/>
+          <w:strike w:val="0"/>
+          <w:color w:val="000000"/>
+          <w:sz w:val="22"/>
+          <w:szCs w:val="22"/>
+          <w:u w:val="none"/>
+          <w:shd w:fill="auto" w:val="clear"/>
+          <w:vertAlign w:val="baseline"/>
+          <w:rtl w:val="0"/>
+        </w:rPr>
+        <w:t xml:space="preserve">Proof of Work (PoW): </w:t>
+      </w:r>
+      <w:r>
+        <w:rPr>
+          <w:b w:val="1"/>
+          <w:bCs w:val="1"/>
+          <w:sz w:val="22"/>
+          <w:szCs w:val="22"/>
+          <w:rtl w:val="0"/>
+        </w:rPr>
+        <w:t xml:space="preserve"> </w:t>
+      </w:r>
+      <w:r>
+        <w:rPr>
+          <w:sz w:val="22"/>
+          <w:szCs w:val="22"/>
+          <w:rtl w:val="0"/>
+        </w:rPr>
+        <w:t xml:space="preserve">Bitcoin also uses PoW which was initially used by Ethereum where the participants (miners) have to solve computationally intensive puzzles in an attempt to propose new blocks.</w:t>
+      </w:r>
+      <w:r>
+        <w:rPr>
+          <w:i w:val="1"/>
+          <w:iCs w:val="1"/>
+          <w:smallCaps w:val="0"/>
+          <w:strike w:val="0"/>
+          <w:color w:val="000000"/>
+          <w:sz w:val="22"/>
+          <w:szCs w:val="22"/>
+          <w:u w:val="none"/>
+          <w:shd w:fill="auto" w:val="clear"/>
+          <w:vertAlign w:val="baseline"/>
+          <w:rtl w:val="0"/>
+        </w:rPr>
+        <w:t xml:space="preserve"> </w:t>
+      </w:r>
+      <w:r>
+        <w:rPr>
+          <w:rFonts w:ascii="Times New Roman" w:cs="Times New Roman" w:eastAsia="Times New Roman" w:hAnsi="Times New Roman"/>
+          <w:b w:val="0"/>
+          <w:bCs w:val="0"/>
+          <w:i w:val="0"/>
+          <w:iCs w:val="0"/>
+          <w:smallCaps w:val="0"/>
+          <w:strike w:val="0"/>
+          <w:color w:val="000000"/>
+          <w:sz w:val="22"/>
+          <w:szCs w:val="22"/>
+          <w:u w:val="none"/>
+          <w:shd w:fill="auto" w:val="clear"/>
+          <w:vertAlign w:val="baseline"/>
+          <w:rtl w:val="0"/>
+        </w:rPr>
+        <w:t xml:space="preserve">The challenge makes the rewriting of blockchain history very expensive. Nevertheless, PoW uses a lot of energy (Bitcoin uses more energy than small nations) and reduces the number of transactions. Bonneau et al. present detailed discussion of PoW security features and attack combinations</w:t>
+      </w:r>
+      <w:r>
+        <w:rPr>
+          <w:rFonts w:ascii="Times New Roman" w:cs="Times New Roman" w:eastAsia="Times New Roman" w:hAnsi="Times New Roman"/>
+          <w:b w:val="0"/>
+          <w:bCs w:val="0"/>
+          <w:i w:val="1"/>
+          <w:iCs w:val="1"/>
+          <w:smallCaps w:val="0"/>
+          <w:strike w:val="0"/>
+          <w:color w:val="000000"/>
+          <w:sz w:val="22"/>
+          <w:szCs w:val="22"/>
+          <w:u w:val="none"/>
+          <w:shd w:fill="auto" w:val="clear"/>
+          <w:vertAlign w:val="baseline"/>
+          <w:rtl w:val="0"/>
+        </w:rPr>
+        <w:t xml:space="preserve">.</w:t>
       </w:r>
     </w:p>
     <w:p>
@@ -1111,7 +1317,69 @@
         </w:sectPr>
       </w:pPr>
       <w:r>
-        <w:t>Proof of Stake (PoS): PoS allows proposers of blocks to be chosen not by the amount of computational work they perform but by the amount of stake they hold (i.e. investment in cryptocurrency), which drastically lowers the amount of energy used, and security is ensured through economic incentives, since attackers would have to buy large stakes, which is economically unprofitable. The evolutional change to PoS in Ethereum is one of the significant ones. Gazi et al. [11] examine PoS security assurance and long distance attack countermeasures such as the checkpointing.</w:t>
+        <w:rPr>
+          <w:rFonts w:ascii="Times New Roman" w:cs="Times New Roman" w:eastAsia="Times New Roman" w:hAnsi="Times New Roman"/>
+          <w:b w:val="1"/>
+          <w:bCs w:val="1"/>
+          <w:i w:val="0"/>
+          <w:iCs w:val="0"/>
+          <w:smallCaps w:val="0"/>
+          <w:strike w:val="0"/>
+          <w:color w:val="000000"/>
+          <w:sz w:val="22"/>
+          <w:szCs w:val="22"/>
+          <w:u w:val="none"/>
+          <w:shd w:fill="auto" w:val="clear"/>
+          <w:vertAlign w:val="baseline"/>
+          <w:rtl w:val="0"/>
+        </w:rPr>
+        <w:t xml:space="preserve">Proof of Stake (PoS):</w:t>
+      </w:r>
+      <w:r>
+        <w:rPr>
+          <w:rFonts w:ascii="Times New Roman" w:cs="Times New Roman" w:eastAsia="Times New Roman" w:hAnsi="Times New Roman"/>
+          <w:b w:val="0"/>
+          <w:bCs w:val="0"/>
+          <w:i w:val="1"/>
+          <w:iCs w:val="1"/>
+          <w:smallCaps w:val="0"/>
+          <w:strike w:val="0"/>
+          <w:color w:val="000000"/>
+          <w:sz w:val="22"/>
+          <w:szCs w:val="22"/>
+          <w:u w:val="none"/>
+          <w:shd w:fill="auto" w:val="clear"/>
+          <w:vertAlign w:val="baseline"/>
+          <w:rtl w:val="0"/>
+        </w:rPr>
+        <w:t xml:space="preserve"> </w:t>
+      </w:r>
+      <w:r>
+        <w:rPr>
+          <w:rFonts w:ascii="Times New Roman" w:cs="Times New Roman" w:eastAsia="Times New Roman" w:hAnsi="Times New Roman"/>
+          <w:b w:val="0"/>
+          <w:bCs w:val="0"/>
+          <w:i w:val="0"/>
+          <w:iCs w:val="0"/>
+          <w:smallCaps w:val="0"/>
+          <w:strike w:val="0"/>
+          <w:color w:val="000000"/>
+          <w:sz w:val="22"/>
+          <w:szCs w:val="22"/>
+          <w:u w:val="none"/>
+          <w:shd w:fill="auto" w:val="clear"/>
+          <w:vertAlign w:val="baseline"/>
+          <w:rtl w:val="0"/>
+        </w:rPr>
+        <w:t xml:space="preserve">PoS allows proposers of blocks to be chosen not by the amount of computational work they perform but by the amount of stake they hold (i.e. investment in cryptocurrency), which drastically lowers the amount of energy used, and security is ensured through economic incentives, since </w:t>
+      </w:r>
+      <w:r>
+        <w:rPr>
+          <w:sz w:val="22"/>
+          <w:szCs w:val="22"/>
+          <w:rtl w:val="0"/>
+        </w:rPr>
+        <w:t xml:space="preserve">attackers would have to buy large stakes, which is economically unprofitable. The evolutional change to PoS in Ethereum is one of the significant ones. Gazi and others examine PoS security assurance and long distance attack countermeasures such as the checkpointing.</w:t>
       </w:r>
     </w:p>
     <w:p>
@@ -1148,7 +1416,42 @@
         </w:rPr>
       </w:pPr>
       <w:r>
-        <w:t>Byzantine Fault Tolerance (BFT): BFT-based consensus, such as Tendermint (Kwon and Buchman [10]) and Hyperledger Fabric (Androulaki et al. [5]), can provide finality and can support arbitrary failure of nodes, including malicious behavior if few more than a third of nodes are faulty. BFT systems are generally faster in finality and have greater throughput than PoW or PoS but need to know, comparatively fixed list of authorizers, which makes them more permissible to a permissioned setting.</w:t>
+        <w:rPr>
+          <w:rFonts w:ascii="Times New Roman" w:cs="Times New Roman" w:eastAsia="Times New Roman" w:hAnsi="Times New Roman"/>
+          <w:b w:val="1"/>
+          <w:bCs w:val="1"/>
+          <w:i w:val="0"/>
+          <w:iCs w:val="0"/>
+          <w:smallCaps w:val="0"/>
+          <w:strike w:val="0"/>
+          <w:color w:val="000000"/>
+          <w:sz w:val="22"/>
+          <w:szCs w:val="22"/>
+          <w:u w:val="none"/>
+          <w:shd w:fill="auto" w:val="clear"/>
+          <w:vertAlign w:val="baseline"/>
+          <w:rtl w:val="0"/>
+        </w:rPr>
+        <w:t xml:space="preserve">Byzantine Fault Tolerance (BFT):</w:t>
+      </w:r>
+      <w:r>
+        <w:rPr>
+          <w:rFonts w:ascii="Times New Roman" w:cs="Times New Roman" w:eastAsia="Times New Roman" w:hAnsi="Times New Roman"/>
+          <w:b w:val="0"/>
+          <w:bCs w:val="0"/>
+          <w:i w:val="0"/>
+          <w:iCs w:val="0"/>
+          <w:smallCaps w:val="0"/>
+          <w:strike w:val="0"/>
+          <w:color w:val="000000"/>
+          <w:sz w:val="22"/>
+          <w:szCs w:val="22"/>
+          <w:u w:val="none"/>
+          <w:shd w:fill="auto" w:val="clear"/>
+          <w:vertAlign w:val="baseline"/>
+          <w:rtl w:val="0"/>
+        </w:rPr>
+        <w:t xml:space="preserve"> BFT-based consensus, such as Tendermint (Kwon and Buchman) and Hyperledger Fabric (Androulaki et al.), can provide finality and can support arbitrary failure of nodes, including malicious behavior if few more than a third of nodes are faulty. BFT systems are generally faster in finality and have greater throughput than PoW or PoS but need to know, comparatively fixed list of authorizers, which makes them more permissible to a permissioned setting.</w:t>
       </w:r>
     </w:p>
     <w:p>
@@ -1185,7 +1488,74 @@
         </w:rPr>
       </w:pPr>
       <w:r>
-        <w:t>Smart Contracts:In 2014, Buterin [2] proposed and in 2016, Wood [3] described the Yellow Paper, which expanded the field of blockchain beyond simple value transfers to programmable transactions using smart contracts, or programs, which can run on the blockchain and execute themselves when specific conditions are satisfied. The smart contracts allow the issuance of complex business logic to be decentralized, such as financially using tokens to supply chain tracking. Nevertheless, smart contracts are posing serious security problems as thoroughly discussed by Atzei et al. [12] and Luu et al. [13]. Errors in contract code may cause significant financial loss - the 2016 DAO attack used a reentrancy vulnerability to drain about 60 million dollars. The vulnerabilities are frequently reentrancy (recursive calls prior to updating of state), arithmetic overflow/underflow, access control vulnerability, and oracle exploitation.</w:t>
+        <w:rPr>
+          <w:rFonts w:ascii="Times New Roman" w:cs="Times New Roman" w:eastAsia="Times New Roman" w:hAnsi="Times New Roman"/>
+          <w:b w:val="1"/>
+          <w:bCs w:val="1"/>
+          <w:i w:val="0"/>
+          <w:iCs w:val="0"/>
+          <w:smallCaps w:val="0"/>
+          <w:strike w:val="0"/>
+          <w:color w:val="000000"/>
+          <w:sz w:val="22"/>
+          <w:szCs w:val="22"/>
+          <w:u w:val="none"/>
+          <w:shd w:fill="auto" w:val="clear"/>
+          <w:vertAlign w:val="baseline"/>
+          <w:rtl w:val="0"/>
+        </w:rPr>
+        <w:t xml:space="preserve">Smart Contracts:</w:t>
+      </w:r>
+      <w:r>
+        <w:rPr>
+          <w:sz w:val="22"/>
+          <w:szCs w:val="22"/>
+          <w:rtl w:val="0"/>
+        </w:rPr>
+        <w:t xml:space="preserve">In 2014, Buterin proposed and in 2016, Wood described the Yellow Paper, which expanded the field of blockchain beyond simple value transfers to programmable transactions using smart contracts, or programs, which can run on the blockchain and execute themselves when specific conditions are satisfied. The smart contracts allow the issuance of complex business logic to be decentralized, such as financially using tokens to supply chain tracking. Nevertheless, smart contracts are posing serious security problems as thoroughly discussed by Atzei et al and Luu et al. Errors in contract code may cause significant financial loss - the 2016 DAO attack used a reentrancy vulnerability to drain about 60 million dollars. The vulnerabilities are frequently reentrancy (recursive calls prior to updating of state), arithmetic overflow/underflow, access control vulnerability, and oracle exploitation.</w:t>
+      </w:r>
+      <w:r>
+        <w:rPr>
+          <w:sz w:val="22"/>
+          <w:szCs w:val="22"/>
+        </w:rPr>
+        <w:drawing>
+          <wp:inline distB="114300" distT="114300" distL="114300" distR="114300">
+            <wp:extent cx="2930525" cy="1419225"/>
+            <wp:effectExtent b="0" l="0" r="0" t="0"/>
+            <wp:docPr id="16" name="image8.png"/>
+            <a:graphic>
+              <a:graphicData uri="http://schemas.openxmlformats.org/drawingml/2006/picture">
+                <pic:pic>
+                  <pic:nvPicPr>
+                    <pic:cNvPr id="0" name="image8.png"/>
+                    <pic:cNvPicPr preferRelativeResize="0"/>
+                  </pic:nvPicPr>
+                  <pic:blipFill>
+                    <a:blip r:embed="rId11"/>
+                    <a:srcRect b="0" l="0" r="0" t="0"/>
+                    <a:stretch>
+                      <a:fillRect/>
+                    </a:stretch>
+                  </pic:blipFill>
+                  <pic:spPr>
+                    <a:xfrm>
+                      <a:off x="0" y="0"/>
+                      <a:ext cx="2930525" cy="1419225"/>
+                    </a:xfrm>
+                    <a:prstGeom prst="rect"/>
+                    <a:ln/>
+                  </pic:spPr>
+                </pic:pic>
+              </a:graphicData>
+            </a:graphic>
+          </wp:inline>
+        </w:drawing>
+      </w:r>
+      <w:r>
+        <w:rPr>
+          <w:rtl w:val="0"/>
+        </w:rPr>
       </w:r>
     </w:p>
     <w:p>
@@ -1211,7 +1581,50 @@
         </w:rPr>
       </w:pPr>
       <w:r>
-        <w:t>Cryptographic Primitives: Blockchain applies cryptography as a significant aspect in terms of security. The use of public-key cryptography enables users to sign their messages with their private keys and be authenticated and non-repudiated by the other users with the help of their public keys. Cryptographic hash functions produce deterministic-sized digests or hash values of information that are dependent upon any changes made to their input and that can be used to indicate that they have been altered. The merkle trees allow a request of the presence of a transaction in the block without downloading a complete block. Outside of primitives, like zero-knowledge proofs, it is possible to have systems like Zerocash (Ben-Sasson et al. [8]) in which the user of an application can prove that they have enough money without revealing their balance.</w:t>
+        <w:rPr>
+          <w:rFonts w:ascii="Times New Roman" w:cs="Times New Roman" w:eastAsia="Times New Roman" w:hAnsi="Times New Roman"/>
+          <w:b w:val="1"/>
+          <w:bCs w:val="1"/>
+          <w:i w:val="0"/>
+          <w:iCs w:val="0"/>
+          <w:smallCaps w:val="0"/>
+          <w:strike w:val="0"/>
+          <w:color w:val="000000"/>
+          <w:sz w:val="22"/>
+          <w:szCs w:val="22"/>
+          <w:u w:val="none"/>
+          <w:shd w:fill="auto" w:val="clear"/>
+          <w:vertAlign w:val="baseline"/>
+          <w:rtl w:val="0"/>
+        </w:rPr>
+        <w:t xml:space="preserve">Cryptographic Primitives:</w:t>
+      </w:r>
+      <w:r>
+        <w:rPr>
+          <w:rFonts w:ascii="Times New Roman" w:cs="Times New Roman" w:eastAsia="Times New Roman" w:hAnsi="Times New Roman"/>
+          <w:b w:val="0"/>
+          <w:bCs w:val="0"/>
+          <w:i w:val="0"/>
+          <w:iCs w:val="0"/>
+          <w:smallCaps w:val="0"/>
+          <w:strike w:val="0"/>
+          <w:color w:val="000000"/>
+          <w:sz w:val="22"/>
+          <w:szCs w:val="22"/>
+          <w:u w:val="none"/>
+          <w:shd w:fill="auto" w:val="clear"/>
+          <w:vertAlign w:val="baseline"/>
+          <w:rtl w:val="0"/>
+        </w:rPr>
+        <w:t xml:space="preserve"> </w:t>
+      </w:r>
+      <w:r>
+        <w:rPr>
+          <w:sz w:val="22"/>
+          <w:szCs w:val="22"/>
+          <w:rtl w:val="0"/>
+        </w:rPr>
+        <w:t xml:space="preserve">Blockchain applies cryptography as a significant aspect in terms of security. The use of public-key cryptography enables users to sign their messages with their private keys and be authenticated and non-repudiated by the other users with the help of their public keys. Cryptographic hash functions produce deterministic-sized digests or hash values of information that are dependent upon any changes made to their input and that can be used to indicate that they have been altered. The merkle trees allow a request of the presence of a transaction in the block without downloading a complete block. Outside of primitives, like zero-knowledge proofs, it is possible to have systems like Zerocash (Ben-Sasson et al.) in which the user of an application can prove that they have enough money without revealing their balance.</w:t>
       </w:r>
     </w:p>
     <w:bookmarkStart w:colFirst="0" w:colLast="0" w:name="bookmark=id.c37ngynve07m" w:id="3"/>
@@ -1950,7 +2363,58 @@
         </w:rPr>
       </w:pPr>
       <w:r>
-        <w:t xml:space="preserve">Immutable Ledger Structure: Blockchain is fundamentally designed to enforce a tamper-evident record through cryptographically binding one block to the previous one, with hash functions. Any alterations to any historical transaction would alter the hash of that block, disconnecting it with the following block and necessitating the re-computation of all the following blocks. In a proof-of-work system such as Bitcoin, this recalculation must be performed by using colossal computational resources which increase exponentially with the block depth. Gervais et al. [22] examined the evidence of the security of a proof-of-work blockchain, and they have proved that it is exponentially harder to rewrite several blockchain blocks as time passes, which means that it is nearly impossible to tamper with history with established blockchains. </w:t>
+        <w:rPr>
+          <w:rFonts w:ascii="Times New Roman" w:cs="Times New Roman" w:eastAsia="Times New Roman" w:hAnsi="Times New Roman"/>
+          <w:b w:val="1"/>
+          <w:bCs w:val="1"/>
+          <w:i w:val="0"/>
+          <w:iCs w:val="0"/>
+          <w:smallCaps w:val="0"/>
+          <w:strike w:val="0"/>
+          <w:color w:val="000000"/>
+          <w:sz w:val="22"/>
+          <w:szCs w:val="22"/>
+          <w:u w:val="none"/>
+          <w:shd w:fill="auto" w:val="clear"/>
+          <w:vertAlign w:val="baseline"/>
+          <w:rtl w:val="0"/>
+        </w:rPr>
+        <w:t xml:space="preserve">Immutable Ledger Structure: </w:t>
+      </w:r>
+      <w:r>
+        <w:rPr>
+          <w:sz w:val="22"/>
+          <w:szCs w:val="22"/>
+          <w:rtl w:val="0"/>
+        </w:rPr>
+        <w:t xml:space="preserve">Blockchain is fundamentally designed to enforce a tamper-evident record through cryptographically binding one block to the previous one, with hash functions. Any alterations to any historical transaction would alter the hash of that block, disconnecting it with the following block and necessitating the re-computation of all the following blocks. In a proof-of-work system such as Bitcoin, this recalculation must be performed by using colossal computational resources which increase exponentially with the block depth. Gervais et al. examined the evidence of the security of a proof-of-work blockchain, and they have proved that it is exponentially harder to rewrite several blockchain blocks as time passes, which means that it is nearly impossible to tamper with history with established blockchains</w:t>
+      </w:r>
+      <w:r>
+        <w:rPr>
+          <w:rFonts w:ascii="Times New Roman" w:cs="Times New Roman" w:eastAsia="Times New Roman" w:hAnsi="Times New Roman"/>
+          <w:b w:val="0"/>
+          <w:bCs w:val="0"/>
+          <w:i w:val="0"/>
+          <w:iCs w:val="0"/>
+          <w:smallCaps w:val="0"/>
+          <w:strike w:val="0"/>
+          <w:color w:val="000000"/>
+          <w:sz w:val="22"/>
+          <w:szCs w:val="22"/>
+          <w:u w:val="none"/>
+          <w:shd w:fill="auto" w:val="clear"/>
+          <w:vertAlign w:val="baseline"/>
+          <w:rtl w:val="0"/>
+        </w:rPr>
+        <w:t xml:space="preserve">.</w:t>
+      </w:r>
+      <w:r>
+        <w:rPr>
+          <w:sz w:val="22"/>
+          <w:szCs w:val="22"/>
+          <w:rtl w:val="0"/>
+        </w:rPr>
+        <w:t xml:space="preserve"> </w:t>
       </w:r>
     </w:p>
     <w:p>
@@ -2199,9 +2663,86 @@
         </w:rPr>
       </w:pPr>
       <w:r>
-        <w:t>Probabilistic Integrity and Double-Spending Resistance:</w:t>
-        <w:br/>
-        <w:t xml:space="preserve"> The integrity guarantees of PoW blockchains are probabilistic rather than absolute. Nakamoto [1] formalized this property by modeling the competition between honest miners and an adversary attempting a double-spending attack as a stochastic process. Let q denote the fraction of total mining power controlled by an attacker and  the fraction controlled by honest miners. If a transaction is buried under z confirmations, the probability that an attacker can eventually catch up and reverse the transaction is given by:</w:t>
+        <w:rPr>
+          <w:b w:val="1"/>
+          <w:bCs w:val="1"/>
+          <w:sz w:val="22"/>
+          <w:szCs w:val="22"/>
+          <w:rtl w:val="0"/>
+        </w:rPr>
+        <w:t xml:space="preserve">Probabilistic Integrity and Double-Spending Resistance:</w:t>
+        <w:br w:type="textWrapping"/>
+      </w:r>
+      <w:r>
+        <w:rPr>
+          <w:sz w:val="22"/>
+          <w:szCs w:val="22"/>
+          <w:rtl w:val="0"/>
+        </w:rPr>
+        <w:t xml:space="preserve"> The integrity guarantees of PoW blockchains are probabilistic rather than absolute. Nakamoto formalized this property by modeling the competition between honest miners and an adversary attempting a double-spending attack as a stochastic process. Let </w:t>
+      </w:r>
+      <w:r>
+        <w:rPr>
+          <w:b w:val="1"/>
+          <w:bCs w:val="1"/>
+          <w:sz w:val="22"/>
+          <w:szCs w:val="22"/>
+          <w:rtl w:val="0"/>
+        </w:rPr>
+        <w:t xml:space="preserve">q</w:t>
+      </w:r>
+      <w:r>
+        <w:rPr>
+          <w:sz w:val="22"/>
+          <w:szCs w:val="22"/>
+          <w:rtl w:val="0"/>
+        </w:rPr>
+        <w:t xml:space="preserve"> denote the fraction of total mining power controlled by an attacker and </w:t>
+      </w:r>
+      <w:sdt>
+        <w:sdtPr>
+          <w:id w:val="-897233332"/>
+          <w:tag w:val="goog_rdk_2"/>
+        </w:sdtPr>
+        <w:sdtContent>
+          <w:r>
+            <w:rPr>
+              <w:rFonts w:ascii="Gungsuh" w:cs="Gungsuh" w:eastAsia="Gungsuh" w:hAnsi="Gungsuh"/>
+              <w:b w:val="1"/>
+              <w:bCs w:val="1"/>
+              <w:sz w:val="22"/>
+              <w:szCs w:val="22"/>
+              <w:rtl w:val="0"/>
+            </w:rPr>
+            <w:t xml:space="preserve">p=1−q</w:t>
+          </w:r>
+        </w:sdtContent>
+      </w:sdt>
+      <w:r>
+        <w:rPr>
+          <w:sz w:val="22"/>
+          <w:szCs w:val="22"/>
+          <w:rtl w:val="0"/>
+        </w:rPr>
+        <w:t xml:space="preserve"> the fraction controlled by honest miners. If a transaction is buried under </w:t>
+      </w:r>
+      <w:r>
+        <w:rPr>
+          <w:b w:val="1"/>
+          <w:bCs w:val="1"/>
+          <w:sz w:val="22"/>
+          <w:szCs w:val="22"/>
+          <w:rtl w:val="0"/>
+        </w:rPr>
+        <w:t xml:space="preserve">z</w:t>
+      </w:r>
+      <w:r>
+        <w:rPr>
+          <w:sz w:val="22"/>
+          <w:szCs w:val="22"/>
+          <w:rtl w:val="0"/>
+        </w:rPr>
+        <w:t xml:space="preserve"> confirmations, the probability that an attacker can eventually catch up and reverse the transaction is given by:</w:t>
       </w:r>
     </w:p>
     <w:p>
@@ -4503,7 +5044,31 @@
         </w:rPr>
       </w:pPr>
       <w:r>
-        <w:t>Off-Chain Storage with On-Chain Commitments: It is common in many practical systems to store sensitive data off-chain (in private databases, encrypted file systems, and even distributed storage such as IPFS) and record cryptographic commitments (hashes or Merkle roots) on-chain. The architecture preserves integrity checks using the tamper-evident characteristics of the blockchain and keeps real information confidential and permits conventional access control measures. This pattern is widely implemented by healthcare applications, as thoroughly surveyed by Conti et al. [16], as it is required to meet privacy laws such as HIPAA, but takes advantage of blockchain audit and tamper detection.</w:t>
+        <w:rPr>
+          <w:rFonts w:ascii="Times New Roman" w:cs="Times New Roman" w:eastAsia="Times New Roman" w:hAnsi="Times New Roman"/>
+          <w:b w:val="1"/>
+          <w:bCs w:val="1"/>
+          <w:i w:val="0"/>
+          <w:iCs w:val="0"/>
+          <w:smallCaps w:val="0"/>
+          <w:strike w:val="0"/>
+          <w:color w:val="000000"/>
+          <w:sz w:val="22"/>
+          <w:szCs w:val="22"/>
+          <w:u w:val="none"/>
+          <w:shd w:fill="auto" w:val="clear"/>
+          <w:vertAlign w:val="baseline"/>
+          <w:rtl w:val="0"/>
+        </w:rPr>
+        <w:t xml:space="preserve">Off-Chain Storage with On-Chain Commitments:</w:t>
+      </w:r>
+      <w:r>
+        <w:rPr>
+          <w:sz w:val="22"/>
+          <w:szCs w:val="22"/>
+          <w:rtl w:val="0"/>
+        </w:rPr>
+        <w:t xml:space="preserve"> It is common in many practical systems to store sensitive data off-chain (in private databases, encrypted file systems, and even distributed storage such as IPFS) and record cryptographic commitments (hashes or Merkle roots) on-chain. The architecture preserves integrity checks using the tamper-evident characteristics of the blockchain and keeps real information confidential and permits conventional access control measures. This pattern is widely implemented by healthcare applications, as thoroughly surveyed by Conti et al., as it is required to meet privacy laws such as HIPAA, but takes advantage of blockchain audit and tamper detection.</w:t>
       </w:r>
     </w:p>
     <w:p>
@@ -4868,7 +5433,55 @@
         </w:rPr>
       </w:pPr>
       <w:r>
-        <w:t>Mixing and Anonymization: Service providers that mix or tumble transactions of many users obscure the connections between the senders and the receivers by pooling money and re-distribing it with delays. Zhang et al. [21] examined incentive-compatible mixing schemes that guarantee honest behavior by the participants. Nevertheless, there are inherent technical analysis (virtuous scholars such as Meiklejohn et al. [7] have devised the complex de-anonymization heuristics that, although mixing, can be probabilistically linked), as well as regulating (mixing can facilitate money laundering and other crimes) problems with mixing.</w:t>
+        <w:rPr>
+          <w:rFonts w:ascii="Times New Roman" w:cs="Times New Roman" w:eastAsia="Times New Roman" w:hAnsi="Times New Roman"/>
+          <w:b w:val="1"/>
+          <w:bCs w:val="1"/>
+          <w:i w:val="0"/>
+          <w:iCs w:val="0"/>
+          <w:smallCaps w:val="0"/>
+          <w:strike w:val="0"/>
+          <w:color w:val="000000"/>
+          <w:sz w:val="22"/>
+          <w:szCs w:val="22"/>
+          <w:u w:val="none"/>
+          <w:shd w:fill="auto" w:val="clear"/>
+          <w:vertAlign w:val="baseline"/>
+          <w:rtl w:val="0"/>
+        </w:rPr>
+        <w:t xml:space="preserve">Mixing and Anonymization:</w:t>
+      </w:r>
+      <w:r>
+        <w:rPr>
+          <w:rFonts w:ascii="Times New Roman" w:cs="Times New Roman" w:eastAsia="Times New Roman" w:hAnsi="Times New Roman"/>
+          <w:b w:val="0"/>
+          <w:bCs w:val="0"/>
+          <w:i w:val="0"/>
+          <w:iCs w:val="0"/>
+          <w:smallCaps w:val="0"/>
+          <w:strike w:val="0"/>
+          <w:color w:val="000000"/>
+          <w:sz w:val="22"/>
+          <w:szCs w:val="22"/>
+          <w:u w:val="none"/>
+          <w:shd w:fill="auto" w:val="clear"/>
+          <w:vertAlign w:val="baseline"/>
+          <w:rtl w:val="0"/>
+        </w:rPr>
+        <w:t xml:space="preserve"> Service</w:t>
+      </w:r>
+      <w:r>
+        <w:rPr>
+          <w:sz w:val="22"/>
+          <w:szCs w:val="22"/>
+          <w:rtl w:val="0"/>
+        </w:rPr>
+        <w:t xml:space="preserve"> providers that mix or tumble transactions of many users obscure the connections between the senders and the receivers by pooling money and re-distribing it with delays. Zhang et al. examined incentive-compatible mixing schemes that guarantee honest behavior by the participants. Nevertheless, there are inherent technical analysis (virtuous scholars such as Meiklejohn et al. have devised the complex de-anonymization heuristics that, although mixing, can be probabilistically linked), as well as regulating (mixing can facilitate money laundering and other crimes) problems with mixing.</w:t>
+      </w:r>
+      <w:r>
+        <w:rPr>
+          <w:rtl w:val="0"/>
+        </w:rPr>
       </w:r>
     </w:p>
     <w:p>
@@ -4905,7 +5518,42 @@
         </w:rPr>
       </w:pPr>
       <w:r>
-        <w:t>Secure Multi-Party Computation: MPC protocols enable many parties to jointly arrive at computations on their own data without exposing that data to other parties or using trusted third parties. Almeida et al. [19] investigated the idea of using MPC together with blockchain to have privacy preserving smart contracts where contract logic is executed using encrypted or secret shared data. Practical implementation is however not feasible because it has high performance costs (orders of magnitude slower than plaintext calculation) and high communication complexity (many message rounds) and coordination problems (when the parties are unreliable or malicious).</w:t>
+        <w:rPr>
+          <w:rFonts w:ascii="Times New Roman" w:cs="Times New Roman" w:eastAsia="Times New Roman" w:hAnsi="Times New Roman"/>
+          <w:b w:val="1"/>
+          <w:bCs w:val="1"/>
+          <w:i w:val="0"/>
+          <w:iCs w:val="0"/>
+          <w:smallCaps w:val="0"/>
+          <w:strike w:val="0"/>
+          <w:color w:val="000000"/>
+          <w:sz w:val="22"/>
+          <w:szCs w:val="22"/>
+          <w:u w:val="none"/>
+          <w:shd w:fill="auto" w:val="clear"/>
+          <w:vertAlign w:val="baseline"/>
+          <w:rtl w:val="0"/>
+        </w:rPr>
+        <w:t xml:space="preserve">Secure Multi-Party Computation:</w:t>
+      </w:r>
+      <w:r>
+        <w:rPr>
+          <w:rFonts w:ascii="Times New Roman" w:cs="Times New Roman" w:eastAsia="Times New Roman" w:hAnsi="Times New Roman"/>
+          <w:b w:val="0"/>
+          <w:bCs w:val="0"/>
+          <w:i w:val="0"/>
+          <w:iCs w:val="0"/>
+          <w:smallCaps w:val="0"/>
+          <w:strike w:val="0"/>
+          <w:color w:val="000000"/>
+          <w:sz w:val="22"/>
+          <w:szCs w:val="22"/>
+          <w:u w:val="none"/>
+          <w:shd w:fill="auto" w:val="clear"/>
+          <w:vertAlign w:val="baseline"/>
+          <w:rtl w:val="0"/>
+        </w:rPr>
+        <w:t xml:space="preserve"> MPC protocols enable many parties to jointly arrive at computations on their own data without exposing that data to other parties or using trusted third parties. Almeida et al. investigated the idea of using MPC together with blockchain to have privacy preserving smart contracts where contract logic is executed using encrypted or secret shared data. Practical implementation is however not feasible because it has high performance costs (orders of magnitude slower than plaintext calculation) and high communication complexity (many message rounds) and coordination problems (when the parties are unreliable or malicious).</w:t>
       </w:r>
     </w:p>
     <w:p>
@@ -4942,7 +5590,50 @@
         </w:rPr>
       </w:pPr>
       <w:r>
-        <w:t>Trusted Execution Environments:MPC protocols enable many parties to jointly arrive at computations on their own data without exposing that data to other parties or using trusted third parties. Almeida et al. [19] investigated the idea of using MPC together with blockchain to have privacy preserving smart contracts where contract logic is executed using encrypted or secret shared data. Practical implementation is however not feasible because it has high performance costs (orders of magnitude slower than plaintext calculation) and high communication complexity (many message rounds) and coordination problems (when the parties are unreliable or malicious).</w:t>
+        <w:rPr>
+          <w:rFonts w:ascii="Times New Roman" w:cs="Times New Roman" w:eastAsia="Times New Roman" w:hAnsi="Times New Roman"/>
+          <w:b w:val="1"/>
+          <w:bCs w:val="1"/>
+          <w:i w:val="0"/>
+          <w:iCs w:val="0"/>
+          <w:smallCaps w:val="0"/>
+          <w:strike w:val="0"/>
+          <w:color w:val="000000"/>
+          <w:sz w:val="22"/>
+          <w:szCs w:val="22"/>
+          <w:u w:val="none"/>
+          <w:shd w:fill="auto" w:val="clear"/>
+          <w:vertAlign w:val="baseline"/>
+          <w:rtl w:val="0"/>
+        </w:rPr>
+        <w:t xml:space="preserve">Trusted Execution Environments:</w:t>
+      </w:r>
+      <w:r>
+        <w:rPr>
+          <w:sz w:val="22"/>
+          <w:szCs w:val="22"/>
+          <w:rtl w:val="0"/>
+        </w:rPr>
+        <w:t xml:space="preserve">MPC protocols enable many parties to jointly arrive at computations on their own data without exposing that data to other parties or using trusted third parties. Almeida et al. investigated the idea of using MPC together with blockchain to have privacy preserving smart contracts where contract logic is executed using encrypted or secret shared data. Practical implementation is however not feasible because it has high performance costs (orders of magnitude slower than plaintext calculation) and high communication complexity (many message rounds) and coordination problems (when the parties are unreliable or malicious)</w:t>
+      </w:r>
+      <w:r>
+        <w:rPr>
+          <w:rFonts w:ascii="Times New Roman" w:cs="Times New Roman" w:eastAsia="Times New Roman" w:hAnsi="Times New Roman"/>
+          <w:b w:val="0"/>
+          <w:bCs w:val="0"/>
+          <w:i w:val="0"/>
+          <w:iCs w:val="0"/>
+          <w:smallCaps w:val="0"/>
+          <w:strike w:val="0"/>
+          <w:color w:val="000000"/>
+          <w:sz w:val="22"/>
+          <w:szCs w:val="22"/>
+          <w:u w:val="none"/>
+          <w:shd w:fill="auto" w:val="clear"/>
+          <w:vertAlign w:val="baseline"/>
+          <w:rtl w:val="0"/>
+        </w:rPr>
+        <w:t xml:space="preserve">.</w:t>
       </w:r>
     </w:p>
     <w:bookmarkStart w:colFirst="0" w:colLast="0" w:name="bookmark=id.7yyq17en9h51" w:id="9"/>
@@ -5262,7 +5953,36 @@
         </w:rPr>
       </w:pPr>
       <w:r>
-        <w:t>Decentralized Identity: Ali et al. [24] have researched decentralized identities (DID) using Blockstack, and Hardjono and Smith [20] on decentralized public key infrastructure (DPKI) based on blockchains. These systems allow the user to manage their identity credentials, without having to use centralized identity providers such as governments or corporations. The models of self-sovereign identity enable users to administer their own credentials, share particular aspects of them selectively (such as demonstrating age without revealing date of birth), and recall credentials in case of an intrusion.</w:t>
+        <w:rPr>
+          <w:rFonts w:ascii="Times New Roman" w:cs="Times New Roman" w:eastAsia="Times New Roman" w:hAnsi="Times New Roman"/>
+          <w:b w:val="1"/>
+          <w:bCs w:val="1"/>
+          <w:i w:val="0"/>
+          <w:iCs w:val="0"/>
+          <w:smallCaps w:val="0"/>
+          <w:strike w:val="0"/>
+          <w:color w:val="000000"/>
+          <w:sz w:val="22"/>
+          <w:szCs w:val="22"/>
+          <w:u w:val="none"/>
+          <w:shd w:fill="auto" w:val="clear"/>
+          <w:vertAlign w:val="baseline"/>
+          <w:rtl w:val="0"/>
+        </w:rPr>
+        <w:t xml:space="preserve">Decentralized Identity: </w:t>
+      </w:r>
+      <w:r>
+        <w:rPr>
+          <w:sz w:val="22"/>
+          <w:szCs w:val="22"/>
+          <w:rtl w:val="0"/>
+        </w:rPr>
+        <w:t xml:space="preserve">Ali et al. have researched decentralized identities (DID) using Blockstack, and Hardjono and Smith on decentralized public key infrastructure (DPKI) based on blockchains. These systems allow the user to manage their identity credentials, without having to use centralized identity providers such as governments or corporations. The models of self-sovereign identity enable users to administer their own credentials, share particular aspects of them selectively (such as demonstrating age without revealing date of birth), and recall credentials in case of an intrusion.</w:t>
+      </w:r>
+      <w:r>
+        <w:rPr>
+          <w:rtl w:val="0"/>
+        </w:rPr>
       </w:r>
     </w:p>
     <w:p>
@@ -6165,7 +6885,42 @@
         </w:rPr>
       </w:pPr>
       <w:r>
-        <w:t>51% Attacks: In Proof of work systems, a network with greater than half the available hash power is vulnerable to attacks by the attacker because they can reject all other miners and use their coins to perform a double-spending attack (use the same coins twice). Where large public blockchains such as Bitcoin have huge hash rates where such attacks are costly economically (millions per hour attack cost), smaller cryptocurrencies have been compromised with 51% attacks costing millions of dollars. Gervais et al. [22] give a thorough examination of situations where such attacks are made possible and the cost thereof, such as network latency, and block propagation times.</w:t>
+        <w:rPr>
+          <w:rFonts w:ascii="Times New Roman" w:cs="Times New Roman" w:eastAsia="Times New Roman" w:hAnsi="Times New Roman"/>
+          <w:b w:val="1"/>
+          <w:bCs w:val="1"/>
+          <w:i w:val="0"/>
+          <w:iCs w:val="0"/>
+          <w:smallCaps w:val="0"/>
+          <w:strike w:val="0"/>
+          <w:color w:val="000000"/>
+          <w:sz w:val="22"/>
+          <w:szCs w:val="22"/>
+          <w:u w:val="none"/>
+          <w:shd w:fill="auto" w:val="clear"/>
+          <w:vertAlign w:val="baseline"/>
+          <w:rtl w:val="0"/>
+        </w:rPr>
+        <w:t xml:space="preserve">51% Attacks:</w:t>
+      </w:r>
+      <w:r>
+        <w:rPr>
+          <w:rFonts w:ascii="Times New Roman" w:cs="Times New Roman" w:eastAsia="Times New Roman" w:hAnsi="Times New Roman"/>
+          <w:b w:val="0"/>
+          <w:bCs w:val="0"/>
+          <w:i w:val="0"/>
+          <w:iCs w:val="0"/>
+          <w:smallCaps w:val="0"/>
+          <w:strike w:val="0"/>
+          <w:color w:val="000000"/>
+          <w:sz w:val="22"/>
+          <w:szCs w:val="22"/>
+          <w:u w:val="none"/>
+          <w:shd w:fill="auto" w:val="clear"/>
+          <w:vertAlign w:val="baseline"/>
+          <w:rtl w:val="0"/>
+        </w:rPr>
+        <w:t xml:space="preserve"> In Proof of work systems, a network with greater than half the available hash power is vulnerable to attacks by the attacker because they can reject all other miners and use their coins to perform a double-spending attack (use the same coins twice). Where large public blockchains such as Bitcoin have huge hash rates where such attacks are costly economically (millions per hour attack cost), smaller cryptocurrencies have been compromised with 51% attacks costing millions of dollars. Gervais et al. give a thorough examination of situations where such attacks are made possible and the cost thereof, such as network latency, and block propagation times.</w:t>
       </w:r>
     </w:p>
     <w:p>
@@ -6814,7 +7569,150 @@
         </w:rPr>
       </w:pPr>
       <w:r>
-        <w:t>Reentrancy Attacks: The notorious 2016 DAO attack was a reentrancy attack that used the reentrancy vulnerability in which a malicious contract can recursively call into the victim contract prior to the initial invocation making its state updates, effectively withdrawing funds on multiple occasions. The attack cost about 60 million and resulted in an Ethereum hard fork that was controversial. This weakness was caused by the fact that contracts updated their state after (not before) external calls (which is a violation of the checks-effects-interactions pattern). Atzei et al. [12] give a more detailed taxonomy of Ethereum smart contract attacks including reentrancy variants.</w:t>
+        <w:rPr>
+          <w:rFonts w:ascii="Times New Roman" w:cs="Times New Roman" w:eastAsia="Times New Roman" w:hAnsi="Times New Roman"/>
+          <w:b w:val="1"/>
+          <w:bCs w:val="1"/>
+          <w:i w:val="0"/>
+          <w:iCs w:val="0"/>
+          <w:smallCaps w:val="0"/>
+          <w:strike w:val="0"/>
+          <w:color w:val="000000"/>
+          <w:sz w:val="22"/>
+          <w:szCs w:val="22"/>
+          <w:u w:val="none"/>
+          <w:shd w:fill="auto" w:val="clear"/>
+          <w:vertAlign w:val="baseline"/>
+          <w:rtl w:val="0"/>
+        </w:rPr>
+        <w:t xml:space="preserve">Reentrancy Attacks:</w:t>
+      </w:r>
+      <w:r>
+        <w:rPr>
+          <w:rFonts w:ascii="Times New Roman" w:cs="Times New Roman" w:eastAsia="Times New Roman" w:hAnsi="Times New Roman"/>
+          <w:b w:val="0"/>
+          <w:bCs w:val="0"/>
+          <w:i w:val="0"/>
+          <w:iCs w:val="0"/>
+          <w:smallCaps w:val="0"/>
+          <w:strike w:val="0"/>
+          <w:color w:val="000000"/>
+          <w:sz w:val="22"/>
+          <w:szCs w:val="22"/>
+          <w:u w:val="none"/>
+          <w:shd w:fill="auto" w:val="clear"/>
+          <w:vertAlign w:val="baseline"/>
+          <w:rtl w:val="0"/>
+        </w:rPr>
+        <w:t xml:space="preserve"> The notorious 2016 DAO attack was a reentrancy attack that used the reentrancy vulnerability in which a malicious contract can recursively call into the victim contract prior to the initial invocation making its state updates, effectively withdrawing funds on multiple occasions. The attack cost about 60 million and </w:t>
+      </w:r>
+      <w:r>
+        <w:rPr>
+          <w:sz w:val="22"/>
+          <w:szCs w:val="22"/>
+          <w:rtl w:val="0"/>
+        </w:rPr>
+        <w:t xml:space="preserve">resulted</w:t>
+      </w:r>
+      <w:r>
+        <w:rPr>
+          <w:rFonts w:ascii="Times New Roman" w:cs="Times New Roman" w:eastAsia="Times New Roman" w:hAnsi="Times New Roman"/>
+          <w:b w:val="0"/>
+          <w:bCs w:val="0"/>
+          <w:i w:val="0"/>
+          <w:iCs w:val="0"/>
+          <w:smallCaps w:val="0"/>
+          <w:strike w:val="0"/>
+          <w:color w:val="000000"/>
+          <w:sz w:val="22"/>
+          <w:szCs w:val="22"/>
+          <w:u w:val="none"/>
+          <w:shd w:fill="auto" w:val="clear"/>
+          <w:vertAlign w:val="baseline"/>
+          <w:rtl w:val="0"/>
+        </w:rPr>
+        <w:t xml:space="preserve"> in an Ethereum hard fork that was controversial. This weakness was caused by the fact that contracts updated their state after (not before) external calls (which is a violation of the checks-effects-interactions pattern). Atzei et al. </w:t>
+      </w:r>
+      <w:r>
+        <w:rPr>
+          <w:sz w:val="22"/>
+          <w:szCs w:val="22"/>
+          <w:rtl w:val="0"/>
+        </w:rPr>
+        <w:t xml:space="preserve">give a more</w:t>
+      </w:r>
+      <w:r>
+        <w:rPr>
+          <w:rFonts w:ascii="Times New Roman" w:cs="Times New Roman" w:eastAsia="Times New Roman" w:hAnsi="Times New Roman"/>
+          <w:b w:val="0"/>
+          <w:bCs w:val="0"/>
+          <w:i w:val="0"/>
+          <w:iCs w:val="0"/>
+          <w:smallCaps w:val="0"/>
+          <w:strike w:val="0"/>
+          <w:color w:val="000000"/>
+          <w:sz w:val="22"/>
+          <w:szCs w:val="22"/>
+          <w:u w:val="none"/>
+          <w:shd w:fill="auto" w:val="clear"/>
+          <w:vertAlign w:val="baseline"/>
+          <w:rtl w:val="0"/>
+        </w:rPr>
+        <w:t xml:space="preserve"> detailed taxonomy of Ethereum smart contract attacks including reentrancy variants.</w:t>
+      </w:r>
+      <w:r>
+        <w:rPr>
+          <w:rFonts w:ascii="Times New Roman" w:cs="Times New Roman" w:eastAsia="Times New Roman" w:hAnsi="Times New Roman"/>
+          <w:b w:val="0"/>
+          <w:bCs w:val="0"/>
+          <w:i w:val="0"/>
+          <w:iCs w:val="0"/>
+          <w:smallCaps w:val="0"/>
+          <w:strike w:val="0"/>
+          <w:color w:val="000000"/>
+          <w:sz w:val="22"/>
+          <w:szCs w:val="22"/>
+          <w:u w:val="none"/>
+          <w:shd w:fill="auto" w:val="clear"/>
+          <w:vertAlign w:val="baseline"/>
+        </w:rPr>
+        <w:drawing>
+          <wp:inline distB="114300" distT="114300" distL="114300" distR="114300">
+            <wp:extent cx="3086100" cy="2044700"/>
+            <wp:effectExtent b="0" l="0" r="0" t="0"/>
+            <wp:docPr id="1" name="image7.png"/>
+            <a:graphic>
+              <a:graphicData uri="http://schemas.openxmlformats.org/drawingml/2006/picture">
+                <pic:pic>
+                  <pic:nvPicPr>
+                    <pic:cNvPr id="0" name="image7.png"/>
+                    <pic:cNvPicPr preferRelativeResize="0"/>
+                  </pic:nvPicPr>
+                  <pic:blipFill>
+                    <a:blip r:embed="rId26"/>
+                    <a:srcRect b="0" l="0" r="0" t="0"/>
+                    <a:stretch>
+                      <a:fillRect/>
+                    </a:stretch>
+                  </pic:blipFill>
+                  <pic:spPr>
+                    <a:xfrm>
+                      <a:off x="0" y="0"/>
+                      <a:ext cx="3086100" cy="2044700"/>
+                    </a:xfrm>
+                    <a:prstGeom prst="rect"/>
+                    <a:ln/>
+                  </pic:spPr>
+                </pic:pic>
+              </a:graphicData>
+            </a:graphic>
+          </wp:inline>
+        </w:drawing>
+      </w:r>
+      <w:r>
+        <w:rPr>
+          <w:rtl w:val="0"/>
+        </w:rPr>
       </w:r>
     </w:p>
     <w:p>
@@ -6995,7 +7893,42 @@
         </w:rPr>
       </w:pPr>
       <w:r>
-        <w:t>Oracle Manipulation: Smart contracts frequently require external information sources (oracles) which supply real-world information, such as asset prices, weather, or sport scores. There are attackers who are capable of manipulation of the oracle data which may lead to wrong decisions made by contracts. Manipulation of price oracles Attacks on decentralized finance platforms that use flash loans have been used to exploit manipulation of market prices and oracle updates based on manipulated prices to make a profit on contracts at stale prices and repay the loan in a single atomic transaction. Daian et al. [14] evaluated maximum extractable value (MEV) that indicates how validators can get profits by strategizing the order of transactions.</w:t>
+        <w:rPr>
+          <w:rFonts w:ascii="Times New Roman" w:cs="Times New Roman" w:eastAsia="Times New Roman" w:hAnsi="Times New Roman"/>
+          <w:b w:val="1"/>
+          <w:bCs w:val="1"/>
+          <w:i w:val="0"/>
+          <w:iCs w:val="0"/>
+          <w:smallCaps w:val="0"/>
+          <w:strike w:val="0"/>
+          <w:color w:val="000000"/>
+          <w:sz w:val="22"/>
+          <w:szCs w:val="22"/>
+          <w:u w:val="none"/>
+          <w:shd w:fill="auto" w:val="clear"/>
+          <w:vertAlign w:val="baseline"/>
+          <w:rtl w:val="0"/>
+        </w:rPr>
+        <w:t xml:space="preserve">Oracle Manipulation:</w:t>
+      </w:r>
+      <w:r>
+        <w:rPr>
+          <w:rFonts w:ascii="Times New Roman" w:cs="Times New Roman" w:eastAsia="Times New Roman" w:hAnsi="Times New Roman"/>
+          <w:b w:val="0"/>
+          <w:bCs w:val="0"/>
+          <w:i w:val="0"/>
+          <w:iCs w:val="0"/>
+          <w:smallCaps w:val="0"/>
+          <w:strike w:val="0"/>
+          <w:color w:val="000000"/>
+          <w:sz w:val="22"/>
+          <w:szCs w:val="22"/>
+          <w:u w:val="none"/>
+          <w:shd w:fill="auto" w:val="clear"/>
+          <w:vertAlign w:val="baseline"/>
+          <w:rtl w:val="0"/>
+        </w:rPr>
+        <w:t xml:space="preserve"> Smart contracts frequently require external information sources (oracles) which supply real-world information, such as asset prices, weather, or sport scores. There are attackers who are capable of manipulation of the oracle data which may lead to wrong decisions made by contracts. Manipulation of price oracles Attacks on decentralized finance platforms that use flash loans have been used to exploit manipulation of market prices and oracle updates based on manipulated prices to make a profit on contracts at stale prices and repay the loan in a single atomic transaction. Daian et al. evaluated maximum extractable value (MEV) that indicates how validators can get profits by strategizing the order of transactions.</w:t>
       </w:r>
     </w:p>
     <w:p>
@@ -7098,7 +8031,42 @@
         </w:rPr>
       </w:pPr>
       <w:r>
-        <w:t>Defenses: To mitigate the vulnerability of smart contracts, there is a need to take multifaceted strategies. The secure development lifecycle practices are threat modelling in design, security oriented design patterns (checks-effects-interactions to prevent reentrancy, pull-over-push to distribute payments) and compliance with accepted standards and best practices. Such automatic analysis tools as Oyente (created by Luu et al. [13]) find known vulnerabilities using symbolic execution and data flow analysis, but they are not able to identify every problem. Ad hoc professional security audits by expert auditors uncover latent weaknesses unnoticed by automated tools by conducting a manual review of source code and through trying to reason as an attacker. Formal verification Formal verification mathematically establishes that contracts meet security properties, which offers maximum confidence, but it is nevertheless costly and can only be accomplished by expert knowledge. Bug bounty programs encourage independent security researchers to discover and report vulnerabilities in a responsible manner before the vulnerabilities are exploited maliciously. With runtime monitoring and circuit breakers, the damage can be restricted in case the vulnerabilities are used in spite of the preventive measures employed by permitting the emergency suspension of the vulnerable contracts.</w:t>
+        <w:rPr>
+          <w:rFonts w:ascii="Times New Roman" w:cs="Times New Roman" w:eastAsia="Times New Roman" w:hAnsi="Times New Roman"/>
+          <w:b w:val="1"/>
+          <w:bCs w:val="1"/>
+          <w:i w:val="0"/>
+          <w:iCs w:val="0"/>
+          <w:smallCaps w:val="0"/>
+          <w:strike w:val="0"/>
+          <w:color w:val="000000"/>
+          <w:sz w:val="22"/>
+          <w:szCs w:val="22"/>
+          <w:u w:val="none"/>
+          <w:shd w:fill="auto" w:val="clear"/>
+          <w:vertAlign w:val="baseline"/>
+          <w:rtl w:val="0"/>
+        </w:rPr>
+        <w:t xml:space="preserve">Defenses:</w:t>
+      </w:r>
+      <w:r>
+        <w:rPr>
+          <w:rFonts w:ascii="Times New Roman" w:cs="Times New Roman" w:eastAsia="Times New Roman" w:hAnsi="Times New Roman"/>
+          <w:b w:val="0"/>
+          <w:bCs w:val="0"/>
+          <w:i w:val="0"/>
+          <w:iCs w:val="0"/>
+          <w:smallCaps w:val="0"/>
+          <w:strike w:val="0"/>
+          <w:color w:val="000000"/>
+          <w:sz w:val="22"/>
+          <w:szCs w:val="22"/>
+          <w:u w:val="none"/>
+          <w:shd w:fill="auto" w:val="clear"/>
+          <w:vertAlign w:val="baseline"/>
+          <w:rtl w:val="0"/>
+        </w:rPr>
+        <w:t xml:space="preserve"> To mitigate the vulnerability of smart contracts, there is a need to take multifaceted strategies. The secure development lifecycle practices are threat modelling in design, security oriented design patterns (checks-effects-interactions to prevent reentrancy, pull-over-push to distribute payments) and compliance with accepted standards and best practices. Such automatic analysis tools as Oyente (created by Luu et al.) find known vulnerabilities using symbolic execution and data flow analysis, but they are not able to identify every problem. Ad hoc professional security audits by expert auditors uncover latent weaknesses unnoticed by automated tools by conducting a manual review of source code and through trying to reason as an attacker. Formal verification Formal verification mathematically establishes that contracts meet security properties, which offers maximum confidence, but it is nevertheless costly and can only be accomplished by expert knowledge. Bug bounty programs encourage independent security researchers to discover and report vulnerabilities in a responsible manner before the vulnerabilities are exploited maliciously. With runtime monitoring and circuit breakers, the damage can be restricted in case the vulnerabilities are used in spite of the preventive measures employed by permitting the emergency suspension of the vulnerable contracts.</w:t>
       </w:r>
     </w:p>
     <w:bookmarkStart w:colFirst="0" w:colLast="0" w:name="bookmark=id.31q6b4z4apgq" w:id="14"/>
@@ -7916,7 +8884,96 @@
         </w:rPr>
       </w:pPr>
       <w:r>
-        <w:t>Transaction Graph Analysis: Meiklejohn et al. [7] showed that comprehending the graph structure of Bitcoin transactions (who paid whom) enables grouping addresses that are probably those of the same user in common input ownership heuristics and other tendencies. These clusters can be then associated with real world identities through addresses familiar to them such as exchange withdrawal address, publicly posted address on donations or addresses that are disclosed during purchase transaction. This deanonymization is even in the presence of pseudonymity since patterns and relationships of transactions provide a lot of information about user identities and user behaviors.</w:t>
+        <w:rPr>
+          <w:rFonts w:ascii="Times New Roman" w:cs="Times New Roman" w:eastAsia="Times New Roman" w:hAnsi="Times New Roman"/>
+          <w:b w:val="1"/>
+          <w:bCs w:val="1"/>
+          <w:i w:val="0"/>
+          <w:iCs w:val="0"/>
+          <w:smallCaps w:val="0"/>
+          <w:strike w:val="0"/>
+          <w:color w:val="000000"/>
+          <w:sz w:val="22"/>
+          <w:szCs w:val="22"/>
+          <w:u w:val="none"/>
+          <w:shd w:fill="auto" w:val="clear"/>
+          <w:vertAlign w:val="baseline"/>
+          <w:rtl w:val="0"/>
+        </w:rPr>
+        <w:t xml:space="preserve">Transaction Graph Analysis:</w:t>
+      </w:r>
+      <w:r>
+        <w:rPr>
+          <w:rFonts w:ascii="Times New Roman" w:cs="Times New Roman" w:eastAsia="Times New Roman" w:hAnsi="Times New Roman"/>
+          <w:b w:val="0"/>
+          <w:bCs w:val="0"/>
+          <w:i w:val="0"/>
+          <w:iCs w:val="0"/>
+          <w:smallCaps w:val="0"/>
+          <w:strike w:val="0"/>
+          <w:color w:val="000000"/>
+          <w:sz w:val="22"/>
+          <w:szCs w:val="22"/>
+          <w:u w:val="none"/>
+          <w:shd w:fill="auto" w:val="clear"/>
+          <w:vertAlign w:val="baseline"/>
+          <w:rtl w:val="0"/>
+        </w:rPr>
+        <w:t xml:space="preserve"> Meiklejohn et al. showed </w:t>
+      </w:r>
+      <w:r>
+        <w:rPr>
+          <w:sz w:val="22"/>
+          <w:szCs w:val="22"/>
+          <w:rtl w:val="0"/>
+        </w:rPr>
+        <w:t xml:space="preserve">that comprehending</w:t>
+      </w:r>
+      <w:r>
+        <w:rPr>
+          <w:rFonts w:ascii="Times New Roman" w:cs="Times New Roman" w:eastAsia="Times New Roman" w:hAnsi="Times New Roman"/>
+          <w:b w:val="0"/>
+          <w:bCs w:val="0"/>
+          <w:i w:val="0"/>
+          <w:iCs w:val="0"/>
+          <w:smallCaps w:val="0"/>
+          <w:strike w:val="0"/>
+          <w:color w:val="000000"/>
+          <w:sz w:val="22"/>
+          <w:szCs w:val="22"/>
+          <w:u w:val="none"/>
+          <w:shd w:fill="auto" w:val="clear"/>
+          <w:vertAlign w:val="baseline"/>
+          <w:rtl w:val="0"/>
+        </w:rPr>
+        <w:t xml:space="preserve"> the graph structure of Bitcoin transactions (who paid whom) enables grouping addresses that are probably those of the same user in common input ownership heuristics and other tendencies. </w:t>
+      </w:r>
+      <w:r>
+        <w:rPr>
+          <w:sz w:val="22"/>
+          <w:szCs w:val="22"/>
+          <w:rtl w:val="0"/>
+        </w:rPr>
+        <w:t xml:space="preserve">These clusters can be then associated with real world identities through addresses familiar to them such as exchange withdrawal address, publicly posted address on donations or addresses that are disclosed during purchase transaction.</w:t>
+      </w:r>
+      <w:r>
+        <w:rPr>
+          <w:rFonts w:ascii="Times New Roman" w:cs="Times New Roman" w:eastAsia="Times New Roman" w:hAnsi="Times New Roman"/>
+          <w:b w:val="0"/>
+          <w:bCs w:val="0"/>
+          <w:i w:val="0"/>
+          <w:iCs w:val="0"/>
+          <w:smallCaps w:val="0"/>
+          <w:strike w:val="0"/>
+          <w:color w:val="000000"/>
+          <w:sz w:val="22"/>
+          <w:szCs w:val="22"/>
+          <w:u w:val="none"/>
+          <w:shd w:fill="auto" w:val="clear"/>
+          <w:vertAlign w:val="baseline"/>
+          <w:rtl w:val="0"/>
+        </w:rPr>
+        <w:t xml:space="preserve"> This deanonymization is even in the presence of pseudonymity since patterns and relationships of transactions provide a lot of information about user identities and user behaviors.</w:t>
       </w:r>
     </w:p>
     <w:p>
@@ -8330,7 +9387,36 @@
         </w:rPr>
       </w:pPr>
       <w:r>
-        <w:t>Analysis: Privacy against non castral observers The right mixing with sufficient numbers and time delays provides adequate privacy. Zhang et al. [21] analyzed the incentives-compatible mixing protocols that guarantee honesty within the participants. Mixing, however, contains some basic restrictions. Advanced attackers can use timing correlation (when money gets deposited and picked out of mixers), amount fingerprinting (different amounts of transaction) and repeated measurement as the basis of their probabilistic deanonymization of a transaction. The money might be stolen away or the transaction mappings could be stolen in case the mixers concocted are malicious, or the mixers themselves are spoiled. Scrutiny by the regulators restricts the use of mixing--in certain jurisdictions, it would be considered an offense to operate the mixing services, and users might be subjected to greater scrutiny of exchanges.</w:t>
+        <w:rPr>
+          <w:rFonts w:ascii="Times New Roman" w:cs="Times New Roman" w:eastAsia="Times New Roman" w:hAnsi="Times New Roman"/>
+          <w:b w:val="1"/>
+          <w:bCs w:val="1"/>
+          <w:i w:val="0"/>
+          <w:iCs w:val="0"/>
+          <w:smallCaps w:val="0"/>
+          <w:strike w:val="0"/>
+          <w:color w:val="000000"/>
+          <w:sz w:val="22"/>
+          <w:szCs w:val="22"/>
+          <w:u w:val="none"/>
+          <w:shd w:fill="auto" w:val="clear"/>
+          <w:vertAlign w:val="baseline"/>
+          <w:rtl w:val="0"/>
+        </w:rPr>
+        <w:t xml:space="preserve">Analysis:</w:t>
+      </w:r>
+      <w:r>
+        <w:rPr>
+          <w:sz w:val="22"/>
+          <w:szCs w:val="22"/>
+          <w:rtl w:val="0"/>
+        </w:rPr>
+        <w:t xml:space="preserve"> Privacy against non castral observers The right mixing with sufficient numbers and time delays provides adequate privacy. Zhang et al. analyzed the incentives-compatible mixing protocols that guarantee honesty within the participants. Mixing, however, contains some basic restrictions. Advanced attackers can use timing correlation (when money gets deposited and picked out of mixers), amount fingerprinting (different amounts of transaction) and repeated measurement as the basis of their probabilistic deanonymization of a transaction. The money might be stolen away or the transaction mappings could be stolen in case the mixers concocted are malicious, or the mixers themselves are spoiled. Scrutiny by the regulators restricts the use of mixing--in certain jurisdictions, it would be considered an offense to operate the mixing services, and users might be subjected to greater scrutiny of exchanges.</w:t>
+      </w:r>
+      <w:r>
+        <w:rPr>
+          <w:rtl w:val="0"/>
+        </w:rPr>
       </w:r>
     </w:p>
     <w:bookmarkStart w:colFirst="0" w:colLast="0" w:name="bookmark=id.z6b2xtk8pigc" w:id="19"/>
@@ -8530,7 +9616,55 @@
         </w:rPr>
       </w:pPr>
       <w:r>
-        <w:t>Zerocash: ZKPs have a transformative capacity, which is exhibited by the Zerocash protocol by Ben-Sasson et al. [8]. Zerocash is unaware of the senders, receivers or the transaction amounts using zk-SNARKs ( Zero-Knowledge Succinct Non-Interactive Arguments of Knowledge ) but it enables networks to confirm whether or not the transactions are valid ( senders possess enough funds, amounts balance correctly, there is no double-spending). This will create Zcash cryptocurrency that offers users a choice between transparent and shielded transactions in which shielded transactions offer near unmatched privacy, even to the opponents that track all the blockchain data.</w:t>
+        <w:rPr>
+          <w:rFonts w:ascii="Times New Roman" w:cs="Times New Roman" w:eastAsia="Times New Roman" w:hAnsi="Times New Roman"/>
+          <w:b w:val="1"/>
+          <w:bCs w:val="1"/>
+          <w:i w:val="0"/>
+          <w:iCs w:val="0"/>
+          <w:smallCaps w:val="0"/>
+          <w:strike w:val="0"/>
+          <w:color w:val="000000"/>
+          <w:sz w:val="22"/>
+          <w:szCs w:val="22"/>
+          <w:u w:val="none"/>
+          <w:shd w:fill="auto" w:val="clear"/>
+          <w:vertAlign w:val="baseline"/>
+          <w:rtl w:val="0"/>
+        </w:rPr>
+        <w:t xml:space="preserve">Zerocash:</w:t>
+      </w:r>
+      <w:r>
+        <w:rPr>
+          <w:rFonts w:ascii="Times New Roman" w:cs="Times New Roman" w:eastAsia="Times New Roman" w:hAnsi="Times New Roman"/>
+          <w:b w:val="0"/>
+          <w:bCs w:val="0"/>
+          <w:i w:val="0"/>
+          <w:iCs w:val="0"/>
+          <w:smallCaps w:val="0"/>
+          <w:strike w:val="0"/>
+          <w:color w:val="000000"/>
+          <w:sz w:val="22"/>
+          <w:szCs w:val="22"/>
+          <w:u w:val="none"/>
+          <w:shd w:fill="auto" w:val="clear"/>
+          <w:vertAlign w:val="baseline"/>
+          <w:rtl w:val="0"/>
+        </w:rPr>
+        <w:t xml:space="preserve"> </w:t>
+      </w:r>
+      <w:r>
+        <w:rPr>
+          <w:sz w:val="22"/>
+          <w:szCs w:val="22"/>
+          <w:rtl w:val="0"/>
+        </w:rPr>
+        <w:t xml:space="preserve">ZKPs have a transformative capacity, which is exhibited by the Zerocash protocol by Ben-Sasson et al. Zerocash is unaware of the senders, receivers or the transaction amounts using zk-SNARKs ( Zero-Knowledge Succinct Non-Interactive Arguments of Knowledge ) but it enables networks to confirm whether or not the transactions are valid ( senders possess enough funds, amounts balance correctly, there is no double-spending). This will create Zcash cryptocurrency that offers users a choice between transparent and shielded transactions in which shielded transactions offer near unmatched privacy, even to the opponents that track all the blockchain data.</w:t>
+      </w:r>
+      <w:r>
+        <w:rPr>
+          <w:rtl w:val="0"/>
+        </w:rPr>
       </w:r>
     </w:p>
     <w:p>
@@ -8663,7 +9797,69 @@
         </w:rPr>
       </w:pPr>
       <w:r>
-        <w:t>Applications: In addition to cryptocurrencies, ZKPs can be used to help in privacy-preserving smart contracts such as where inputs, outputs and intermediate states are hidden and yet, it is possible to verify that the smart contract was executed correctly. ZKPs can facilitate regulatory adherence to financial regulations in which depository institutions can prove that they are holding reserves at thresholds required without revealing actual asset ownership(as explored by Boneh et al. [18]). Identity systems can use ZKPs for selective disclosure—proving age without revealing birthdates, proving credentials without revealing identities.</w:t>
+        <w:rPr>
+          <w:rFonts w:ascii="Times New Roman" w:cs="Times New Roman" w:eastAsia="Times New Roman" w:hAnsi="Times New Roman"/>
+          <w:b w:val="1"/>
+          <w:bCs w:val="1"/>
+          <w:i w:val="0"/>
+          <w:iCs w:val="0"/>
+          <w:smallCaps w:val="0"/>
+          <w:strike w:val="0"/>
+          <w:color w:val="000000"/>
+          <w:sz w:val="22"/>
+          <w:szCs w:val="22"/>
+          <w:u w:val="none"/>
+          <w:shd w:fill="auto" w:val="clear"/>
+          <w:vertAlign w:val="baseline"/>
+          <w:rtl w:val="0"/>
+        </w:rPr>
+        <w:t xml:space="preserve">Applications:</w:t>
+      </w:r>
+      <w:r>
+        <w:rPr>
+          <w:rFonts w:ascii="Times New Roman" w:cs="Times New Roman" w:eastAsia="Times New Roman" w:hAnsi="Times New Roman"/>
+          <w:b w:val="0"/>
+          <w:bCs w:val="0"/>
+          <w:i w:val="0"/>
+          <w:iCs w:val="0"/>
+          <w:smallCaps w:val="0"/>
+          <w:strike w:val="0"/>
+          <w:color w:val="000000"/>
+          <w:sz w:val="22"/>
+          <w:szCs w:val="22"/>
+          <w:u w:val="none"/>
+          <w:shd w:fill="auto" w:val="clear"/>
+          <w:vertAlign w:val="baseline"/>
+          <w:rtl w:val="0"/>
+        </w:rPr>
+        <w:t xml:space="preserve"> </w:t>
+      </w:r>
+      <w:r>
+        <w:rPr>
+          <w:sz w:val="22"/>
+          <w:szCs w:val="22"/>
+          <w:rtl w:val="0"/>
+        </w:rPr>
+        <w:t xml:space="preserve">In addition to cryptocurrencies, ZKPs can be used to help in privacy-preserving smart contracts such as where inputs, outputs and intermediate states are hidden and yet, it is possible to verify that the smart contract was executed correctly. ZKPs can facilitate regulatory adherence to financial regulations in which depository institutions can prove that they are holding reserves at thresholds required without revealing actual asset ownership</w:t>
+      </w:r>
+      <w:r>
+        <w:rPr>
+          <w:rFonts w:ascii="Times New Roman" w:cs="Times New Roman" w:eastAsia="Times New Roman" w:hAnsi="Times New Roman"/>
+          <w:b w:val="0"/>
+          <w:bCs w:val="0"/>
+          <w:i w:val="0"/>
+          <w:iCs w:val="0"/>
+          <w:smallCaps w:val="0"/>
+          <w:strike w:val="0"/>
+          <w:color w:val="000000"/>
+          <w:sz w:val="22"/>
+          <w:szCs w:val="22"/>
+          <w:u w:val="none"/>
+          <w:shd w:fill="auto" w:val="clear"/>
+          <w:vertAlign w:val="baseline"/>
+          <w:rtl w:val="0"/>
+        </w:rPr>
+        <w:t xml:space="preserve">(as explored by Boneh et al.). Identity systems can use ZKPs for selective disclosure—proving age without revealing birthdates, proving credentials without revealing identities.</w:t>
       </w:r>
     </w:p>
     <w:bookmarkStart w:colFirst="0" w:colLast="0" w:name="bookmark=id.q4agwwtlrsha" w:id="20"/>
@@ -8911,7 +10107,17 @@
         </w:rPr>
       </w:pPr>
       <w:r>
-        <w:t>Most real-world systems keep sensitive data (off-chain) in the form of private database or distributed file systems but store cryptographic hash (on-chain). This sustains the integrity checking using blockchain but actual data remains hidden. Healthcare applications normally adopt this pattern in order to meet privacy regulation goals by taking advantage of audit capabilities presented by blockchain (Conti et al. [16]). Advantages are privacy, performance and utilization of existing infrastructure. Disagreements such as off-chain availability dependencies and split architecture are limitations.</w:t>
+        <w:rPr>
+          <w:sz w:val="22"/>
+          <w:szCs w:val="22"/>
+          <w:rtl w:val="0"/>
+        </w:rPr>
+        <w:t xml:space="preserve">Most real-world systems keep sensitive data (off-chain) in the form of private database or distributed file systems but store cryptographic hash (on-chain). This sustains the integrity checking using blockchain but actual data remains hidden. Healthcare applications normally adopt this pattern in order to meet privacy regulation goals by taking advantage of audit capabilities presented by blockchain (Conti et al.). Advantages are privacy, performance and utilization of existing infrastructure. Disagreements such as off-chain availability dependencies and split architecture are limitations.</w:t>
+      </w:r>
+      <w:r>
+        <w:rPr>
+          <w:rtl w:val="0"/>
+        </w:rPr>
       </w:r>
     </w:p>
     <w:bookmarkStart w:colFirst="0" w:colLast="0" w:name="bookmark=id.h608e0yw1pjo" w:id="22"/>
@@ -9205,7 +10411,42 @@
         </w:rPr>
       </w:pPr>
       <w:r>
-        <w:t>Privacy Challenges: Public visibility introduces significant privacy concerns, as all transaction data is permanently recorded and accessible to anyone. Users are identified by cryptographic addresses rather than real names; however, transaction graph analysis can reveal behavioral patterns and potentially link these addresses to real-world identities, as shown by Meiklejohn et al. [7]. To mitigate these risks, privacy must be achieved through additional mechanisms such as mixing services or zero-knowledge proofs, which increase system complexity and operational costs.</w:t>
+        <w:rPr>
+          <w:rFonts w:ascii="Times New Roman" w:cs="Times New Roman" w:eastAsia="Times New Roman" w:hAnsi="Times New Roman"/>
+          <w:b w:val="1"/>
+          <w:bCs w:val="1"/>
+          <w:i w:val="0"/>
+          <w:iCs w:val="0"/>
+          <w:smallCaps w:val="0"/>
+          <w:strike w:val="0"/>
+          <w:color w:val="000000"/>
+          <w:sz w:val="22"/>
+          <w:szCs w:val="22"/>
+          <w:u w:val="none"/>
+          <w:shd w:fill="auto" w:val="clear"/>
+          <w:vertAlign w:val="baseline"/>
+          <w:rtl w:val="0"/>
+        </w:rPr>
+        <w:t xml:space="preserve">Privacy Challenges:</w:t>
+      </w:r>
+      <w:r>
+        <w:rPr>
+          <w:rFonts w:ascii="Times New Roman" w:cs="Times New Roman" w:eastAsia="Times New Roman" w:hAnsi="Times New Roman"/>
+          <w:b w:val="0"/>
+          <w:bCs w:val="0"/>
+          <w:i w:val="0"/>
+          <w:iCs w:val="0"/>
+          <w:smallCaps w:val="0"/>
+          <w:strike w:val="0"/>
+          <w:color w:val="000000"/>
+          <w:sz w:val="22"/>
+          <w:szCs w:val="22"/>
+          <w:u w:val="none"/>
+          <w:shd w:fill="auto" w:val="clear"/>
+          <w:vertAlign w:val="baseline"/>
+          <w:rtl w:val="0"/>
+        </w:rPr>
+        <w:t xml:space="preserve"> Public visibility introduces significant privacy concerns, as all transaction data is permanently recorded and accessible to anyone. Users are identified by cryptographic addresses rather than real names; however, transaction graph analysis can reveal behavioral patterns and potentially link these addresses to real-world identities, as shown by Meiklejohn et al. To mitigate these risks, privacy must be achieved through additional mechanisms such as mixing services or zero-knowledge proofs, which increase system complexity and operational costs.</w:t>
       </w:r>
     </w:p>
     <w:p>
@@ -9242,7 +10483,82 @@
         </w:rPr>
       </w:pPr>
       <w:r>
-        <w:t>Performance Limitations: The process of reaching an agreement between thousands of mistrusted participants puts a constraint on throughput. Bitcoin can manage about 7 transactions per second; Ethereum (before sharding) is able to manage approximately 15-30 TPS. Such rates are much less as compared to conventional payment networks (Visa handles thousands of TPS) or databases. Rouhani and Deters [17] compared the performance of Ethereum transactions processing and found that there are bottlenecks in validation, access to state, and the coordination of consensus.</w:t>
+        <w:rPr>
+          <w:rFonts w:ascii="Times New Roman" w:cs="Times New Roman" w:eastAsia="Times New Roman" w:hAnsi="Times New Roman"/>
+          <w:b w:val="1"/>
+          <w:bCs w:val="1"/>
+          <w:i w:val="0"/>
+          <w:iCs w:val="0"/>
+          <w:smallCaps w:val="0"/>
+          <w:strike w:val="0"/>
+          <w:color w:val="000000"/>
+          <w:sz w:val="22"/>
+          <w:szCs w:val="22"/>
+          <w:u w:val="none"/>
+          <w:shd w:fill="auto" w:val="clear"/>
+          <w:vertAlign w:val="baseline"/>
+          <w:rtl w:val="0"/>
+        </w:rPr>
+        <w:t xml:space="preserve">Performance Limitations:</w:t>
+      </w:r>
+      <w:r>
+        <w:rPr>
+          <w:rFonts w:ascii="Times New Roman" w:cs="Times New Roman" w:eastAsia="Times New Roman" w:hAnsi="Times New Roman"/>
+          <w:b w:val="0"/>
+          <w:bCs w:val="0"/>
+          <w:i w:val="0"/>
+          <w:iCs w:val="0"/>
+          <w:smallCaps w:val="0"/>
+          <w:strike w:val="0"/>
+          <w:color w:val="000000"/>
+          <w:sz w:val="22"/>
+          <w:szCs w:val="22"/>
+          <w:u w:val="none"/>
+          <w:shd w:fill="auto" w:val="clear"/>
+          <w:vertAlign w:val="baseline"/>
+          <w:rtl w:val="0"/>
+        </w:rPr>
+        <w:t xml:space="preserve"> T</w:t>
+      </w:r>
+      <w:r>
+        <w:rPr>
+          <w:sz w:val="22"/>
+          <w:szCs w:val="22"/>
+          <w:rtl w:val="0"/>
+        </w:rPr>
+        <w:t xml:space="preserve">he process of reaching an agreement between thousands of mistrusted participants puts a constraint on throughput. Bitcoin can manage about 7 transactions per second; Ethereum (before sharding) is able to manage approximately 15-30 TPS.</w:t>
+      </w:r>
+      <w:r>
+        <w:rPr>
+          <w:rFonts w:ascii="Times New Roman" w:cs="Times New Roman" w:eastAsia="Times New Roman" w:hAnsi="Times New Roman"/>
+          <w:b w:val="0"/>
+          <w:bCs w:val="0"/>
+          <w:i w:val="0"/>
+          <w:iCs w:val="0"/>
+          <w:smallCaps w:val="0"/>
+          <w:strike w:val="0"/>
+          <w:color w:val="000000"/>
+          <w:sz w:val="22"/>
+          <w:szCs w:val="22"/>
+          <w:u w:val="none"/>
+          <w:shd w:fill="auto" w:val="clear"/>
+          <w:vertAlign w:val="baseline"/>
+          <w:rtl w:val="0"/>
+        </w:rPr>
+        <w:t xml:space="preserve"> </w:t>
+      </w:r>
+      <w:r>
+        <w:rPr>
+          <w:sz w:val="22"/>
+          <w:szCs w:val="22"/>
+          <w:rtl w:val="0"/>
+        </w:rPr>
+        <w:t xml:space="preserve">Such rates are much less as compared to conventional payment networks (Visa handles thousands of TPS) or databases. Rouhani and Deters compared the performance of Ethereum transactions processing and found that there are bottlenecks in validation, access to state, and the coordination of consensus.</w:t>
+      </w:r>
+      <w:r>
+        <w:rPr>
+          <w:rtl w:val="0"/>
+        </w:rPr>
       </w:r>
     </w:p>
     <w:p>
@@ -9422,7 +10738,55 @@
         </w:rPr>
       </w:pPr>
       <w:r>
-        <w:t>Characteristics: Permissioned blockchains have the access restriction to identified, approved entities. The various organizations administer consortium blockchains; the individual blockchains are run by single organizations. These are Hyperledger Fabric (Androulaki et al. [5]) and R3 Corda. Hashemi et al. [15] compared several of the permissioned systems to be used in the enterprise.</w:t>
+        <w:rPr>
+          <w:rFonts w:ascii="Times New Roman" w:cs="Times New Roman" w:eastAsia="Times New Roman" w:hAnsi="Times New Roman"/>
+          <w:b w:val="1"/>
+          <w:bCs w:val="1"/>
+          <w:i w:val="0"/>
+          <w:iCs w:val="0"/>
+          <w:smallCaps w:val="0"/>
+          <w:strike w:val="0"/>
+          <w:color w:val="000000"/>
+          <w:sz w:val="22"/>
+          <w:szCs w:val="22"/>
+          <w:u w:val="none"/>
+          <w:shd w:fill="auto" w:val="clear"/>
+          <w:vertAlign w:val="baseline"/>
+          <w:rtl w:val="0"/>
+        </w:rPr>
+        <w:t xml:space="preserve">Characteristics:</w:t>
+      </w:r>
+      <w:r>
+        <w:rPr>
+          <w:rFonts w:ascii="Times New Roman" w:cs="Times New Roman" w:eastAsia="Times New Roman" w:hAnsi="Times New Roman"/>
+          <w:b w:val="0"/>
+          <w:bCs w:val="0"/>
+          <w:i w:val="0"/>
+          <w:iCs w:val="0"/>
+          <w:smallCaps w:val="0"/>
+          <w:strike w:val="0"/>
+          <w:color w:val="000000"/>
+          <w:sz w:val="22"/>
+          <w:szCs w:val="22"/>
+          <w:u w:val="none"/>
+          <w:shd w:fill="auto" w:val="clear"/>
+          <w:vertAlign w:val="baseline"/>
+          <w:rtl w:val="0"/>
+        </w:rPr>
+        <w:t xml:space="preserve"> </w:t>
+      </w:r>
+      <w:r>
+        <w:rPr>
+          <w:sz w:val="22"/>
+          <w:szCs w:val="22"/>
+          <w:rtl w:val="0"/>
+        </w:rPr>
+        <w:t xml:space="preserve">Permissioned blockchains have the access restriction to identified, approved entities. The various organizations administer consortium blockchains; the individual blockchains are run by single organizations. These are Hyperledger Fabric (Androulaki et al.) and R3 Corda. Hashemi et al. compared several of the permissioned systems to be used in the enterprise.</w:t>
+      </w:r>
+      <w:r>
+        <w:rPr>
+          <w:rtl w:val="0"/>
+        </w:rPr>
       </w:r>
     </w:p>
     <w:p>
@@ -11404,7 +12768,163 @@
         </w:rPr>
       </w:pPr>
       <w:r>
-        <w:t>Financial: AML/KYC is ineffective in permissionless systems (Victor and Andelfinger [23] made a lot of progress on detection) but much easier in permissioned systems.</w:t>
+        <w:rPr>
+          <w:rFonts w:ascii="Times New Roman" w:cs="Times New Roman" w:eastAsia="Times New Roman" w:hAnsi="Times New Roman"/>
+          <w:b w:val="1"/>
+          <w:bCs w:val="1"/>
+          <w:i w:val="0"/>
+          <w:iCs w:val="0"/>
+          <w:smallCaps w:val="0"/>
+          <w:strike w:val="0"/>
+          <w:color w:val="000000"/>
+          <w:sz w:val="22"/>
+          <w:szCs w:val="22"/>
+          <w:u w:val="none"/>
+          <w:shd w:fill="auto" w:val="clear"/>
+          <w:vertAlign w:val="baseline"/>
+          <w:rtl w:val="0"/>
+        </w:rPr>
+        <w:t xml:space="preserve">Financial:</w:t>
+      </w:r>
+      <w:r>
+        <w:rPr>
+          <w:rFonts w:ascii="Times New Roman" w:cs="Times New Roman" w:eastAsia="Times New Roman" w:hAnsi="Times New Roman"/>
+          <w:b w:val="0"/>
+          <w:bCs w:val="0"/>
+          <w:i w:val="0"/>
+          <w:iCs w:val="0"/>
+          <w:smallCaps w:val="0"/>
+          <w:strike w:val="0"/>
+          <w:color w:val="000000"/>
+          <w:sz w:val="22"/>
+          <w:szCs w:val="22"/>
+          <w:u w:val="none"/>
+          <w:shd w:fill="auto" w:val="clear"/>
+          <w:vertAlign w:val="baseline"/>
+          <w:rtl w:val="0"/>
+        </w:rPr>
+        <w:t xml:space="preserve"> AML/KYC is </w:t>
+      </w:r>
+      <w:r>
+        <w:rPr>
+          <w:sz w:val="22"/>
+          <w:szCs w:val="22"/>
+          <w:rtl w:val="0"/>
+        </w:rPr>
+        <w:t xml:space="preserve">ineffective</w:t>
+      </w:r>
+      <w:r>
+        <w:rPr>
+          <w:rFonts w:ascii="Times New Roman" w:cs="Times New Roman" w:eastAsia="Times New Roman" w:hAnsi="Times New Roman"/>
+          <w:b w:val="0"/>
+          <w:bCs w:val="0"/>
+          <w:i w:val="0"/>
+          <w:iCs w:val="0"/>
+          <w:smallCaps w:val="0"/>
+          <w:strike w:val="0"/>
+          <w:color w:val="000000"/>
+          <w:sz w:val="22"/>
+          <w:szCs w:val="22"/>
+          <w:u w:val="none"/>
+          <w:shd w:fill="auto" w:val="clear"/>
+          <w:vertAlign w:val="baseline"/>
+          <w:rtl w:val="0"/>
+        </w:rPr>
+        <w:t xml:space="preserve"> in permissionless sys</w:t>
+      </w:r>
+      <w:r>
+        <w:rPr>
+          <w:sz w:val="22"/>
+          <w:szCs w:val="22"/>
+          <w:rtl w:val="0"/>
+        </w:rPr>
+        <w:t xml:space="preserve">tems</w:t>
+      </w:r>
+      <w:r>
+        <w:rPr>
+          <w:rFonts w:ascii="Times New Roman" w:cs="Times New Roman" w:eastAsia="Times New Roman" w:hAnsi="Times New Roman"/>
+          <w:b w:val="0"/>
+          <w:bCs w:val="0"/>
+          <w:i w:val="0"/>
+          <w:iCs w:val="0"/>
+          <w:smallCaps w:val="0"/>
+          <w:strike w:val="0"/>
+          <w:color w:val="000000"/>
+          <w:sz w:val="22"/>
+          <w:szCs w:val="22"/>
+          <w:u w:val="none"/>
+          <w:shd w:fill="auto" w:val="clear"/>
+          <w:vertAlign w:val="baseline"/>
+          <w:rtl w:val="0"/>
+        </w:rPr>
+        <w:t xml:space="preserve"> (Victor and Andelfinger made a </w:t>
+      </w:r>
+      <w:r>
+        <w:rPr>
+          <w:sz w:val="22"/>
+          <w:szCs w:val="22"/>
+          <w:rtl w:val="0"/>
+        </w:rPr>
+        <w:t xml:space="preserve">lot of progress </w:t>
+      </w:r>
+      <w:r>
+        <w:rPr>
+          <w:rFonts w:ascii="Times New Roman" w:cs="Times New Roman" w:eastAsia="Times New Roman" w:hAnsi="Times New Roman"/>
+          <w:b w:val="0"/>
+          <w:bCs w:val="0"/>
+          <w:i w:val="0"/>
+          <w:iCs w:val="0"/>
+          <w:smallCaps w:val="0"/>
+          <w:strike w:val="0"/>
+          <w:color w:val="000000"/>
+          <w:sz w:val="22"/>
+          <w:szCs w:val="22"/>
+          <w:u w:val="none"/>
+          <w:shd w:fill="auto" w:val="clear"/>
+          <w:vertAlign w:val="baseline"/>
+          <w:rtl w:val="0"/>
+        </w:rPr>
+        <w:t xml:space="preserve">on detection)</w:t>
+      </w:r>
+      <w:r>
+        <w:rPr>
+          <w:sz w:val="22"/>
+          <w:szCs w:val="22"/>
+          <w:rtl w:val="0"/>
+        </w:rPr>
+        <w:t xml:space="preserve"> but much easier in</w:t>
+      </w:r>
+      <w:r>
+        <w:rPr>
+          <w:rFonts w:ascii="Times New Roman" w:cs="Times New Roman" w:eastAsia="Times New Roman" w:hAnsi="Times New Roman"/>
+          <w:b w:val="0"/>
+          <w:bCs w:val="0"/>
+          <w:i w:val="0"/>
+          <w:iCs w:val="0"/>
+          <w:smallCaps w:val="0"/>
+          <w:strike w:val="0"/>
+          <w:color w:val="000000"/>
+          <w:sz w:val="22"/>
+          <w:szCs w:val="22"/>
+          <w:u w:val="none"/>
+          <w:shd w:fill="auto" w:val="clear"/>
+          <w:vertAlign w:val="baseline"/>
+          <w:rtl w:val="0"/>
+        </w:rPr>
+        <w:t xml:space="preserve"> permissioned syste</w:t>
+      </w:r>
+      <w:r>
+        <w:rPr>
+          <w:sz w:val="22"/>
+          <w:szCs w:val="22"/>
+          <w:rtl w:val="0"/>
+        </w:rPr>
+        <w:t xml:space="preserve">ms.</w:t>
+      </w:r>
+      <w:r>
+        <w:rPr>
+          <w:rtl w:val="0"/>
+        </w:rPr>
       </w:r>
     </w:p>
     <w:p>
@@ -11529,7 +13049,66 @@
         </w:rPr>
       </w:pPr>
       <w:r>
-        <w:t>Healthcare: There is a strong tendency to employ strict access control, audit log, and encryption to HIPAA compliance (Conti et al. [16])</w:t>
+        <w:rPr>
+          <w:rFonts w:ascii="Times New Roman" w:cs="Times New Roman" w:eastAsia="Times New Roman" w:hAnsi="Times New Roman"/>
+          <w:b w:val="1"/>
+          <w:bCs w:val="1"/>
+          <w:i w:val="0"/>
+          <w:iCs w:val="0"/>
+          <w:smallCaps w:val="0"/>
+          <w:strike w:val="0"/>
+          <w:color w:val="000000"/>
+          <w:sz w:val="22"/>
+          <w:szCs w:val="22"/>
+          <w:u w:val="none"/>
+          <w:shd w:fill="auto" w:val="clear"/>
+          <w:vertAlign w:val="baseline"/>
+          <w:rtl w:val="0"/>
+        </w:rPr>
+        <w:t xml:space="preserve">Healthcare:</w:t>
+      </w:r>
+      <w:r>
+        <w:rPr>
+          <w:rFonts w:ascii="Times New Roman" w:cs="Times New Roman" w:eastAsia="Times New Roman" w:hAnsi="Times New Roman"/>
+          <w:b w:val="0"/>
+          <w:bCs w:val="0"/>
+          <w:i w:val="0"/>
+          <w:iCs w:val="0"/>
+          <w:smallCaps w:val="0"/>
+          <w:strike w:val="0"/>
+          <w:color w:val="000000"/>
+          <w:sz w:val="22"/>
+          <w:szCs w:val="22"/>
+          <w:u w:val="none"/>
+          <w:shd w:fill="auto" w:val="clear"/>
+          <w:vertAlign w:val="baseline"/>
+          <w:rtl w:val="0"/>
+        </w:rPr>
+        <w:t xml:space="preserve"> </w:t>
+      </w:r>
+      <w:r>
+        <w:rPr>
+          <w:sz w:val="22"/>
+          <w:szCs w:val="22"/>
+          <w:rtl w:val="0"/>
+        </w:rPr>
+        <w:t xml:space="preserve">There is a strong tendency to employ strict access control, audit log, and encryption to HIPAA compliance (Conti et al. put that in there)</w:t>
+      </w:r>
+      <w:r>
+        <w:rPr>
+          <w:i w:val="0"/>
+          <w:iCs w:val="0"/>
+          <w:smallCaps w:val="0"/>
+          <w:strike w:val="0"/>
+          <w:color w:val="000000"/>
+          <w:sz w:val="22"/>
+          <w:szCs w:val="22"/>
+          <w:u w:val="none"/>
+          <w:shd w:fill="auto" w:val="clear"/>
+          <w:vertAlign w:val="baseline"/>
+          <w:rtl w:val="0"/>
+        </w:rPr>
+        <w:t xml:space="preserve"> (Conti et al.)</w:t>
       </w:r>
     </w:p>
     <w:p>
@@ -13119,7 +14698,55 @@
         </w:rPr>
       </w:pPr>
       <w:r>
-        <w:t>MEV and Fairness: It ensures encrypted mempools and fair ordering everywhere to distribute MEV evenly, and have application-level defenses as suggested by Daian et al. [14].</w:t>
+        <w:rPr>
+          <w:rFonts w:ascii="Times New Roman" w:cs="Times New Roman" w:eastAsia="Times New Roman" w:hAnsi="Times New Roman"/>
+          <w:b w:val="1"/>
+          <w:bCs w:val="1"/>
+          <w:i w:val="0"/>
+          <w:iCs w:val="0"/>
+          <w:smallCaps w:val="0"/>
+          <w:strike w:val="0"/>
+          <w:color w:val="000000"/>
+          <w:sz w:val="22"/>
+          <w:szCs w:val="22"/>
+          <w:u w:val="none"/>
+          <w:shd w:fill="auto" w:val="clear"/>
+          <w:vertAlign w:val="baseline"/>
+          <w:rtl w:val="0"/>
+        </w:rPr>
+        <w:t xml:space="preserve">MEV and Fairness:</w:t>
+      </w:r>
+      <w:r>
+        <w:rPr>
+          <w:rFonts w:ascii="Times New Roman" w:cs="Times New Roman" w:eastAsia="Times New Roman" w:hAnsi="Times New Roman"/>
+          <w:b w:val="0"/>
+          <w:bCs w:val="0"/>
+          <w:i w:val="0"/>
+          <w:iCs w:val="0"/>
+          <w:smallCaps w:val="0"/>
+          <w:strike w:val="0"/>
+          <w:color w:val="000000"/>
+          <w:sz w:val="22"/>
+          <w:szCs w:val="22"/>
+          <w:u w:val="none"/>
+          <w:shd w:fill="auto" w:val="clear"/>
+          <w:vertAlign w:val="baseline"/>
+          <w:rtl w:val="0"/>
+        </w:rPr>
+        <w:t xml:space="preserve"> </w:t>
+      </w:r>
+      <w:r>
+        <w:rPr>
+          <w:sz w:val="22"/>
+          <w:szCs w:val="22"/>
+          <w:rtl w:val="0"/>
+        </w:rPr>
+        <w:t xml:space="preserve">It ensures encrypted mempools and fair ordering everywhere to distribute MEV evenly, and have application-level defenses as suggested by Daian and co.</w:t>
+      </w:r>
+      <w:r>
+        <w:rPr>
+          <w:rtl w:val="0"/>
+        </w:rPr>
       </w:r>
     </w:p>
     <w:p>

</xml_diff>

<commit_message>
Convert detailed author-name citations to numbered format in DOCX
Co-authored-by: Mujeeb-U-Rehman <197483016+Mujeeb-U-Rehman@users.noreply.github.com>
</commit_message>
<xml_diff>
--- a/FULL N FINAL Review BlockChain.docx
+++ b/FULL N FINAL Review BlockChain.docx
@@ -540,7 +540,7 @@
         </w:rPr>
       </w:pPr>
       <w:r>
-        <w:t>An entirely different concept is provided by blockchain technology, a cryptographically linked distributed ledger first introduced by Satoshi Nakamoto in 2008 with Bitcoin [1] and which is kept in common by several parties and does not need a central authority. This decentralized architecture will overcome numerous old IA problems through the removal of central points of failure, the availability of audit trails that are transparent and tamper evident, and the application of cryptographic methods to guarantee integrity and authenticity of data.</w:t>
+        <w:t>An entirely different concept is provided by blockchain technology, a cryptographically linked distributed ledger first introduced by Satoshi Nakamoto in 2008 with [1] and which is kept in common by several parties and does not need a central authority. This decentralized architecture will overcome numerous old IA problems through the removal of central points of failure, the availability of audit trails that are transparent and tamper evident, and the application of cryptographic methods to guarantee integrity and authenticity of data.</w:t>
       </w:r>
     </w:p>
     <w:p>
@@ -913,7 +913,7 @@
         </w:rPr>
       </w:pPr>
       <w:r>
-        <w:t>Basic Architecture: A blockchain is a distributed database which keeps an ever-expanding list of data known as blocks. Each block consists of a set of transactions, a timestamp, a cryptographic hash of the prior block, and a hash of that block, forming a chain, such that alteration of any block in history would involve recalculating of all the later blocks, which     have been made computationally infeasible in well-designed systems. In 2008, Nakamoto, as indicated by Bitcoin [1], demonstrated how a decentralized network could maintain a single journal without making use of a central authority through novel use of consensus systems.</w:t>
+        <w:t>Basic Architecture: A blockchain is a distributed database which keeps an ever-expanding list of data known as blocks. Each block consists of a set of transactions, a timestamp, a cryptographic hash of the prior block, and a hash of that block, forming a chain, such that alteration of any block in history would involve recalculating of all the later blocks, which     have been made computationally infeasible in well-designed systems. In 2008, Nakamoto, as indicated by [1], demonstrated how a decentralized network could maintain a single journal without making use of a central authority through novel use of consensus systems.</w:t>
       </w:r>
     </w:p>
     <w:p>
@@ -1019,7 +1019,7 @@
         </w:rPr>
       </w:pPr>
       <w:r>
-        <w:t>Proof of Work (PoW):  Bitcoin also uses PoW which was initially used by Ethereum where the participants (miners) have to solve computationally intensive puzzles in an attempt to propose new blocks. The challenge makes the rewriting of blockchain history very expensive. Nevertheless, PoW uses a lot of energy (Bitcoin uses more energy than small nations) and reduces the number of transactions. Bonneau et al. [6] present detailed discussion of PoW security features and attack combinations.</w:t>
+        <w:t>Proof of Work (PoW):  Bitcoin also uses PoW which was initially used by Ethereum where the participants (miners) have to solve computationally intensive puzzles in an attempt to propose new blocks. The challenge makes the rewriting of blockchain history very expensive. Nevertheless, PoW uses a lot of energy (Bitcoin uses more energy than small nations) and reduces the number of transactions. [6] present detailed discussion of PoW security features and attack combinations.</w:t>
       </w:r>
     </w:p>
     <w:p>
@@ -1111,7 +1111,7 @@
         </w:sectPr>
       </w:pPr>
       <w:r>
-        <w:t>Proof of Stake (PoS): PoS allows proposers of blocks to be chosen not by the amount of computational work they perform but by the amount of stake they hold (i.e. investment in cryptocurrency), which drastically lowers the amount of energy used, and security is ensured through economic incentives, since attackers would have to buy large stakes, which is economically unprofitable. The evolutional change to PoS in Ethereum is one of the significant ones. Gazi et al. [11] examine PoS security assurance and long distance attack countermeasures such as the checkpointing.</w:t>
+        <w:t>Proof of Stake (PoS): PoS allows proposers of blocks to be chosen not by the amount of computational work they perform but by the amount of stake they hold (i.e. investment in cryptocurrency), which drastically lowers the amount of energy used, and security is ensured through economic incentives, since attackers would have to buy large stakes, which is economically unprofitable. The evolutional change to PoS in Ethereum is one of the significant ones. [11] examine PoS security assurance and long distance attack countermeasures such as the checkpointing.</w:t>
       </w:r>
     </w:p>
     <w:p>
@@ -1148,7 +1148,7 @@
         </w:rPr>
       </w:pPr>
       <w:r>
-        <w:t>Byzantine Fault Tolerance (BFT): BFT-based consensus, such as Tendermint (Kwon and Buchman [10]) and Hyperledger Fabric (Androulaki et al. [5]), can provide finality and can support arbitrary failure of nodes, including malicious behavior if few more than a third of nodes are faulty. BFT systems are generally faster in finality and have greater throughput than PoW or PoS but need to know, comparatively fixed list of authorizers, which makes them more permissible to a permissioned setting.</w:t>
+        <w:t>Byzantine Fault Tolerance (BFT): BFT-based consensus, such as Tendermint ([10]) and Hyperledger Fabric ([5]), can provide finality and can support arbitrary failure of nodes, including malicious behavior if few more than a third of nodes are faulty. BFT systems are generally faster in finality and have greater throughput than PoW or PoS but need to know, comparatively fixed list of authorizers, which makes them more permissible to a permissioned setting.</w:t>
       </w:r>
     </w:p>
     <w:p>
@@ -1185,7 +1185,7 @@
         </w:rPr>
       </w:pPr>
       <w:r>
-        <w:t>Smart Contracts:In 2014, Buterin [2] proposed and in 2016, Wood [3] described the Yellow Paper, which expanded the field of blockchain beyond simple value transfers to programmable transactions using smart contracts, or programs, which can run on the blockchain and execute themselves when specific conditions are satisfied. The smart contracts allow the issuance of complex business logic to be decentralized, such as financially using tokens to supply chain tracking. Nevertheless, smart contracts are posing serious security problems as thoroughly discussed by Atzei et al. [12] and Luu et al. [13]. Errors in contract code may cause significant financial loss - the 2016 DAO attack used a reentrancy vulnerability to drain about 60 million dollars. The vulnerabilities are frequently reentrancy (recursive calls prior to updating of state), arithmetic overflow/underflow, access control vulnerability, and oracle exploitation.</w:t>
+        <w:t>Smart Contracts:In 2014, [2] proposed and in 2016, [3] described the Yellow Paper, which expanded the field of blockchain beyond simple value transfers to programmable transactions using smart contracts, or programs, which can run on the blockchain and execute themselves when specific conditions are satisfied. The smart contracts allow the issuance of complex business logic to be decentralized, such as financially using tokens to supply chain tracking. Nevertheless, smart contracts are posing serious security problems as thoroughly discussed by [12] and [13]. Errors in contract code may cause significant financial loss - the 2016 DAO attack used a reentrancy vulnerability to drain about 60 million dollars. The vulnerabilities are frequently reentrancy (recursive calls prior to updating of state), arithmetic overflow/underflow, access control vulnerability, and oracle exploitation.</w:t>
       </w:r>
     </w:p>
     <w:p>
@@ -1211,7 +1211,7 @@
         </w:rPr>
       </w:pPr>
       <w:r>
-        <w:t>Cryptographic Primitives: Blockchain applies cryptography as a significant aspect in terms of security. The use of public-key cryptography enables users to sign their messages with their private keys and be authenticated and non-repudiated by the other users with the help of their public keys. Cryptographic hash functions produce deterministic-sized digests or hash values of information that are dependent upon any changes made to their input and that can be used to indicate that they have been altered. The merkle trees allow a request of the presence of a transaction in the block without downloading a complete block. Outside of primitives, like zero-knowledge proofs, it is possible to have systems like Zerocash (Ben-Sasson et al. [8]) in which the user of an application can prove that they have enough money without revealing their balance.</w:t>
+        <w:t>Cryptographic Primitives: Blockchain applies cryptography as a significant aspect in terms of security. The use of public-key cryptography enables users to sign their messages with their private keys and be authenticated and non-repudiated by the other users with the help of their public keys. Cryptographic hash functions produce deterministic-sized digests or hash values of information that are dependent upon any changes made to their input and that can be used to indicate that they have been altered. The merkle trees allow a request of the presence of a transaction in the block without downloading a complete block. Outside of primitives, like zero-knowledge proofs, it is possible to have systems like Zerocash ([8]) in which the user of an application can prove that they have enough money without revealing their balance.</w:t>
       </w:r>
     </w:p>
     <w:bookmarkStart w:colFirst="0" w:colLast="0" w:name="bookmark=id.c37ngynve07m" w:id="3"/>
@@ -1950,7 +1950,7 @@
         </w:rPr>
       </w:pPr>
       <w:r>
-        <w:t xml:space="preserve">Immutable Ledger Structure: Blockchain is fundamentally designed to enforce a tamper-evident record through cryptographically binding one block to the previous one, with hash functions. Any alterations to any historical transaction would alter the hash of that block, disconnecting it with the following block and necessitating the re-computation of all the following blocks. In a proof-of-work system such as Bitcoin, this recalculation must be performed by using colossal computational resources which increase exponentially with the block depth. Gervais et al. [22] examined the evidence of the security of a proof-of-work blockchain, and they have proved that it is exponentially harder to rewrite several blockchain blocks as time passes, which means that it is nearly impossible to tamper with history with established blockchains. </w:t>
+        <w:t xml:space="preserve">Immutable Ledger Structure: Blockchain is fundamentally designed to enforce a tamper-evident record through cryptographically binding one block to the previous one, with hash functions. Any alterations to any historical transaction would alter the hash of that block, disconnecting it with the following block and necessitating the re-computation of all the following blocks. In a proof-of-work system such as Bitcoin, this recalculation must be performed by using colossal computational resources which increase exponentially with the block depth. [22] examined the evidence of the security of a proof-of-work blockchain, and they have proved that it is exponentially harder to rewrite several blockchain blocks as time passes, which means that it is nearly impossible to tamper with history with established blockchains. </w:t>
       </w:r>
     </w:p>
     <w:p>
@@ -2201,7 +2201,7 @@
       <w:r>
         <w:t>Probabilistic Integrity and Double-Spending Resistance:</w:t>
         <w:br/>
-        <w:t xml:space="preserve"> The integrity guarantees of PoW blockchains are probabilistic rather than absolute. Nakamoto [1] formalized this property by modeling the competition between honest miners and an adversary attempting a double-spending attack as a stochastic process. Let q denote the fraction of total mining power controlled by an attacker and  the fraction controlled by honest miners. If a transaction is buried under z confirmations, the probability that an attacker can eventually catch up and reverse the transaction is given by:</w:t>
+        <w:t xml:space="preserve"> The integrity guarantees of PoW blockchains are probabilistic rather than absolute. [1] formalized this property by modeling the competition between honest miners and an adversary attempting a double-spending attack as a stochastic process. Let q denote the fraction of total mining power controlled by an attacker and  the fraction controlled by honest miners. If a transaction is buried under z confirmations, the probability that an attacker can eventually catch up and reverse the transaction is given by:</w:t>
       </w:r>
     </w:p>
     <w:p>
@@ -4503,7 +4503,7 @@
         </w:rPr>
       </w:pPr>
       <w:r>
-        <w:t>Off-Chain Storage with On-Chain Commitments: It is common in many practical systems to store sensitive data off-chain (in private databases, encrypted file systems, and even distributed storage such as IPFS) and record cryptographic commitments (hashes or Merkle roots) on-chain. The architecture preserves integrity checks using the tamper-evident characteristics of the blockchain and keeps real information confidential and permits conventional access control measures. This pattern is widely implemented by healthcare applications, as thoroughly surveyed by Conti et al. [16], as it is required to meet privacy laws such as HIPAA, but takes advantage of blockchain audit and tamper detection.</w:t>
+        <w:t>Off-Chain Storage with On-Chain Commitments: It is common in many practical systems to store sensitive data off-chain (in private databases, encrypted file systems, and even distributed storage such as IPFS) and record cryptographic commitments (hashes or Merkle roots) on-chain. The architecture preserves integrity checks using the tamper-evident characteristics of the blockchain and keeps real information confidential and permits conventional access control measures. This pattern is widely implemented by healthcare applications, as thoroughly surveyed by [16], as it is required to meet privacy laws such as HIPAA, but takes advantage of blockchain audit and tamper detection.</w:t>
       </w:r>
     </w:p>
     <w:p>
@@ -4868,7 +4868,7 @@
         </w:rPr>
       </w:pPr>
       <w:r>
-        <w:t>Mixing and Anonymization: Service providers that mix or tumble transactions of many users obscure the connections between the senders and the receivers by pooling money and re-distribing it with delays. Zhang et al. [21] examined incentive-compatible mixing schemes that guarantee honest behavior by the participants. Nevertheless, there are inherent technical analysis (virtuous scholars such as Meiklejohn et al. [7] have devised the complex de-anonymization heuristics that, although mixing, can be probabilistically linked), as well as regulating (mixing can facilitate money laundering and other crimes) problems with mixing.</w:t>
+        <w:t>Mixing and Anonymization: Service providers that mix or tumble transactions of many users obscure the connections between the senders and the receivers by pooling money and re-distribing it with delays. [21] examined incentive-compatible mixing schemes that guarantee honest behavior by the participants. Nevertheless, there are inherent technical analysis (virtuous scholars such as [7] have devised the complex de-anonymization heuristics that, although mixing, can be probabilistically linked), as well as regulating (mixing can facilitate money laundering and other crimes) problems with mixing.</w:t>
       </w:r>
     </w:p>
     <w:p>
@@ -4905,7 +4905,7 @@
         </w:rPr>
       </w:pPr>
       <w:r>
-        <w:t>Secure Multi-Party Computation: MPC protocols enable many parties to jointly arrive at computations on their own data without exposing that data to other parties or using trusted third parties. Almeida et al. [19] investigated the idea of using MPC together with blockchain to have privacy preserving smart contracts where contract logic is executed using encrypted or secret shared data. Practical implementation is however not feasible because it has high performance costs (orders of magnitude slower than plaintext calculation) and high communication complexity (many message rounds) and coordination problems (when the parties are unreliable or malicious).</w:t>
+        <w:t>Secure Multi-Party Computation: MPC protocols enable many parties to jointly arrive at computations on their own data without exposing that data to other parties or using trusted third parties. [19] investigated the idea of using MPC together with blockchain to have privacy preserving smart contracts where contract logic is executed using encrypted or secret shared data. Practical implementation is however not feasible because it has high performance costs (orders of magnitude slower than plaintext calculation) and high communication complexity (many message rounds) and coordination problems (when the parties are unreliable or malicious).</w:t>
       </w:r>
     </w:p>
     <w:p>
@@ -4942,7 +4942,7 @@
         </w:rPr>
       </w:pPr>
       <w:r>
-        <w:t>Trusted Execution Environments:MPC protocols enable many parties to jointly arrive at computations on their own data without exposing that data to other parties or using trusted third parties. Almeida et al. [19] investigated the idea of using MPC together with blockchain to have privacy preserving smart contracts where contract logic is executed using encrypted or secret shared data. Practical implementation is however not feasible because it has high performance costs (orders of magnitude slower than plaintext calculation) and high communication complexity (many message rounds) and coordination problems (when the parties are unreliable or malicious).</w:t>
+        <w:t>Trusted Execution Environments:MPC protocols enable many parties to jointly arrive at computations on their own data without exposing that data to other parties or using trusted third parties. [19] investigated the idea of using MPC together with blockchain to have privacy preserving smart contracts where contract logic is executed using encrypted or secret shared data. Practical implementation is however not feasible because it has high performance costs (orders of magnitude slower than plaintext calculation) and high communication complexity (many message rounds) and coordination problems (when the parties are unreliable or malicious).</w:t>
       </w:r>
     </w:p>
     <w:bookmarkStart w:colFirst="0" w:colLast="0" w:name="bookmark=id.7yyq17en9h51" w:id="9"/>
@@ -5262,7 +5262,7 @@
         </w:rPr>
       </w:pPr>
       <w:r>
-        <w:t>Decentralized Identity: Ali et al. [24] have researched decentralized identities (DID) using Blockstack, and Hardjono and Smith [20] on decentralized public key infrastructure (DPKI) based on blockchains. These systems allow the user to manage their identity credentials, without having to use centralized identity providers such as governments or corporations. The models of self-sovereign identity enable users to administer their own credentials, share particular aspects of them selectively (such as demonstrating age without revealing date of birth), and recall credentials in case of an intrusion.</w:t>
+        <w:t>Decentralized Identity: [24] have researched decentralized identities (DID) using Blockstack, and [20] on decentralized public key infrastructure (DPKI) based on blockchains. These systems allow the user to manage their identity credentials, without having to use centralized identity providers such as governments or corporations. The models of self-sovereign identity enable users to administer their own credentials, share particular aspects of them selectively (such as demonstrating age without revealing date of birth), and recall credentials in case of an intrusion.</w:t>
       </w:r>
     </w:p>
     <w:p>
@@ -6165,7 +6165,7 @@
         </w:rPr>
       </w:pPr>
       <w:r>
-        <w:t>51% Attacks: In Proof of work systems, a network with greater than half the available hash power is vulnerable to attacks by the attacker because they can reject all other miners and use their coins to perform a double-spending attack (use the same coins twice). Where large public blockchains such as Bitcoin have huge hash rates where such attacks are costly economically (millions per hour attack cost), smaller cryptocurrencies have been compromised with 51% attacks costing millions of dollars. Gervais et al. [22] give a thorough examination of situations where such attacks are made possible and the cost thereof, such as network latency, and block propagation times.</w:t>
+        <w:t>51% Attacks: In Proof of work systems, a network with greater than half the available hash power is vulnerable to attacks by the attacker because they can reject all other miners and use their coins to perform a double-spending attack (use the same coins twice). Where large public blockchains such as Bitcoin have huge hash rates where such attacks are costly economically (millions per hour attack cost), smaller cryptocurrencies have been compromised with 51% attacks costing millions of dollars. [22] give a thorough examination of situations where such attacks are made possible and the cost thereof, such as network latency, and block propagation times.</w:t>
       </w:r>
     </w:p>
     <w:p>
@@ -6814,7 +6814,7 @@
         </w:rPr>
       </w:pPr>
       <w:r>
-        <w:t>Reentrancy Attacks: The notorious 2016 DAO attack was a reentrancy attack that used the reentrancy vulnerability in which a malicious contract can recursively call into the victim contract prior to the initial invocation making its state updates, effectively withdrawing funds on multiple occasions. The attack cost about 60 million and resulted in an Ethereum hard fork that was controversial. This weakness was caused by the fact that contracts updated their state after (not before) external calls (which is a violation of the checks-effects-interactions pattern). Atzei et al. [12] give a more detailed taxonomy of Ethereum smart contract attacks including reentrancy variants.</w:t>
+        <w:t>Reentrancy Attacks: The notorious 2016 DAO attack was a reentrancy attack that used the reentrancy vulnerability in which a malicious contract can recursively call into the victim contract prior to the initial invocation making its state updates, effectively withdrawing funds on multiple occasions. The attack cost about 60 million and resulted in an Ethereum hard fork that was controversial. This weakness was caused by the fact that contracts updated their state after (not before) external calls (which is a violation of the checks-effects-interactions pattern). [12] give a more detailed taxonomy of Ethereum smart contract attacks including reentrancy variants.</w:t>
       </w:r>
     </w:p>
     <w:p>
@@ -6995,7 +6995,7 @@
         </w:rPr>
       </w:pPr>
       <w:r>
-        <w:t>Oracle Manipulation: Smart contracts frequently require external information sources (oracles) which supply real-world information, such as asset prices, weather, or sport scores. There are attackers who are capable of manipulation of the oracle data which may lead to wrong decisions made by contracts. Manipulation of price oracles Attacks on decentralized finance platforms that use flash loans have been used to exploit manipulation of market prices and oracle updates based on manipulated prices to make a profit on contracts at stale prices and repay the loan in a single atomic transaction. Daian et al. [14] evaluated maximum extractable value (MEV) that indicates how validators can get profits by strategizing the order of transactions.</w:t>
+        <w:t>Oracle Manipulation: Smart contracts frequently require external information sources (oracles) which supply real-world information, such as asset prices, weather, or sport scores. There are attackers who are capable of manipulation of the oracle data which may lead to wrong decisions made by contracts. Manipulation of price oracles Attacks on decentralized finance platforms that use flash loans have been used to exploit manipulation of market prices and oracle updates based on manipulated prices to make a profit on contracts at stale prices and repay the loan in a single atomic transaction. [14] evaluated maximum extractable value (MEV) that indicates how validators can get profits by strategizing the order of transactions.</w:t>
       </w:r>
     </w:p>
     <w:p>
@@ -7098,7 +7098,7 @@
         </w:rPr>
       </w:pPr>
       <w:r>
-        <w:t>Defenses: To mitigate the vulnerability of smart contracts, there is a need to take multifaceted strategies. The secure development lifecycle practices are threat modelling in design, security oriented design patterns (checks-effects-interactions to prevent reentrancy, pull-over-push to distribute payments) and compliance with accepted standards and best practices. Such automatic analysis tools as Oyente (created by Luu et al. [13]) find known vulnerabilities using symbolic execution and data flow analysis, but they are not able to identify every problem. Ad hoc professional security audits by expert auditors uncover latent weaknesses unnoticed by automated tools by conducting a manual review of source code and through trying to reason as an attacker. Formal verification Formal verification mathematically establishes that contracts meet security properties, which offers maximum confidence, but it is nevertheless costly and can only be accomplished by expert knowledge. Bug bounty programs encourage independent security researchers to discover and report vulnerabilities in a responsible manner before the vulnerabilities are exploited maliciously. With runtime monitoring and circuit breakers, the damage can be restricted in case the vulnerabilities are used in spite of the preventive measures employed by permitting the emergency suspension of the vulnerable contracts.</w:t>
+        <w:t>Defenses: To mitigate the vulnerability of smart contracts, there is a need to take multifaceted strategies. The secure development lifecycle practices are threat modelling in design, security oriented design patterns (checks-effects-interactions to prevent reentrancy, pull-over-push to distribute payments) and compliance with accepted standards and best practices. Such automatic analysis tools as Oyente (created by [13]) find known vulnerabilities using symbolic execution and data flow analysis, but they are not able to identify every problem. Ad hoc professional security audits by expert auditors uncover latent weaknesses unnoticed by automated tools by conducting a manual review of source code and through trying to reason as an attacker. Formal verification Formal verification mathematically establishes that contracts meet security properties, which offers maximum confidence, but it is nevertheless costly and can only be accomplished by expert knowledge. Bug bounty programs encourage independent security researchers to discover and report vulnerabilities in a responsible manner before the vulnerabilities are exploited maliciously. With runtime monitoring and circuit breakers, the damage can be restricted in case the vulnerabilities are used in spite of the preventive measures employed by permitting the emergency suspension of the vulnerable contracts.</w:t>
       </w:r>
     </w:p>
     <w:bookmarkStart w:colFirst="0" w:colLast="0" w:name="bookmark=id.31q6b4z4apgq" w:id="14"/>
@@ -7916,7 +7916,7 @@
         </w:rPr>
       </w:pPr>
       <w:r>
-        <w:t>Transaction Graph Analysis: Meiklejohn et al. [7] showed that comprehending the graph structure of Bitcoin transactions (who paid whom) enables grouping addresses that are probably those of the same user in common input ownership heuristics and other tendencies. These clusters can be then associated with real world identities through addresses familiar to them such as exchange withdrawal address, publicly posted address on donations or addresses that are disclosed during purchase transaction. This deanonymization is even in the presence of pseudonymity since patterns and relationships of transactions provide a lot of information about user identities and user behaviors.</w:t>
+        <w:t>Transaction Graph Analysis: [7] showed that comprehending the graph structure of Bitcoin transactions (who paid whom) enables grouping addresses that are probably those of the same user in common input ownership heuristics and other tendencies. These clusters can be then associated with real world identities through addresses familiar to them such as exchange withdrawal address, publicly posted address on donations or addresses that are disclosed during purchase transaction. This deanonymization is even in the presence of pseudonymity since patterns and relationships of transactions provide a lot of information about user identities and user behaviors.</w:t>
       </w:r>
     </w:p>
     <w:p>
@@ -8330,7 +8330,7 @@
         </w:rPr>
       </w:pPr>
       <w:r>
-        <w:t>Analysis: Privacy against non castral observers The right mixing with sufficient numbers and time delays provides adequate privacy. Zhang et al. [21] analyzed the incentives-compatible mixing protocols that guarantee honesty within the participants. Mixing, however, contains some basic restrictions. Advanced attackers can use timing correlation (when money gets deposited and picked out of mixers), amount fingerprinting (different amounts of transaction) and repeated measurement as the basis of their probabilistic deanonymization of a transaction. The money might be stolen away or the transaction mappings could be stolen in case the mixers concocted are malicious, or the mixers themselves are spoiled. Scrutiny by the regulators restricts the use of mixing--in certain jurisdictions, it would be considered an offense to operate the mixing services, and users might be subjected to greater scrutiny of exchanges.</w:t>
+        <w:t>Analysis: Privacy against non castral observers The right mixing with sufficient numbers and time delays provides adequate privacy. [21] analyzed the incentives-compatible mixing protocols that guarantee honesty within the participants. Mixing, however, contains some basic restrictions. Advanced attackers can use timing correlation (when money gets deposited and picked out of mixers), amount fingerprinting (different amounts of transaction) and repeated measurement as the basis of their probabilistic deanonymization of a transaction. The money might be stolen away or the transaction mappings could be stolen in case the mixers concocted are malicious, or the mixers themselves are spoiled. Scrutiny by the regulators restricts the use of mixing--in certain jurisdictions, it would be considered an offense to operate the mixing services, and users might be subjected to greater scrutiny of exchanges.</w:t>
       </w:r>
     </w:p>
     <w:bookmarkStart w:colFirst="0" w:colLast="0" w:name="bookmark=id.z6b2xtk8pigc" w:id="19"/>
@@ -8530,7 +8530,7 @@
         </w:rPr>
       </w:pPr>
       <w:r>
-        <w:t>Zerocash: ZKPs have a transformative capacity, which is exhibited by the Zerocash protocol by Ben-Sasson et al. [8]. Zerocash is unaware of the senders, receivers or the transaction amounts using zk-SNARKs ( Zero-Knowledge Succinct Non-Interactive Arguments of Knowledge ) but it enables networks to confirm whether or not the transactions are valid ( senders possess enough funds, amounts balance correctly, there is no double-spending). This will create Zcash cryptocurrency that offers users a choice between transparent and shielded transactions in which shielded transactions offer near unmatched privacy, even to the opponents that track all the blockchain data.</w:t>
+        <w:t>Zerocash: ZKPs have a transformative capacity, which is exhibited by the Zerocash protocol by [8]. Zerocash is unaware of the senders, receivers or the transaction amounts using zk-SNARKs ( Zero-Knowledge Succinct Non-Interactive Arguments of Knowledge ) but it enables networks to confirm whether or not the transactions are valid ( senders possess enough funds, amounts balance correctly, there is no double-spending). This will create Zcash cryptocurrency that offers users a choice between transparent and shielded transactions in which shielded transactions offer near unmatched privacy, even to the opponents that track all the blockchain data.</w:t>
       </w:r>
     </w:p>
     <w:p>
@@ -8663,7 +8663,7 @@
         </w:rPr>
       </w:pPr>
       <w:r>
-        <w:t>Applications: In addition to cryptocurrencies, ZKPs can be used to help in privacy-preserving smart contracts such as where inputs, outputs and intermediate states are hidden and yet, it is possible to verify that the smart contract was executed correctly. ZKPs can facilitate regulatory adherence to financial regulations in which depository institutions can prove that they are holding reserves at thresholds required without revealing actual asset ownership(as explored by Boneh et al. [18]). Identity systems can use ZKPs for selective disclosure—proving age without revealing birthdates, proving credentials without revealing identities.</w:t>
+        <w:t>Applications: In addition to cryptocurrencies, ZKPs can be used to help in privacy-preserving smart contracts such as where inputs, outputs and intermediate states are hidden and yet, it is possible to verify that the smart contract was executed correctly. ZKPs can facilitate regulatory adherence to financial regulations in which depository institutions can prove that they are holding reserves at thresholds required without revealing actual asset ownership(as explored by [18]). Identity systems can use ZKPs for selective disclosure—proving age without revealing birthdates, proving credentials without revealing identities.</w:t>
       </w:r>
     </w:p>
     <w:bookmarkStart w:colFirst="0" w:colLast="0" w:name="bookmark=id.q4agwwtlrsha" w:id="20"/>
@@ -8911,7 +8911,7 @@
         </w:rPr>
       </w:pPr>
       <w:r>
-        <w:t>Most real-world systems keep sensitive data (off-chain) in the form of private database or distributed file systems but store cryptographic hash (on-chain). This sustains the integrity checking using blockchain but actual data remains hidden. Healthcare applications normally adopt this pattern in order to meet privacy regulation goals by taking advantage of audit capabilities presented by blockchain (Conti et al. [16]). Advantages are privacy, performance and utilization of existing infrastructure. Disagreements such as off-chain availability dependencies and split architecture are limitations.</w:t>
+        <w:t>Most real-world systems keep sensitive data (off-chain) in the form of private database or distributed file systems but store cryptographic hash (on-chain). This sustains the integrity checking using blockchain but actual data remains hidden. Healthcare applications normally adopt this pattern in order to meet privacy regulation goals by taking advantage of audit capabilities presented by blockchain ([16]). Advantages are privacy, performance and utilization of existing infrastructure. Disagreements such as off-chain availability dependencies and split architecture are limitations.</w:t>
       </w:r>
     </w:p>
     <w:bookmarkStart w:colFirst="0" w:colLast="0" w:name="bookmark=id.h608e0yw1pjo" w:id="22"/>
@@ -9205,7 +9205,7 @@
         </w:rPr>
       </w:pPr>
       <w:r>
-        <w:t>Privacy Challenges: Public visibility introduces significant privacy concerns, as all transaction data is permanently recorded and accessible to anyone. Users are identified by cryptographic addresses rather than real names; however, transaction graph analysis can reveal behavioral patterns and potentially link these addresses to real-world identities, as shown by Meiklejohn et al. [7]. To mitigate these risks, privacy must be achieved through additional mechanisms such as mixing services or zero-knowledge proofs, which increase system complexity and operational costs.</w:t>
+        <w:t>Privacy Challenges: Public visibility introduces significant privacy concerns, as all transaction data is permanently recorded and accessible to anyone. Users are identified by cryptographic addresses rather than real names; however, transaction graph analysis can reveal behavioral patterns and potentially link these addresses to real-world identities, as shown by [7]. To mitigate these risks, privacy must be achieved through additional mechanisms such as mixing services or zero-knowledge proofs, which increase system complexity and operational costs.</w:t>
       </w:r>
     </w:p>
     <w:p>
@@ -9242,7 +9242,7 @@
         </w:rPr>
       </w:pPr>
       <w:r>
-        <w:t>Performance Limitations: The process of reaching an agreement between thousands of mistrusted participants puts a constraint on throughput. Bitcoin can manage about 7 transactions per second; Ethereum (before sharding) is able to manage approximately 15-30 TPS. Such rates are much less as compared to conventional payment networks (Visa handles thousands of TPS) or databases. Rouhani and Deters [17] compared the performance of Ethereum transactions processing and found that there are bottlenecks in validation, access to state, and the coordination of consensus.</w:t>
+        <w:t>Performance Limitations: The process of reaching an agreement between thousands of mistrusted participants puts a constraint on throughput. Bitcoin can manage about 7 transactions per second; Ethereum (before sharding) is able to manage approximately 15-30 TPS. Such rates are much less as compared to conventional payment networks (Visa handles thousands of TPS) or databases. [17] compared the performance of Ethereum transactions processing and found that there are bottlenecks in validation, access to state, and the coordination of consensus.</w:t>
       </w:r>
     </w:p>
     <w:p>
@@ -9422,7 +9422,7 @@
         </w:rPr>
       </w:pPr>
       <w:r>
-        <w:t>Characteristics: Permissioned blockchains have the access restriction to identified, approved entities. The various organizations administer consortium blockchains; the individual blockchains are run by single organizations. These are Hyperledger Fabric (Androulaki et al. [5]) and R3 Corda. Hashemi et al. [15] compared several of the permissioned systems to be used in the enterprise.</w:t>
+        <w:t>Characteristics: Permissioned blockchains have the access restriction to identified, approved entities. The various organizations administer consortium blockchains; the individual blockchains are run by single organizations. These are Hyperledger Fabric ([5]) and R3 Corda. [15] compared several of the permissioned systems to be used in the enterprise.</w:t>
       </w:r>
     </w:p>
     <w:p>
@@ -11404,7 +11404,7 @@
         </w:rPr>
       </w:pPr>
       <w:r>
-        <w:t>Financial: AML/KYC is ineffective in permissionless systems (Victor and Andelfinger [23] made a lot of progress on detection) but much easier in permissioned systems.</w:t>
+        <w:t>Financial: AML/KYC is ineffective in permissionless systems ([23] made a lot of progress on detection) but much easier in permissioned systems.</w:t>
       </w:r>
     </w:p>
     <w:p>
@@ -11529,7 +11529,7 @@
         </w:rPr>
       </w:pPr>
       <w:r>
-        <w:t>Healthcare: There is a strong tendency to employ strict access control, audit log, and encryption to HIPAA compliance (Conti et al. [16])</w:t>
+        <w:t>Healthcare: There is a strong tendency to employ strict access control, audit log, and encryption to HIPAA compliance ([16])</w:t>
       </w:r>
     </w:p>
     <w:p>
@@ -13119,7 +13119,7 @@
         </w:rPr>
       </w:pPr>
       <w:r>
-        <w:t>MEV and Fairness: It ensures encrypted mempools and fair ordering everywhere to distribute MEV evenly, and have application-level defenses as suggested by Daian et al. [14].</w:t>
+        <w:t>MEV and Fairness: It ensures encrypted mempools and fair ordering everywhere to distribute MEV evenly, and have application-level defenses as suggested by [14].</w:t>
       </w:r>
     </w:p>
     <w:p>

</xml_diff>

<commit_message>
Center-align images and diagrams in IEEE format
Co-authored-by: Mujeeb-U-Rehman <197483016+Mujeeb-U-Rehman@users.noreply.github.com>
</commit_message>
<xml_diff>
--- a/FULL N FINAL Review BlockChain.docx
+++ b/FULL N FINAL Review BlockChain.docx
@@ -640,7 +640,7 @@
         <w:keepNext w:val="1"/>
         <w:keepLines w:val="1"/>
         <w:spacing w:after="0" w:before="180" w:lineRule="auto"/>
-        <w:jc w:val="both"/>
+        <w:jc w:val="center"/>
         <w:rPr>
           <w:sz w:val="22"/>
           <w:szCs w:val="22"/>
@@ -714,7 +714,7 @@
         <w:keepNext w:val="1"/>
         <w:keepLines w:val="1"/>
         <w:spacing w:after="0" w:before="180" w:lineRule="auto"/>
-        <w:jc w:val="both"/>
+        <w:jc w:val="center"/>
         <w:rPr>
           <w:sz w:val="22"/>
           <w:szCs w:val="22"/>
@@ -1085,7 +1085,7 @@
         <w:shd w:fill="auto" w:val="clear"/>
         <w:spacing w:after="0" w:before="180" w:line="240" w:lineRule="auto"/>
         <w:ind w:left="0" w:right="0" w:firstLine="0"/>
-        <w:jc w:val="left"/>
+        <w:jc w:val="center"/>
         <w:rPr>
           <w:i w:val="1"/>
           <w:iCs w:val="1"/>
@@ -2422,6 +2422,7 @@
       <w:pPr>
         <w:spacing w:after="0" w:before="240" w:lineRule="auto"/>
         <w:ind w:firstLine="720"/>
+        <w:jc w:val="center"/>
         <w:rPr>
           <w:sz w:val="18"/>
           <w:szCs w:val="18"/>
@@ -2672,7 +2673,7 @@
         <w:shd w:fill="auto" w:val="clear"/>
         <w:spacing w:after="0" w:before="180" w:line="240" w:lineRule="auto"/>
         <w:ind w:left="0" w:right="0" w:firstLine="0"/>
-        <w:jc w:val="left"/>
+        <w:jc w:val="center"/>
         <w:rPr>
           <w:sz w:val="22"/>
           <w:szCs w:val="22"/>
@@ -3354,7 +3355,7 @@
         <w:shd w:fill="auto" w:val="clear"/>
         <w:spacing w:after="0" w:before="180" w:line="240" w:lineRule="auto"/>
         <w:ind w:left="0" w:right="0" w:firstLine="0"/>
-        <w:jc w:val="left"/>
+        <w:jc w:val="center"/>
         <w:rPr>
           <w:sz w:val="22"/>
           <w:szCs w:val="22"/>
@@ -3978,7 +3979,7 @@
         <w:shd w:fill="auto" w:val="clear"/>
         <w:spacing w:after="0" w:before="180" w:line="240" w:lineRule="auto"/>
         <w:ind w:left="0" w:right="0" w:firstLine="0"/>
-        <w:jc w:val="left"/>
+        <w:jc w:val="center"/>
         <w:rPr>
           <w:sz w:val="22"/>
           <w:szCs w:val="22"/>
@@ -4750,7 +4751,7 @@
     <w:p>
       <w:pPr>
         <w:spacing w:after="0" w:before="180" w:lineRule="auto"/>
-        <w:jc w:val="both"/>
+        <w:jc w:val="center"/>
         <w:rPr>
           <w:sz w:val="22"/>
           <w:szCs w:val="22"/>
@@ -6725,7 +6726,7 @@
         <w:shd w:fill="auto" w:val="clear"/>
         <w:spacing w:after="0" w:before="180" w:line="240" w:lineRule="auto"/>
         <w:ind w:left="0" w:right="0" w:firstLine="0"/>
-        <w:jc w:val="both"/>
+        <w:jc w:val="center"/>
         <w:rPr>
           <w:sz w:val="22"/>
           <w:szCs w:val="22"/>
@@ -7361,7 +7362,7 @@
         <w:shd w:fill="auto" w:val="clear"/>
         <w:spacing w:after="0" w:before="180" w:line="240" w:lineRule="auto"/>
         <w:ind w:left="0" w:right="0" w:firstLine="0"/>
-        <w:jc w:val="left"/>
+        <w:jc w:val="center"/>
         <w:rPr>
           <w:sz w:val="22"/>
           <w:szCs w:val="22"/>
@@ -7962,7 +7963,7 @@
         <w:shd w:fill="auto" w:val="clear"/>
         <w:spacing w:after="0" w:before="180" w:line="240" w:lineRule="auto"/>
         <w:ind w:left="0" w:right="0" w:firstLine="0"/>
-        <w:jc w:val="left"/>
+        <w:jc w:val="center"/>
         <w:rPr>
           <w:sz w:val="22"/>
           <w:szCs w:val="22"/>
@@ -8818,7 +8819,7 @@
         <w:shd w:fill="auto" w:val="clear"/>
         <w:spacing w:after="0" w:before="180" w:line="240" w:lineRule="auto"/>
         <w:ind w:left="0" w:right="0" w:firstLine="0"/>
-        <w:jc w:val="left"/>
+        <w:jc w:val="center"/>
         <w:rPr>
           <w:sz w:val="22"/>
           <w:szCs w:val="22"/>
@@ -9721,7 +9722,7 @@
         <w:shd w:fill="auto" w:val="clear"/>
         <w:spacing w:after="0" w:before="180" w:line="240" w:lineRule="auto"/>
         <w:ind w:left="0" w:right="0" w:firstLine="0"/>
-        <w:jc w:val="left"/>
+        <w:jc w:val="center"/>
         <w:rPr>
           <w:sz w:val="22"/>
           <w:szCs w:val="22"/>
@@ -9858,7 +9859,7 @@
         <w:shd w:fill="auto" w:val="clear"/>
         <w:spacing w:after="0" w:before="180" w:line="240" w:lineRule="auto"/>
         <w:ind w:left="0" w:right="0" w:firstLine="0"/>
-        <w:jc w:val="both"/>
+        <w:jc w:val="center"/>
         <w:rPr>
           <w:rFonts w:ascii="Times New Roman" w:cs="Times New Roman" w:eastAsia="Times New Roman" w:hAnsi="Times New Roman"/>
           <w:b w:val="0"/>
@@ -10386,7 +10387,7 @@
         <w:shd w:fill="auto" w:val="clear"/>
         <w:spacing w:after="0" w:before="180" w:line="240" w:lineRule="auto"/>
         <w:ind w:left="0" w:right="0" w:firstLine="0"/>
-        <w:jc w:val="both"/>
+        <w:jc w:val="center"/>
         <w:rPr>
           <w:rFonts w:ascii="Times New Roman" w:cs="Times New Roman" w:eastAsia="Times New Roman" w:hAnsi="Times New Roman"/>
           <w:b w:val="0"/>
@@ -10513,7 +10514,7 @@
         <w:shd w:fill="auto" w:val="clear"/>
         <w:spacing w:after="0" w:before="180" w:line="240" w:lineRule="auto"/>
         <w:ind w:left="0" w:right="0" w:firstLine="0"/>
-        <w:jc w:val="left"/>
+        <w:jc w:val="center"/>
         <w:rPr>
           <w:sz w:val="22"/>
           <w:szCs w:val="22"/>
@@ -11120,7 +11121,7 @@
         <w:shd w:fill="auto" w:val="clear"/>
         <w:spacing w:after="0" w:before="180" w:line="240" w:lineRule="auto"/>
         <w:ind w:left="0" w:right="0" w:firstLine="0"/>
-        <w:jc w:val="left"/>
+        <w:jc w:val="center"/>
         <w:rPr>
           <w:sz w:val="22"/>
           <w:szCs w:val="22"/>
@@ -12120,7 +12121,7 @@
         <w:shd w:fill="auto" w:val="clear"/>
         <w:spacing w:after="0" w:before="180" w:line="240" w:lineRule="auto"/>
         <w:ind w:left="0" w:right="0" w:firstLine="0"/>
-        <w:jc w:val="both"/>
+        <w:jc w:val="center"/>
         <w:rPr>
           <w:i w:val="0"/>
           <w:iCs w:val="0"/>

</xml_diff>